<commit_message>
Patch template_cekdinamis.docx: hapus baris kosong di loop CPMK => Sub-CPMK
Loop {#sub_cpmk} di tabel CPMK => Sub-CPMK punya pola sama seperti bug
cplList/cpmk sebelumnya: tag penutup {/sub_cpmk} ditaruh di paragraf
terpisah dari paragraf isi (Sub-CPMK{subId} : {deskripsi}), jadi tiap
entri kena 1 baris kosong ekstra. Tag penutup digabung ke paragraf isi,
paragraf kosongnya dihapus.

2 loop {#sub_cpmk} lain di template ini (tabel Korelasi CP-Asesmen dan
tabel rencana mingguan) sudah dicek tidak kena masalah yang sama --
tag penutupnya sudah nempel di paragraf yang sama dari awal.

Diverifikasi: render RPS 66 sebelum/sesudah (7 paragraf berkurang, sesuai
jumlah baris sub-CPMK di RPS itu), download nyata lewat server.
</commit_message>
<xml_diff>
--- a/src/templates/template_cekdinamis.docx
+++ b/src/templates/template_cekdinamis.docx
@@ -1154,17 +1154,9 @@
                 <w:sz w:val="22"/>
                 <w:szCs w:val="32"/>
               </w:rPr>
-              <w:t>rps[</w:t>
+              <w:t>rps[]}{.}</w:t>
             </w:r>
             <w:proofErr w:type="gramEnd"/>
-            <w:r>
-              <w:rPr>
-                <w:color w:val="000000" w:themeColor="text1"/>
-                <w:sz w:val="22"/>
-                <w:szCs w:val="32"/>
-              </w:rPr>
-              <w:t>]}{.}</w:t>
-            </w:r>
           </w:p>
           <w:p>
             <w:pPr>
@@ -1559,16 +1551,7 @@
                 <w:szCs w:val="22"/>
                 <w:lang w:eastAsia="id-ID"/>
               </w:rPr>
-              <w:t>{description}</w:t>
-            </w:r>
-            <w:r>
-              <w:rPr>
-                <w:rFonts w:ascii="Calibri" w:hAnsi="Calibri"/>
-                <w:sz w:val="22"/>
-                <w:szCs w:val="22"/>
-                <w:lang w:eastAsia="id-ID"/>
-              </w:rPr>
-              <w:t>{/</w:t>
+              <w:t>{description}{/</w:t>
             </w:r>
             <w:proofErr w:type="spellStart"/>
             <w:r>
@@ -1791,7 +1774,7 @@
                 <w:szCs w:val="22"/>
                 <w:lang w:eastAsia="id-ID"/>
               </w:rPr>
-              <w:t xml:space="preserve"> {id</w:t>
+              <w:t>{id</w:t>
             </w:r>
             <w:proofErr w:type="gramStart"/>
             <w:r>
@@ -1831,16 +1814,7 @@
                 <w:szCs w:val="22"/>
                 <w:lang w:eastAsia="id-ID"/>
               </w:rPr>
-              <w:t xml:space="preserve">} </w:t>
-            </w:r>
-            <w:r>
-              <w:rPr>
-                <w:rFonts w:ascii="Calibri" w:hAnsi="Calibri"/>
-                <w:sz w:val="22"/>
-                <w:szCs w:val="22"/>
-                <w:lang w:eastAsia="id-ID"/>
-              </w:rPr>
-              <w:t>{/</w:t>
+              <w:t>} {/</w:t>
             </w:r>
             <w:proofErr w:type="spellStart"/>
             <w:r>
@@ -2143,16 +2117,6 @@
               </w:rPr>
               <w:t>}</w:t>
             </w:r>
-          </w:p>
-          <w:p>
-            <w:pPr>
-              <w:rPr>
-                <w:rFonts w:ascii="Calibri" w:hAnsi="Calibri"/>
-                <w:sz w:val="22"/>
-                <w:szCs w:val="22"/>
-                <w:lang w:val="id-ID" w:eastAsia="id-ID"/>
-              </w:rPr>
-            </w:pPr>
             <w:r>
               <w:rPr>
                 <w:rFonts w:ascii="Calibri" w:hAnsi="Calibri"/>
@@ -3111,17 +3075,7 @@
                       <w:szCs w:val="22"/>
                       <w:lang w:eastAsia="id-ID"/>
                     </w:rPr>
-                    <w:t>sub</w:t>
-                  </w:r>
-                  <w:r>
-                    <w:rPr>
-                      <w:rFonts w:ascii="Calibri" w:hAnsi="Calibri"/>
-                      <w:sz w:val="22"/>
-                      <w:szCs w:val="22"/>
-                      <w:lang w:eastAsia="id-ID"/>
-                    </w:rPr>
-                    <w:lastRenderedPageBreak/>
-                    <w:t>Id</w:t>
+                    <w:t>subId</w:t>
                   </w:r>
                   <w:proofErr w:type="spellEnd"/>
                   <w:r>
@@ -3157,7 +3111,6 @@
                       <w:szCs w:val="22"/>
                       <w:lang w:eastAsia="id-ID"/>
                     </w:rPr>
-                    <w:lastRenderedPageBreak/>
                     <w:t>{bentuk_pembelajaran}</w:t>
                   </w:r>
                 </w:p>

</xml_diff>

<commit_message>
Revert: kembalikan font/ukuran template_cekdinamis.docx ke semula
User minta font/ukuran dikembalikan ke sebelum patch commit 114ecbb.
Perbaikan lain (baris kosong CPL/CPMK/Sub-CPMK, dash Pengembang RPS,
kolom SUMATIF dinamis, merge FORMATIF) tetap dipertahankan -- cuma
perubahan font/ukuran yang dibatalkan.
</commit_message>
<xml_diff>
--- a/src/templates/template_cekdinamis.docx
+++ b/src/templates/template_cekdinamis.docx
@@ -51,7 +51,7 @@
             <w:pPr>
               <w:jc w:val="center"/>
               <w:rPr>
-                <w:rFonts w:ascii="Times New Roman" w:hAnsi="Times New Roman"/>
+                <w:rFonts w:ascii="Calibri" w:hAnsi="Calibri"/>
                 <w:b/>
                 <w:sz w:val="32"/>
                 <w:szCs w:val="32"/>
@@ -115,32 +115,32 @@
             <w:pPr>
               <w:jc w:val="center"/>
               <w:rPr>
-                <w:rFonts w:ascii="Calibri" w:hAnsi="Calibri"/>
+                <w:rFonts w:ascii="Cambria" w:hAnsi="Cambria"/>
                 <w:b/>
                 <w:bCs/>
-                <w:sz w:val="28"/>
-                <w:szCs w:val="28"/>
+                <w:sz w:val="32"/>
+                <w:szCs w:val="32"/>
                 <w:lang w:val="es-ES"/>
               </w:rPr>
             </w:pPr>
             <w:r>
               <w:rPr>
-                <w:rFonts w:ascii="Calibri" w:hAnsi="Calibri"/>
+                <w:rFonts w:ascii="Cambria" w:hAnsi="Cambria"/>
                 <w:b/>
                 <w:bCs/>
-                <w:sz w:val="28"/>
-                <w:szCs w:val="28"/>
+                <w:sz w:val="32"/>
+                <w:szCs w:val="32"/>
                 <w:lang w:val="es-ES"/>
               </w:rPr>
               <w:t xml:space="preserve"> </w:t>
             </w:r>
             <w:r>
               <w:rPr>
-                <w:rFonts w:ascii="Calibri" w:hAnsi="Calibri"/>
+                <w:rFonts w:ascii="Cambria" w:hAnsi="Cambria"/>
                 <w:b/>
                 <w:bCs/>
-                <w:sz w:val="28"/>
-                <w:szCs w:val="28"/>
+                <w:sz w:val="32"/>
+                <w:szCs w:val="32"/>
               </w:rPr>
               <w:t>POLITEKNIK NEGERI UJUNG PANDANG</w:t>
             </w:r>
@@ -149,21 +149,21 @@
             <w:pPr>
               <w:jc w:val="center"/>
               <w:rPr>
-                <w:rFonts w:ascii="Calibri" w:hAnsi="Calibri"/>
+                <w:rFonts w:ascii="Cambria" w:hAnsi="Cambria"/>
                 <w:b/>
                 <w:bCs/>
-                <w:sz w:val="28"/>
-                <w:szCs w:val="28"/>
+                <w:sz w:val="32"/>
+                <w:szCs w:val="32"/>
                 <w:lang w:val="es-ES"/>
               </w:rPr>
             </w:pPr>
             <w:r>
               <w:rPr>
-                <w:rFonts w:ascii="Calibri" w:hAnsi="Calibri"/>
+                <w:rFonts w:ascii="Cambria" w:hAnsi="Cambria"/>
                 <w:b/>
                 <w:bCs/>
-                <w:sz w:val="28"/>
-                <w:szCs w:val="28"/>
+                <w:sz w:val="32"/>
+                <w:szCs w:val="32"/>
               </w:rPr>
               <w:t>TEKNIK INFORMATIKA DAN KOMPUTER</w:t>
             </w:r>
@@ -172,7 +172,7 @@
             <w:pPr>
               <w:jc w:val="center"/>
               <w:rPr>
-                <w:rFonts w:ascii="Calibri" w:hAnsi="Calibri"/>
+                <w:rFonts w:ascii="Cambria" w:hAnsi="Cambria"/>
                 <w:b/>
                 <w:sz w:val="28"/>
                 <w:szCs w:val="28"/>
@@ -181,11 +181,11 @@
             </w:pPr>
             <w:r>
               <w:rPr>
-                <w:rFonts w:ascii="Calibri" w:hAnsi="Calibri"/>
+                <w:rFonts w:ascii="Cambria" w:hAnsi="Cambria"/>
                 <w:b/>
                 <w:bCs/>
-                <w:sz w:val="28"/>
-                <w:szCs w:val="28"/>
+                <w:sz w:val="32"/>
+                <w:szCs w:val="32"/>
               </w:rPr>
               <w:t>TEKNIK KOMPUTER DAN JARINGAN</w:t>
             </w:r>
@@ -207,10 +207,10 @@
             <w:pPr>
               <w:jc w:val="center"/>
               <w:rPr>
-                <w:rFonts w:ascii="Calibri" w:hAnsi="Calibri"/>
-                <w:b/>
-                <w:sz w:val="28"/>
-                <w:szCs w:val="28"/>
+                <w:rFonts w:ascii="Cambria" w:hAnsi="Cambria"/>
+                <w:b/>
+                <w:sz w:val="24"/>
+                <w:szCs w:val="24"/>
                 <w:lang w:val="es-ES"/>
               </w:rPr>
             </w:pPr>
@@ -219,46 +219,46 @@
             <w:pPr>
               <w:jc w:val="center"/>
               <w:rPr>
-                <w:rFonts w:ascii="Calibri" w:hAnsi="Calibri"/>
-                <w:b/>
-                <w:sz w:val="28"/>
-                <w:szCs w:val="28"/>
+                <w:rFonts w:ascii="Cambria" w:hAnsi="Cambria"/>
+                <w:b/>
+                <w:sz w:val="24"/>
+                <w:szCs w:val="24"/>
               </w:rPr>
             </w:pPr>
             <w:r>
               <w:rPr>
-                <w:rFonts w:ascii="Calibri" w:hAnsi="Calibri"/>
-                <w:b/>
-                <w:sz w:val="28"/>
-                <w:szCs w:val="28"/>
+                <w:rFonts w:ascii="Cambria" w:hAnsi="Cambria"/>
+                <w:b/>
+                <w:sz w:val="24"/>
+                <w:szCs w:val="24"/>
               </w:rPr>
               <w:t xml:space="preserve">Kode </w:t>
             </w:r>
             <w:proofErr w:type="spellStart"/>
             <w:r>
               <w:rPr>
-                <w:rFonts w:ascii="Calibri" w:hAnsi="Calibri"/>
-                <w:b/>
-                <w:sz w:val="28"/>
-                <w:szCs w:val="28"/>
+                <w:rFonts w:ascii="Cambria" w:hAnsi="Cambria"/>
+                <w:b/>
+                <w:sz w:val="24"/>
+                <w:szCs w:val="24"/>
               </w:rPr>
               <w:t>Dok</w:t>
             </w:r>
             <w:r>
               <w:rPr>
-                <w:rFonts w:ascii="Calibri" w:hAnsi="Calibri"/>
-                <w:b/>
-                <w:sz w:val="28"/>
-                <w:szCs w:val="28"/>
+                <w:rFonts w:ascii="Cambria" w:hAnsi="Cambria"/>
+                <w:b/>
+                <w:sz w:val="24"/>
+                <w:szCs w:val="24"/>
               </w:rPr>
               <w:t>u</w:t>
             </w:r>
             <w:r>
               <w:rPr>
-                <w:rFonts w:ascii="Calibri" w:hAnsi="Calibri"/>
-                <w:b/>
-                <w:sz w:val="28"/>
-                <w:szCs w:val="28"/>
+                <w:rFonts w:ascii="Cambria" w:hAnsi="Cambria"/>
+                <w:b/>
+                <w:sz w:val="24"/>
+                <w:szCs w:val="24"/>
               </w:rPr>
               <w:t>men</w:t>
             </w:r>
@@ -283,7 +283,7 @@
             <w:pPr>
               <w:jc w:val="center"/>
               <w:rPr>
-                <w:rFonts w:ascii="Calibri" w:hAnsi="Calibri"/>
+                <w:rFonts w:ascii="Cambria" w:hAnsi="Cambria"/>
                 <w:b/>
                 <w:sz w:val="28"/>
                 <w:szCs w:val="28"/>
@@ -292,7 +292,7 @@
             </w:pPr>
             <w:r>
               <w:rPr>
-                <w:rFonts w:ascii="Calibri" w:hAnsi="Calibri"/>
+                <w:rFonts w:ascii="Cambria" w:hAnsi="Cambria"/>
                 <w:b/>
                 <w:sz w:val="28"/>
                 <w:szCs w:val="28"/>
@@ -318,28 +318,28 @@
           <w:p>
             <w:pPr>
               <w:rPr>
-                <w:rFonts w:ascii="Times New Roman" w:hAnsi="Times New Roman"/>
-                <w:b/>
-                <w:sz w:val="24"/>
-                <w:szCs w:val="24"/>
+                <w:rFonts w:ascii="Calibri" w:hAnsi="Calibri"/>
+                <w:b/>
+                <w:sz w:val="22"/>
+                <w:szCs w:val="22"/>
               </w:rPr>
             </w:pPr>
             <w:r>
               <w:rPr>
-                <w:rFonts w:ascii="Times New Roman" w:hAnsi="Times New Roman"/>
-                <w:b/>
-                <w:sz w:val="24"/>
-                <w:szCs w:val="24"/>
+                <w:rFonts w:ascii="Calibri" w:hAnsi="Calibri"/>
+                <w:b/>
+                <w:sz w:val="22"/>
+                <w:szCs w:val="22"/>
                 <w:lang w:val="id-ID"/>
               </w:rPr>
               <w:t>MATA KULIAH</w:t>
             </w:r>
             <w:r>
               <w:rPr>
-                <w:rFonts w:ascii="Times New Roman" w:hAnsi="Times New Roman"/>
-                <w:b/>
-                <w:sz w:val="24"/>
-                <w:szCs w:val="24"/>
+                <w:rFonts w:ascii="Calibri" w:hAnsi="Calibri"/>
+                <w:b/>
+                <w:sz w:val="22"/>
+                <w:szCs w:val="22"/>
               </w:rPr>
               <w:t xml:space="preserve"> (MK)</w:t>
             </w:r>
@@ -360,18 +360,18 @@
           <w:p>
             <w:pPr>
               <w:rPr>
-                <w:rFonts w:ascii="Times New Roman" w:hAnsi="Times New Roman"/>
-                <w:b/>
-                <w:sz w:val="24"/>
-                <w:szCs w:val="24"/>
+                <w:rFonts w:ascii="Calibri" w:hAnsi="Calibri"/>
+                <w:b/>
+                <w:sz w:val="22"/>
+                <w:szCs w:val="22"/>
               </w:rPr>
             </w:pPr>
             <w:r>
               <w:rPr>
-                <w:rFonts w:ascii="Times New Roman" w:hAnsi="Times New Roman"/>
-                <w:b/>
-                <w:sz w:val="24"/>
-                <w:szCs w:val="24"/>
+                <w:rFonts w:ascii="Calibri" w:hAnsi="Calibri"/>
+                <w:b/>
+                <w:sz w:val="22"/>
+                <w:szCs w:val="22"/>
               </w:rPr>
               <w:t>KODE</w:t>
             </w:r>
@@ -392,29 +392,29 @@
           <w:p>
             <w:pPr>
               <w:rPr>
-                <w:rFonts w:ascii="Times New Roman" w:hAnsi="Times New Roman"/>
-                <w:b/>
-                <w:sz w:val="24"/>
-                <w:szCs w:val="24"/>
+                <w:rFonts w:ascii="Calibri" w:hAnsi="Calibri"/>
+                <w:b/>
+                <w:sz w:val="22"/>
+                <w:szCs w:val="22"/>
               </w:rPr>
             </w:pPr>
             <w:proofErr w:type="spellStart"/>
             <w:r>
               <w:rPr>
-                <w:rFonts w:ascii="Times New Roman" w:hAnsi="Times New Roman"/>
-                <w:b/>
-                <w:sz w:val="24"/>
-                <w:szCs w:val="24"/>
+                <w:rFonts w:ascii="Calibri" w:hAnsi="Calibri"/>
+                <w:b/>
+                <w:sz w:val="22"/>
+                <w:szCs w:val="22"/>
               </w:rPr>
               <w:t>Rumpun</w:t>
             </w:r>
             <w:proofErr w:type="spellEnd"/>
             <w:r>
               <w:rPr>
-                <w:rFonts w:ascii="Times New Roman" w:hAnsi="Times New Roman"/>
-                <w:b/>
-                <w:sz w:val="24"/>
-                <w:szCs w:val="24"/>
+                <w:rFonts w:ascii="Calibri" w:hAnsi="Calibri"/>
+                <w:b/>
+                <w:sz w:val="22"/>
+                <w:szCs w:val="22"/>
               </w:rPr>
               <w:t xml:space="preserve"> MK</w:t>
             </w:r>
@@ -435,48 +435,48 @@
           <w:p>
             <w:pPr>
               <w:rPr>
-                <w:rFonts w:ascii="Times New Roman" w:hAnsi="Times New Roman"/>
-                <w:b/>
-                <w:sz w:val="24"/>
-                <w:szCs w:val="24"/>
+                <w:rFonts w:ascii="Calibri" w:hAnsi="Calibri"/>
+                <w:b/>
+                <w:sz w:val="22"/>
+                <w:szCs w:val="22"/>
               </w:rPr>
             </w:pPr>
             <w:r>
               <w:rPr>
-                <w:rFonts w:ascii="Times New Roman" w:hAnsi="Times New Roman"/>
-                <w:b/>
-                <w:sz w:val="24"/>
-                <w:szCs w:val="24"/>
+                <w:rFonts w:ascii="Calibri" w:hAnsi="Calibri"/>
+                <w:b/>
+                <w:sz w:val="22"/>
+                <w:szCs w:val="22"/>
                 <w:lang w:val="id-ID"/>
               </w:rPr>
               <w:t>BOBOT</w:t>
             </w:r>
             <w:r>
               <w:rPr>
-                <w:rFonts w:ascii="Times New Roman" w:hAnsi="Times New Roman"/>
-                <w:b/>
-                <w:sz w:val="24"/>
-                <w:szCs w:val="24"/>
+                <w:rFonts w:ascii="Calibri" w:hAnsi="Calibri"/>
+                <w:b/>
+                <w:sz w:val="22"/>
+                <w:szCs w:val="22"/>
               </w:rPr>
               <w:t xml:space="preserve"> (</w:t>
             </w:r>
             <w:proofErr w:type="spellStart"/>
             <w:r>
               <w:rPr>
-                <w:rFonts w:ascii="Times New Roman" w:hAnsi="Times New Roman"/>
-                <w:b/>
-                <w:sz w:val="24"/>
-                <w:szCs w:val="24"/>
+                <w:rFonts w:ascii="Calibri" w:hAnsi="Calibri"/>
+                <w:b/>
+                <w:sz w:val="22"/>
+                <w:szCs w:val="22"/>
               </w:rPr>
               <w:t>sks</w:t>
             </w:r>
             <w:proofErr w:type="spellEnd"/>
             <w:r>
               <w:rPr>
-                <w:rFonts w:ascii="Times New Roman" w:hAnsi="Times New Roman"/>
-                <w:b/>
-                <w:sz w:val="24"/>
-                <w:szCs w:val="24"/>
+                <w:rFonts w:ascii="Calibri" w:hAnsi="Calibri"/>
+                <w:b/>
+                <w:sz w:val="22"/>
+                <w:szCs w:val="22"/>
               </w:rPr>
               <w:t>)</w:t>
             </w:r>
@@ -496,19 +496,19 @@
           <w:p>
             <w:pPr>
               <w:rPr>
-                <w:rFonts w:ascii="Times New Roman" w:hAnsi="Times New Roman"/>
-                <w:b/>
-                <w:sz w:val="24"/>
-                <w:szCs w:val="24"/>
+                <w:rFonts w:ascii="Calibri" w:hAnsi="Calibri"/>
+                <w:b/>
+                <w:sz w:val="22"/>
+                <w:szCs w:val="22"/>
                 <w:lang w:val="id-ID"/>
               </w:rPr>
             </w:pPr>
             <w:r>
               <w:rPr>
-                <w:rFonts w:ascii="Times New Roman" w:hAnsi="Times New Roman"/>
-                <w:b/>
-                <w:sz w:val="24"/>
-                <w:szCs w:val="24"/>
+                <w:rFonts w:ascii="Calibri" w:hAnsi="Calibri"/>
+                <w:b/>
+                <w:sz w:val="22"/>
+                <w:szCs w:val="22"/>
                 <w:lang w:val="id-ID"/>
               </w:rPr>
               <w:t>SEMESTER</w:t>
@@ -530,38 +530,38 @@
           <w:p>
             <w:pPr>
               <w:rPr>
-                <w:rFonts w:ascii="Times New Roman" w:hAnsi="Times New Roman"/>
-                <w:b/>
-                <w:sz w:val="24"/>
-                <w:szCs w:val="24"/>
+                <w:rFonts w:ascii="Calibri" w:hAnsi="Calibri"/>
+                <w:b/>
+                <w:sz w:val="22"/>
+                <w:szCs w:val="22"/>
               </w:rPr>
             </w:pPr>
             <w:proofErr w:type="spellStart"/>
             <w:r>
               <w:rPr>
-                <w:rFonts w:ascii="Times New Roman" w:hAnsi="Times New Roman"/>
-                <w:b/>
-                <w:sz w:val="24"/>
-                <w:szCs w:val="24"/>
+                <w:rFonts w:ascii="Calibri" w:hAnsi="Calibri"/>
+                <w:b/>
+                <w:sz w:val="22"/>
+                <w:szCs w:val="22"/>
               </w:rPr>
               <w:t>Tgl</w:t>
             </w:r>
             <w:proofErr w:type="spellEnd"/>
             <w:r>
               <w:rPr>
-                <w:rFonts w:ascii="Times New Roman" w:hAnsi="Times New Roman"/>
-                <w:b/>
-                <w:sz w:val="24"/>
-                <w:szCs w:val="24"/>
+                <w:rFonts w:ascii="Calibri" w:hAnsi="Calibri"/>
+                <w:b/>
+                <w:sz w:val="22"/>
+                <w:szCs w:val="22"/>
               </w:rPr>
               <w:t xml:space="preserve"> </w:t>
             </w:r>
             <w:r>
               <w:rPr>
-                <w:rFonts w:ascii="Times New Roman" w:hAnsi="Times New Roman"/>
-                <w:b/>
-                <w:sz w:val="24"/>
-                <w:szCs w:val="24"/>
+                <w:rFonts w:ascii="Calibri" w:hAnsi="Calibri"/>
+                <w:b/>
+                <w:sz w:val="22"/>
+                <w:szCs w:val="22"/>
                 <w:lang w:val="id-ID"/>
               </w:rPr>
               <w:t>Penyusunan</w:t>
@@ -591,16 +591,16 @@
                 <w:b/>
                 <w:bCs/>
                 <w:color w:val="000000" w:themeColor="text1"/>
-                <w:sz w:val="24"/>
-                <w:szCs w:val="24"/>
+                <w:sz w:val="22"/>
+                <w:szCs w:val="22"/>
               </w:rPr>
             </w:pPr>
             <w:r>
               <w:rPr>
                 <w:b/>
                 <w:color w:val="000000" w:themeColor="text1"/>
-                <w:sz w:val="24"/>
-                <w:szCs w:val="24"/>
+                <w:sz w:val="22"/>
+                <w:szCs w:val="22"/>
               </w:rPr>
               <w:t>{</w:t>
             </w:r>
@@ -609,8 +609,8 @@
               <w:rPr>
                 <w:b/>
                 <w:color w:val="000000" w:themeColor="text1"/>
-                <w:sz w:val="24"/>
-                <w:szCs w:val="24"/>
+                <w:sz w:val="22"/>
+                <w:szCs w:val="22"/>
               </w:rPr>
               <w:t>nama_mk</w:t>
             </w:r>
@@ -619,8 +619,8 @@
               <w:rPr>
                 <w:b/>
                 <w:color w:val="000000" w:themeColor="text1"/>
-                <w:sz w:val="24"/>
-                <w:szCs w:val="24"/>
+                <w:sz w:val="22"/>
+                <w:szCs w:val="22"/>
               </w:rPr>
               <w:t>}</w:t>
             </w:r>
@@ -647,8 +647,8 @@
                 <w:b/>
                 <w:bCs/>
                 <w:color w:val="000000" w:themeColor="text1"/>
-                <w:sz w:val="24"/>
-                <w:szCs w:val="24"/>
+                <w:sz w:val="22"/>
+                <w:szCs w:val="22"/>
               </w:rPr>
             </w:pPr>
             <w:r>
@@ -656,8 +656,8 @@
                 <w:b/>
                 <w:bCs/>
                 <w:color w:val="000000" w:themeColor="text1"/>
-                <w:sz w:val="24"/>
-                <w:szCs w:val="24"/>
+                <w:sz w:val="22"/>
+                <w:szCs w:val="22"/>
               </w:rPr>
               <w:t>{</w:t>
             </w:r>
@@ -667,8 +667,8 @@
                 <w:b/>
                 <w:bCs/>
                 <w:color w:val="000000" w:themeColor="text1"/>
-                <w:sz w:val="24"/>
-                <w:szCs w:val="24"/>
+                <w:sz w:val="22"/>
+                <w:szCs w:val="22"/>
               </w:rPr>
               <w:t>kode_mk</w:t>
             </w:r>
@@ -678,8 +678,8 @@
                 <w:b/>
                 <w:bCs/>
                 <w:color w:val="000000" w:themeColor="text1"/>
-                <w:sz w:val="24"/>
-                <w:szCs w:val="24"/>
+                <w:sz w:val="22"/>
+                <w:szCs w:val="22"/>
               </w:rPr>
               <w:t>}</w:t>
             </w:r>
@@ -706,8 +706,8 @@
                 <w:b/>
                 <w:bCs/>
                 <w:color w:val="000000" w:themeColor="text1"/>
-                <w:sz w:val="24"/>
-                <w:szCs w:val="24"/>
+                <w:sz w:val="22"/>
+                <w:szCs w:val="22"/>
               </w:rPr>
             </w:pPr>
             <w:r>
@@ -715,8 +715,8 @@
                 <w:b/>
                 <w:bCs/>
                 <w:color w:val="000000" w:themeColor="text1"/>
-                <w:sz w:val="24"/>
-                <w:szCs w:val="24"/>
+                <w:sz w:val="22"/>
+                <w:szCs w:val="22"/>
               </w:rPr>
               <w:t>{</w:t>
             </w:r>
@@ -726,8 +726,8 @@
                 <w:b/>
                 <w:bCs/>
                 <w:color w:val="000000" w:themeColor="text1"/>
-                <w:sz w:val="24"/>
-                <w:szCs w:val="24"/>
+                <w:sz w:val="22"/>
+                <w:szCs w:val="22"/>
               </w:rPr>
               <w:t>rumpun_mk</w:t>
             </w:r>
@@ -737,8 +737,8 @@
                 <w:b/>
                 <w:bCs/>
                 <w:color w:val="000000" w:themeColor="text1"/>
-                <w:sz w:val="24"/>
-                <w:szCs w:val="24"/>
+                <w:sz w:val="22"/>
+                <w:szCs w:val="22"/>
               </w:rPr>
               <w:t>}</w:t>
             </w:r>
@@ -759,28 +759,28 @@
             <w:pPr>
               <w:jc w:val="center"/>
               <w:rPr>
-                <w:rFonts w:ascii="Times New Roman" w:hAnsi="Times New Roman"/>
-                <w:b/>
-                <w:sz w:val="24"/>
-                <w:szCs w:val="24"/>
+                <w:rFonts w:ascii="Calibri" w:hAnsi="Calibri"/>
+                <w:b/>
+                <w:sz w:val="22"/>
+                <w:szCs w:val="22"/>
               </w:rPr>
             </w:pPr>
             <w:r>
               <w:rPr>
-                <w:rFonts w:ascii="Times New Roman" w:hAnsi="Times New Roman"/>
-                <w:b/>
-                <w:sz w:val="24"/>
-                <w:szCs w:val="24"/>
+                <w:rFonts w:ascii="Calibri" w:hAnsi="Calibri"/>
+                <w:b/>
+                <w:sz w:val="22"/>
+                <w:szCs w:val="22"/>
               </w:rPr>
               <w:t xml:space="preserve">T </w:t>
             </w:r>
             <w:proofErr w:type="gramStart"/>
             <w:r>
               <w:rPr>
-                <w:rFonts w:ascii="Times New Roman" w:hAnsi="Times New Roman"/>
-                <w:b/>
-                <w:sz w:val="24"/>
-                <w:szCs w:val="24"/>
+                <w:rFonts w:ascii="Calibri" w:hAnsi="Calibri"/>
+                <w:b/>
+                <w:sz w:val="22"/>
+                <w:szCs w:val="22"/>
               </w:rPr>
               <w:t>=  {</w:t>
             </w:r>
@@ -788,20 +788,20 @@
             <w:proofErr w:type="gramEnd"/>
             <w:r>
               <w:rPr>
-                <w:rFonts w:ascii="Times New Roman" w:hAnsi="Times New Roman"/>
-                <w:b/>
-                <w:sz w:val="24"/>
-                <w:szCs w:val="24"/>
+                <w:rFonts w:ascii="Calibri" w:hAnsi="Calibri"/>
+                <w:b/>
+                <w:sz w:val="22"/>
+                <w:szCs w:val="22"/>
               </w:rPr>
               <w:t>sks_teori</w:t>
             </w:r>
             <w:proofErr w:type="spellEnd"/>
             <w:r>
               <w:rPr>
-                <w:rFonts w:ascii="Times New Roman" w:hAnsi="Times New Roman"/>
-                <w:b/>
-                <w:sz w:val="24"/>
-                <w:szCs w:val="24"/>
+                <w:rFonts w:ascii="Calibri" w:hAnsi="Calibri"/>
+                <w:b/>
+                <w:sz w:val="22"/>
+                <w:szCs w:val="22"/>
               </w:rPr>
               <w:t>}</w:t>
             </w:r>
@@ -822,38 +822,38 @@
             <w:pPr>
               <w:jc w:val="center"/>
               <w:rPr>
-                <w:rFonts w:ascii="Times New Roman" w:hAnsi="Times New Roman"/>
-                <w:b/>
-                <w:sz w:val="24"/>
-                <w:szCs w:val="24"/>
+                <w:rFonts w:ascii="Calibri" w:hAnsi="Calibri"/>
+                <w:b/>
+                <w:sz w:val="22"/>
+                <w:szCs w:val="22"/>
               </w:rPr>
             </w:pPr>
             <w:r>
               <w:rPr>
-                <w:rFonts w:ascii="Times New Roman" w:hAnsi="Times New Roman"/>
-                <w:b/>
-                <w:sz w:val="24"/>
-                <w:szCs w:val="24"/>
+                <w:rFonts w:ascii="Calibri" w:hAnsi="Calibri"/>
+                <w:b/>
+                <w:sz w:val="22"/>
+                <w:szCs w:val="22"/>
               </w:rPr>
               <w:t>P={</w:t>
             </w:r>
             <w:proofErr w:type="spellStart"/>
             <w:r>
               <w:rPr>
-                <w:rFonts w:ascii="Times New Roman" w:hAnsi="Times New Roman"/>
-                <w:b/>
-                <w:sz w:val="24"/>
-                <w:szCs w:val="24"/>
+                <w:rFonts w:ascii="Calibri" w:hAnsi="Calibri"/>
+                <w:b/>
+                <w:sz w:val="22"/>
+                <w:szCs w:val="22"/>
               </w:rPr>
               <w:t>sks_praktikum</w:t>
             </w:r>
             <w:proofErr w:type="spellEnd"/>
             <w:r>
               <w:rPr>
-                <w:rFonts w:ascii="Times New Roman" w:hAnsi="Times New Roman"/>
-                <w:b/>
-                <w:sz w:val="24"/>
-                <w:szCs w:val="24"/>
+                <w:rFonts w:ascii="Calibri" w:hAnsi="Calibri"/>
+                <w:b/>
+                <w:sz w:val="22"/>
+                <w:szCs w:val="22"/>
               </w:rPr>
               <w:t>}</w:t>
             </w:r>
@@ -874,20 +874,20 @@
             <w:pPr>
               <w:jc w:val="center"/>
               <w:rPr>
-                <w:rFonts w:ascii="Times New Roman" w:hAnsi="Times New Roman"/>
+                <w:rFonts w:ascii="Calibri" w:hAnsi="Calibri"/>
                 <w:b/>
                 <w:bCs/>
-                <w:sz w:val="24"/>
-                <w:szCs w:val="24"/>
+                <w:sz w:val="22"/>
+                <w:szCs w:val="22"/>
               </w:rPr>
             </w:pPr>
             <w:r>
               <w:rPr>
-                <w:rFonts w:ascii="Times New Roman" w:hAnsi="Times New Roman"/>
+                <w:rFonts w:ascii="Calibri" w:hAnsi="Calibri"/>
                 <w:b/>
                 <w:bCs/>
-                <w:sz w:val="24"/>
-                <w:szCs w:val="24"/>
+                <w:sz w:val="22"/>
+                <w:szCs w:val="22"/>
               </w:rPr>
               <w:t>{semester}</w:t>
             </w:r>
@@ -909,18 +909,18 @@
             <w:pPr>
               <w:jc w:val="center"/>
               <w:rPr>
-                <w:rFonts w:ascii="Times New Roman" w:hAnsi="Times New Roman"/>
+                <w:rFonts w:ascii="Calibri" w:hAnsi="Calibri"/>
                 <w:b/>
                 <w:bCs/>
-                <w:sz w:val="24"/>
-                <w:szCs w:val="24"/>
+                <w:sz w:val="22"/>
+                <w:szCs w:val="22"/>
               </w:rPr>
             </w:pPr>
             <w:r>
               <w:rPr>
-                <w:rFonts w:ascii="Times New Roman" w:hAnsi="Times New Roman"/>
-                <w:sz w:val="24"/>
-                <w:szCs w:val="24"/>
+                <w:rFonts w:ascii="Calibri" w:hAnsi="Calibri"/>
+                <w:sz w:val="22"/>
+                <w:szCs w:val="22"/>
                 <w:lang w:val="id-ID"/>
               </w:rPr>
               <w:t>{tanggal_penyusunan}</w:t>
@@ -944,18 +944,18 @@
           <w:p>
             <w:pPr>
               <w:rPr>
-                <w:rFonts w:ascii="Times New Roman" w:hAnsi="Times New Roman"/>
-                <w:b/>
-                <w:sz w:val="24"/>
-                <w:szCs w:val="24"/>
+                <w:rFonts w:ascii="Calibri" w:hAnsi="Calibri"/>
+                <w:b/>
+                <w:sz w:val="22"/>
+                <w:szCs w:val="22"/>
               </w:rPr>
             </w:pPr>
             <w:r>
               <w:rPr>
-                <w:rFonts w:ascii="Times New Roman" w:hAnsi="Times New Roman"/>
-                <w:b/>
-                <w:sz w:val="24"/>
-                <w:szCs w:val="24"/>
+                <w:rFonts w:ascii="Calibri" w:hAnsi="Calibri"/>
+                <w:b/>
+                <w:sz w:val="22"/>
+                <w:szCs w:val="22"/>
               </w:rPr>
               <w:t>OTORISASI</w:t>
             </w:r>
@@ -976,29 +976,29 @@
           <w:p>
             <w:pPr>
               <w:rPr>
-                <w:rFonts w:ascii="Times New Roman" w:hAnsi="Times New Roman"/>
-                <w:b/>
-                <w:sz w:val="24"/>
-                <w:szCs w:val="24"/>
+                <w:rFonts w:ascii="Calibri" w:hAnsi="Calibri"/>
+                <w:b/>
+                <w:sz w:val="22"/>
+                <w:szCs w:val="22"/>
               </w:rPr>
             </w:pPr>
             <w:proofErr w:type="spellStart"/>
             <w:r>
               <w:rPr>
-                <w:rFonts w:ascii="Times New Roman" w:hAnsi="Times New Roman"/>
-                <w:b/>
-                <w:sz w:val="24"/>
-                <w:szCs w:val="24"/>
+                <w:rFonts w:ascii="Calibri" w:hAnsi="Calibri"/>
+                <w:b/>
+                <w:sz w:val="22"/>
+                <w:szCs w:val="22"/>
               </w:rPr>
               <w:t>Pengembang</w:t>
             </w:r>
             <w:proofErr w:type="spellEnd"/>
             <w:r>
               <w:rPr>
-                <w:rFonts w:ascii="Times New Roman" w:hAnsi="Times New Roman"/>
-                <w:b/>
-                <w:sz w:val="24"/>
-                <w:szCs w:val="24"/>
+                <w:rFonts w:ascii="Calibri" w:hAnsi="Calibri"/>
+                <w:b/>
+                <w:sz w:val="22"/>
+                <w:szCs w:val="22"/>
               </w:rPr>
               <w:t xml:space="preserve"> RPS</w:t>
             </w:r>
@@ -1019,29 +1019,29 @@
           <w:p>
             <w:pPr>
               <w:rPr>
-                <w:rFonts w:ascii="Times New Roman" w:hAnsi="Times New Roman"/>
-                <w:b/>
-                <w:sz w:val="24"/>
-                <w:szCs w:val="24"/>
+                <w:rFonts w:ascii="Calibri" w:hAnsi="Calibri"/>
+                <w:b/>
+                <w:sz w:val="22"/>
+                <w:szCs w:val="22"/>
               </w:rPr>
             </w:pPr>
             <w:proofErr w:type="spellStart"/>
             <w:r>
               <w:rPr>
-                <w:rFonts w:ascii="Times New Roman" w:hAnsi="Times New Roman"/>
-                <w:b/>
-                <w:sz w:val="24"/>
-                <w:szCs w:val="24"/>
+                <w:rFonts w:ascii="Calibri" w:hAnsi="Calibri"/>
+                <w:b/>
+                <w:sz w:val="22"/>
+                <w:szCs w:val="22"/>
               </w:rPr>
               <w:t>Koordinator</w:t>
             </w:r>
             <w:proofErr w:type="spellEnd"/>
             <w:r>
               <w:rPr>
-                <w:rFonts w:ascii="Times New Roman" w:hAnsi="Times New Roman"/>
-                <w:b/>
-                <w:sz w:val="24"/>
-                <w:szCs w:val="24"/>
+                <w:rFonts w:ascii="Calibri" w:hAnsi="Calibri"/>
+                <w:b/>
+                <w:sz w:val="22"/>
+                <w:szCs w:val="22"/>
               </w:rPr>
               <w:t xml:space="preserve"> RMK</w:t>
             </w:r>
@@ -1062,29 +1062,29 @@
           <w:p>
             <w:pPr>
               <w:rPr>
-                <w:rFonts w:ascii="Times New Roman" w:hAnsi="Times New Roman"/>
-                <w:b/>
-                <w:sz w:val="24"/>
-                <w:szCs w:val="24"/>
+                <w:rFonts w:ascii="Calibri" w:hAnsi="Calibri"/>
+                <w:b/>
+                <w:sz w:val="22"/>
+                <w:szCs w:val="22"/>
               </w:rPr>
             </w:pPr>
             <w:proofErr w:type="spellStart"/>
             <w:r>
               <w:rPr>
-                <w:rFonts w:ascii="Times New Roman" w:hAnsi="Times New Roman"/>
-                <w:b/>
-                <w:sz w:val="24"/>
-                <w:szCs w:val="24"/>
+                <w:rFonts w:ascii="Calibri" w:hAnsi="Calibri"/>
+                <w:b/>
+                <w:sz w:val="22"/>
+                <w:szCs w:val="22"/>
               </w:rPr>
               <w:t>Ketua</w:t>
             </w:r>
             <w:proofErr w:type="spellEnd"/>
             <w:r>
               <w:rPr>
-                <w:rFonts w:ascii="Times New Roman" w:hAnsi="Times New Roman"/>
-                <w:b/>
-                <w:sz w:val="24"/>
-                <w:szCs w:val="24"/>
+                <w:rFonts w:ascii="Calibri" w:hAnsi="Calibri"/>
+                <w:b/>
+                <w:sz w:val="22"/>
+                <w:szCs w:val="22"/>
               </w:rPr>
               <w:t xml:space="preserve"> PRODI</w:t>
             </w:r>
@@ -1110,10 +1110,10 @@
           <w:p>
             <w:pPr>
               <w:rPr>
-                <w:rFonts w:ascii="Times New Roman" w:hAnsi="Times New Roman"/>
-                <w:b/>
-                <w:sz w:val="24"/>
-                <w:szCs w:val="24"/>
+                <w:rFonts w:ascii="Calibri" w:hAnsi="Calibri"/>
+                <w:b/>
+                <w:sz w:val="22"/>
+                <w:szCs w:val="22"/>
                 <w:lang w:val="id-ID"/>
               </w:rPr>
             </w:pPr>
@@ -1135,14 +1135,14 @@
             <w:pPr>
               <w:rPr>
                 <w:color w:val="000000" w:themeColor="text1"/>
-                <w:sz w:val="24"/>
+                <w:sz w:val="22"/>
                 <w:szCs w:val="32"/>
               </w:rPr>
             </w:pPr>
             <w:r>
               <w:rPr>
                 <w:color w:val="000000" w:themeColor="text1"/>
-                <w:sz w:val="24"/>
+                <w:sz w:val="22"/>
                 <w:szCs w:val="32"/>
               </w:rPr>
               <w:t>{#dosen_pengembang_</w:t>
@@ -1151,7 +1151,7 @@
             <w:r>
               <w:rPr>
                 <w:color w:val="000000" w:themeColor="text1"/>
-                <w:sz w:val="24"/>
+                <w:sz w:val="22"/>
                 <w:szCs w:val="32"/>
               </w:rPr>
               <w:t>rps[]}{.}</w:t>
@@ -1169,7 +1169,7 @@
             <w:r>
               <w:rPr>
                 <w:color w:val="000000" w:themeColor="text1"/>
-                <w:sz w:val="24"/>
+                <w:sz w:val="22"/>
                 <w:szCs w:val="32"/>
               </w:rPr>
               <w:t>{/</w:t>
@@ -1178,7 +1178,7 @@
             <w:r>
               <w:rPr>
                 <w:color w:val="000000" w:themeColor="text1"/>
-                <w:sz w:val="24"/>
+                <w:sz w:val="22"/>
                 <w:szCs w:val="32"/>
               </w:rPr>
               <w:t>dosen_pengembang_</w:t>
@@ -1187,7 +1187,7 @@
             <w:r>
               <w:rPr>
                 <w:color w:val="000000" w:themeColor="text1"/>
-                <w:sz w:val="24"/>
+                <w:sz w:val="22"/>
                 <w:szCs w:val="32"/>
               </w:rPr>
               <w:t>rps</w:t>
@@ -1196,7 +1196,7 @@
             <w:r>
               <w:rPr>
                 <w:color w:val="000000" w:themeColor="text1"/>
-                <w:sz w:val="24"/>
+                <w:sz w:val="22"/>
                 <w:szCs w:val="32"/>
               </w:rPr>
               <w:t>[</w:t>
@@ -1205,7 +1205,7 @@
             <w:r>
               <w:rPr>
                 <w:color w:val="000000" w:themeColor="text1"/>
-                <w:sz w:val="24"/>
+                <w:sz w:val="22"/>
                 <w:szCs w:val="32"/>
               </w:rPr>
               <w:t>]}</w:t>
@@ -1227,19 +1227,19 @@
           <w:p>
             <w:pPr>
               <w:rPr>
-                <w:rFonts w:ascii="Times New Roman" w:hAnsi="Times New Roman"/>
-                <w:b/>
-                <w:sz w:val="24"/>
-                <w:szCs w:val="24"/>
+                <w:rFonts w:ascii="Calibri" w:hAnsi="Calibri"/>
+                <w:b/>
+                <w:sz w:val="22"/>
+                <w:szCs w:val="22"/>
                 <w:lang w:val="id-ID"/>
               </w:rPr>
             </w:pPr>
             <w:r>
               <w:rPr>
-                <w:rFonts w:ascii="Times New Roman" w:hAnsi="Times New Roman"/>
-                <w:b/>
-                <w:sz w:val="24"/>
-                <w:szCs w:val="24"/>
+                <w:rFonts w:ascii="Calibri" w:hAnsi="Calibri"/>
+                <w:b/>
+                <w:sz w:val="22"/>
+                <w:szCs w:val="22"/>
                 <w:lang w:val="id-ID"/>
               </w:rPr>
               <w:t>{penjamin_mutu}</w:t>
@@ -1262,19 +1262,19 @@
             <w:pPr>
               <w:jc w:val="center"/>
               <w:rPr>
-                <w:rFonts w:ascii="Times New Roman" w:hAnsi="Times New Roman"/>
-                <w:b/>
-                <w:sz w:val="24"/>
-                <w:szCs w:val="24"/>
+                <w:rFonts w:ascii="Calibri" w:hAnsi="Calibri"/>
+                <w:b/>
+                <w:sz w:val="22"/>
+                <w:szCs w:val="22"/>
                 <w:lang w:val="id-ID"/>
               </w:rPr>
             </w:pPr>
             <w:r>
               <w:rPr>
-                <w:rFonts w:ascii="Times New Roman" w:hAnsi="Times New Roman"/>
-                <w:b/>
-                <w:sz w:val="24"/>
-                <w:szCs w:val="24"/>
+                <w:rFonts w:ascii="Calibri" w:hAnsi="Calibri"/>
+                <w:b/>
+                <w:sz w:val="22"/>
+                <w:szCs w:val="22"/>
                 <w:lang w:val="id-ID"/>
               </w:rPr>
               <w:t>{koordinator_program_studi}</w:t>
@@ -1299,49 +1299,49 @@
           <w:p>
             <w:pPr>
               <w:rPr>
-                <w:rFonts w:ascii="Times New Roman" w:hAnsi="Times New Roman"/>
-                <w:b/>
-                <w:sz w:val="24"/>
-                <w:szCs w:val="24"/>
+                <w:rFonts w:ascii="Calibri" w:hAnsi="Calibri"/>
+                <w:b/>
+                <w:sz w:val="22"/>
+                <w:szCs w:val="22"/>
               </w:rPr>
             </w:pPr>
             <w:proofErr w:type="spellStart"/>
             <w:r>
               <w:rPr>
-                <w:rFonts w:ascii="Times New Roman" w:hAnsi="Times New Roman"/>
-                <w:b/>
-                <w:sz w:val="24"/>
-                <w:szCs w:val="24"/>
+                <w:rFonts w:ascii="Calibri" w:hAnsi="Calibri"/>
+                <w:b/>
+                <w:sz w:val="22"/>
+                <w:szCs w:val="22"/>
               </w:rPr>
               <w:t>Capaian</w:t>
             </w:r>
             <w:proofErr w:type="spellEnd"/>
             <w:r>
               <w:rPr>
-                <w:rFonts w:ascii="Times New Roman" w:hAnsi="Times New Roman"/>
-                <w:b/>
-                <w:sz w:val="24"/>
-                <w:szCs w:val="24"/>
+                <w:rFonts w:ascii="Calibri" w:hAnsi="Calibri"/>
+                <w:b/>
+                <w:sz w:val="22"/>
+                <w:szCs w:val="22"/>
               </w:rPr>
               <w:t xml:space="preserve"> </w:t>
             </w:r>
             <w:proofErr w:type="spellStart"/>
             <w:r>
               <w:rPr>
-                <w:rFonts w:ascii="Times New Roman" w:hAnsi="Times New Roman"/>
-                <w:b/>
-                <w:sz w:val="24"/>
-                <w:szCs w:val="24"/>
+                <w:rFonts w:ascii="Calibri" w:hAnsi="Calibri"/>
+                <w:b/>
+                <w:sz w:val="22"/>
+                <w:szCs w:val="22"/>
               </w:rPr>
               <w:t>Pembelajaran</w:t>
             </w:r>
             <w:proofErr w:type="spellEnd"/>
             <w:r>
               <w:rPr>
-                <w:rFonts w:ascii="Times New Roman" w:hAnsi="Times New Roman"/>
-                <w:b/>
-                <w:sz w:val="24"/>
-                <w:szCs w:val="24"/>
+                <w:rFonts w:ascii="Calibri" w:hAnsi="Calibri"/>
+                <w:b/>
+                <w:sz w:val="22"/>
+                <w:szCs w:val="22"/>
               </w:rPr>
               <w:t xml:space="preserve"> (CP)</w:t>
             </w:r>
@@ -1365,19 +1365,19 @@
                 <w:tab w:val="left" w:pos="1806"/>
               </w:tabs>
               <w:rPr>
-                <w:rFonts w:ascii="Times New Roman" w:hAnsi="Times New Roman"/>
-                <w:b/>
-                <w:sz w:val="24"/>
-                <w:szCs w:val="24"/>
+                <w:rFonts w:ascii="Calibri" w:hAnsi="Calibri"/>
+                <w:b/>
+                <w:sz w:val="22"/>
+                <w:szCs w:val="22"/>
                 <w:lang w:val="es-ES" w:eastAsia="id-ID"/>
               </w:rPr>
             </w:pPr>
             <w:r>
               <w:rPr>
-                <w:rFonts w:ascii="Times New Roman" w:hAnsi="Times New Roman"/>
-                <w:b/>
-                <w:sz w:val="24"/>
-                <w:szCs w:val="24"/>
+                <w:rFonts w:ascii="Calibri" w:hAnsi="Calibri"/>
+                <w:b/>
+                <w:sz w:val="22"/>
+                <w:szCs w:val="22"/>
                 <w:lang w:val="es-ES" w:eastAsia="id-ID"/>
               </w:rPr>
               <w:t>CPL-</w:t>
@@ -1385,10 +1385,10 @@
             <w:proofErr w:type="gramStart"/>
             <w:r>
               <w:rPr>
-                <w:rFonts w:ascii="Times New Roman" w:hAnsi="Times New Roman"/>
-                <w:b/>
-                <w:sz w:val="24"/>
-                <w:szCs w:val="24"/>
+                <w:rFonts w:ascii="Calibri" w:hAnsi="Calibri"/>
+                <w:b/>
+                <w:sz w:val="22"/>
+                <w:szCs w:val="22"/>
                 <w:lang w:val="es-ES" w:eastAsia="id-ID"/>
               </w:rPr>
               <w:t>PRODI  yang</w:t>
@@ -1396,10 +1396,10 @@
             <w:proofErr w:type="gramEnd"/>
             <w:r>
               <w:rPr>
-                <w:rFonts w:ascii="Times New Roman" w:hAnsi="Times New Roman"/>
-                <w:b/>
-                <w:sz w:val="24"/>
-                <w:szCs w:val="24"/>
+                <w:rFonts w:ascii="Calibri" w:hAnsi="Calibri"/>
+                <w:b/>
+                <w:sz w:val="22"/>
+                <w:szCs w:val="22"/>
                 <w:lang w:val="es-ES" w:eastAsia="id-ID"/>
               </w:rPr>
               <w:t xml:space="preserve"> </w:t>
@@ -1407,10 +1407,10 @@
             <w:proofErr w:type="spellStart"/>
             <w:r>
               <w:rPr>
-                <w:rFonts w:ascii="Times New Roman" w:hAnsi="Times New Roman"/>
-                <w:b/>
-                <w:sz w:val="24"/>
-                <w:szCs w:val="24"/>
+                <w:rFonts w:ascii="Calibri" w:hAnsi="Calibri"/>
+                <w:b/>
+                <w:sz w:val="22"/>
+                <w:szCs w:val="22"/>
                 <w:lang w:val="es-ES" w:eastAsia="id-ID"/>
               </w:rPr>
               <w:t>dibebankan</w:t>
@@ -1418,10 +1418,10 @@
             <w:proofErr w:type="spellEnd"/>
             <w:r>
               <w:rPr>
-                <w:rFonts w:ascii="Times New Roman" w:hAnsi="Times New Roman"/>
-                <w:b/>
-                <w:sz w:val="24"/>
-                <w:szCs w:val="24"/>
+                <w:rFonts w:ascii="Calibri" w:hAnsi="Calibri"/>
+                <w:b/>
+                <w:sz w:val="22"/>
+                <w:szCs w:val="22"/>
                 <w:lang w:val="es-ES" w:eastAsia="id-ID"/>
               </w:rPr>
               <w:t xml:space="preserve"> pada MK       </w:t>
@@ -1445,10 +1445,10 @@
                 <w:tab w:val="left" w:pos="1806"/>
               </w:tabs>
               <w:rPr>
-                <w:rFonts w:ascii="Times New Roman" w:hAnsi="Times New Roman"/>
-                <w:b/>
-                <w:sz w:val="24"/>
-                <w:szCs w:val="24"/>
+                <w:rFonts w:ascii="Calibri" w:hAnsi="Calibri"/>
+                <w:b/>
+                <w:sz w:val="22"/>
+                <w:szCs w:val="22"/>
                 <w:lang w:val="es-ES" w:eastAsia="id-ID"/>
               </w:rPr>
             </w:pPr>
@@ -1471,10 +1471,10 @@
           <w:p>
             <w:pPr>
               <w:rPr>
-                <w:rFonts w:ascii="Times New Roman" w:hAnsi="Times New Roman"/>
-                <w:b/>
-                <w:sz w:val="24"/>
-                <w:szCs w:val="24"/>
+                <w:rFonts w:ascii="Calibri" w:hAnsi="Calibri"/>
+                <w:b/>
+                <w:sz w:val="22"/>
+                <w:szCs w:val="22"/>
                 <w:lang w:val="es-ES"/>
               </w:rPr>
             </w:pPr>
@@ -1494,9 +1494,9 @@
           <w:p>
             <w:r>
               <w:rPr>
-                <w:rFonts w:ascii="Times New Roman" w:hAnsi="Times New Roman"/>
-                <w:sz w:val="24"/>
-                <w:szCs w:val="24"/>
+                <w:rFonts w:ascii="Calibri" w:hAnsi="Calibri"/>
+                <w:sz w:val="22"/>
+                <w:szCs w:val="22"/>
                 <w:lang w:eastAsia="id-ID"/>
               </w:rPr>
               <w:t>{#</w:t>
@@ -1504,9 +1504,9 @@
             <w:proofErr w:type="gramStart"/>
             <w:r>
               <w:rPr>
-                <w:rFonts w:ascii="Times New Roman" w:hAnsi="Times New Roman"/>
-                <w:sz w:val="24"/>
-                <w:szCs w:val="24"/>
+                <w:rFonts w:ascii="Calibri" w:hAnsi="Calibri"/>
+                <w:sz w:val="22"/>
+                <w:szCs w:val="22"/>
                 <w:lang w:eastAsia="id-ID"/>
               </w:rPr>
               <w:t>cplList}{</w:t>
@@ -1514,9 +1514,9 @@
             <w:proofErr w:type="gramEnd"/>
             <w:r>
               <w:rPr>
-                <w:rFonts w:ascii="Times New Roman" w:hAnsi="Times New Roman"/>
-                <w:sz w:val="24"/>
-                <w:szCs w:val="24"/>
+                <w:rFonts w:ascii="Calibri" w:hAnsi="Calibri"/>
+                <w:sz w:val="22"/>
+                <w:szCs w:val="22"/>
                 <w:lang w:eastAsia="id-ID"/>
               </w:rPr>
               <w:t>code}</w:t>
@@ -1538,17 +1538,17 @@
           <w:p>
             <w:pPr>
               <w:rPr>
-                <w:rFonts w:ascii="Times New Roman" w:hAnsi="Times New Roman"/>
-                <w:sz w:val="24"/>
-                <w:szCs w:val="24"/>
+                <w:rFonts w:ascii="Calibri" w:hAnsi="Calibri"/>
+                <w:sz w:val="22"/>
+                <w:szCs w:val="22"/>
                 <w:lang w:eastAsia="id-ID"/>
               </w:rPr>
             </w:pPr>
             <w:r>
               <w:rPr>
-                <w:rFonts w:ascii="Times New Roman" w:hAnsi="Times New Roman"/>
-                <w:sz w:val="24"/>
-                <w:szCs w:val="24"/>
+                <w:rFonts w:ascii="Calibri" w:hAnsi="Calibri"/>
+                <w:sz w:val="22"/>
+                <w:szCs w:val="22"/>
                 <w:lang w:eastAsia="id-ID"/>
               </w:rPr>
               <w:t>{description}{/</w:t>
@@ -1556,9 +1556,9 @@
             <w:proofErr w:type="spellStart"/>
             <w:r>
               <w:rPr>
-                <w:rFonts w:ascii="Times New Roman" w:hAnsi="Times New Roman"/>
-                <w:sz w:val="24"/>
-                <w:szCs w:val="24"/>
+                <w:rFonts w:ascii="Calibri" w:hAnsi="Calibri"/>
+                <w:sz w:val="22"/>
+                <w:szCs w:val="22"/>
                 <w:lang w:eastAsia="id-ID"/>
               </w:rPr>
               <w:t>cplList</w:t>
@@ -1566,9 +1566,9 @@
             <w:proofErr w:type="spellEnd"/>
             <w:r>
               <w:rPr>
-                <w:rFonts w:ascii="Times New Roman" w:hAnsi="Times New Roman"/>
-                <w:sz w:val="24"/>
-                <w:szCs w:val="24"/>
+                <w:rFonts w:ascii="Calibri" w:hAnsi="Calibri"/>
+                <w:sz w:val="22"/>
+                <w:szCs w:val="22"/>
                 <w:lang w:eastAsia="id-ID"/>
               </w:rPr>
               <w:t>}</w:t>
@@ -1595,10 +1595,10 @@
           <w:p>
             <w:pPr>
               <w:rPr>
-                <w:rFonts w:ascii="Times New Roman" w:hAnsi="Times New Roman"/>
-                <w:b/>
-                <w:sz w:val="24"/>
-                <w:szCs w:val="24"/>
+                <w:rFonts w:ascii="Calibri" w:hAnsi="Calibri"/>
+                <w:b/>
+                <w:sz w:val="22"/>
+                <w:szCs w:val="22"/>
               </w:rPr>
             </w:pPr>
           </w:p>
@@ -1618,18 +1618,18 @@
           <w:p>
             <w:pPr>
               <w:rPr>
-                <w:rFonts w:ascii="Times New Roman" w:hAnsi="Times New Roman"/>
-                <w:sz w:val="24"/>
-                <w:szCs w:val="24"/>
+                <w:rFonts w:ascii="Calibri" w:hAnsi="Calibri"/>
+                <w:sz w:val="22"/>
+                <w:szCs w:val="22"/>
                 <w:lang w:val="fi-FI" w:eastAsia="id-ID"/>
               </w:rPr>
             </w:pPr>
             <w:r>
               <w:rPr>
-                <w:rFonts w:ascii="Times New Roman" w:hAnsi="Times New Roman"/>
-                <w:b/>
-                <w:sz w:val="24"/>
-                <w:szCs w:val="24"/>
+                <w:rFonts w:ascii="Calibri" w:hAnsi="Calibri"/>
+                <w:b/>
+                <w:sz w:val="22"/>
+                <w:szCs w:val="22"/>
                 <w:lang w:val="fi-FI" w:eastAsia="id-ID"/>
               </w:rPr>
               <w:t xml:space="preserve">CPL </w:t>
@@ -1638,18 +1638,18 @@
               <w:rPr>
                 <w:rFonts w:ascii="Symbol" w:eastAsia="Symbol" w:hAnsi="Symbol" w:cs="Symbol"/>
                 <w:b/>
-                <w:sz w:val="24"/>
-                <w:szCs w:val="24"/>
+                <w:sz w:val="22"/>
+                <w:szCs w:val="22"/>
                 <w:lang w:eastAsia="id-ID"/>
               </w:rPr>
               <w:t>Þ</w:t>
             </w:r>
             <w:r>
               <w:rPr>
-                <w:rFonts w:ascii="Times New Roman" w:hAnsi="Times New Roman"/>
-                <w:b/>
-                <w:sz w:val="24"/>
-                <w:szCs w:val="24"/>
+                <w:rFonts w:ascii="Calibri" w:hAnsi="Calibri"/>
+                <w:b/>
+                <w:sz w:val="22"/>
+                <w:szCs w:val="22"/>
                 <w:lang w:val="fi-FI" w:eastAsia="id-ID"/>
               </w:rPr>
               <w:t xml:space="preserve"> Capaian Pembelajaran Mata Kuliah (CPMK)</w:t>
@@ -1669,9 +1669,9 @@
           <w:p>
             <w:pPr>
               <w:rPr>
-                <w:rFonts w:ascii="Times New Roman" w:hAnsi="Times New Roman"/>
-                <w:sz w:val="24"/>
-                <w:szCs w:val="24"/>
+                <w:rFonts w:ascii="Calibri" w:hAnsi="Calibri"/>
+                <w:sz w:val="22"/>
+                <w:szCs w:val="22"/>
                 <w:lang w:val="fi-FI" w:eastAsia="id-ID"/>
               </w:rPr>
             </w:pPr>
@@ -1694,10 +1694,10 @@
           <w:p>
             <w:pPr>
               <w:rPr>
-                <w:rFonts w:ascii="Times New Roman" w:hAnsi="Times New Roman"/>
-                <w:b/>
-                <w:sz w:val="24"/>
-                <w:szCs w:val="24"/>
+                <w:rFonts w:ascii="Calibri" w:hAnsi="Calibri"/>
+                <w:b/>
+                <w:sz w:val="22"/>
+                <w:szCs w:val="22"/>
                 <w:lang w:val="fi-FI"/>
               </w:rPr>
             </w:pPr>
@@ -1717,9 +1717,9 @@
           <w:p>
             <w:r>
               <w:rPr>
-                <w:rFonts w:ascii="Times New Roman" w:hAnsi="Times New Roman"/>
-                <w:sz w:val="24"/>
-                <w:szCs w:val="24"/>
+                <w:rFonts w:ascii="Calibri" w:hAnsi="Calibri"/>
+                <w:sz w:val="22"/>
+                <w:szCs w:val="22"/>
                 <w:lang w:eastAsia="id-ID"/>
               </w:rPr>
               <w:t>{#cpmk} {</w:t>
@@ -1727,9 +1727,9 @@
             <w:proofErr w:type="spellStart"/>
             <w:r>
               <w:rPr>
-                <w:rFonts w:ascii="Times New Roman" w:hAnsi="Times New Roman"/>
-                <w:sz w:val="24"/>
-                <w:szCs w:val="24"/>
+                <w:rFonts w:ascii="Calibri" w:hAnsi="Calibri"/>
+                <w:sz w:val="22"/>
+                <w:szCs w:val="22"/>
                 <w:lang w:eastAsia="id-ID"/>
               </w:rPr>
               <w:t>cpl_code</w:t>
@@ -1737,9 +1737,9 @@
             <w:proofErr w:type="spellEnd"/>
             <w:r>
               <w:rPr>
-                <w:rFonts w:ascii="Times New Roman" w:hAnsi="Times New Roman"/>
-                <w:sz w:val="24"/>
-                <w:szCs w:val="24"/>
+                <w:rFonts w:ascii="Calibri" w:hAnsi="Calibri"/>
+                <w:sz w:val="22"/>
+                <w:szCs w:val="22"/>
                 <w:lang w:eastAsia="id-ID"/>
               </w:rPr>
               <w:t xml:space="preserve">} </w:t>
@@ -1761,17 +1761,17 @@
           <w:p>
             <w:pPr>
               <w:rPr>
-                <w:rFonts w:ascii="Times New Roman" w:hAnsi="Times New Roman"/>
-                <w:sz w:val="24"/>
-                <w:szCs w:val="24"/>
+                <w:rFonts w:ascii="Calibri" w:hAnsi="Calibri"/>
+                <w:sz w:val="22"/>
+                <w:szCs w:val="22"/>
                 <w:lang w:eastAsia="id-ID"/>
               </w:rPr>
             </w:pPr>
             <w:r>
               <w:rPr>
-                <w:rFonts w:ascii="Times New Roman" w:hAnsi="Times New Roman"/>
-                <w:sz w:val="24"/>
-                <w:szCs w:val="24"/>
+                <w:rFonts w:ascii="Calibri" w:hAnsi="Calibri"/>
+                <w:sz w:val="22"/>
+                <w:szCs w:val="22"/>
                 <w:lang w:eastAsia="id-ID"/>
               </w:rPr>
               <w:t>{id</w:t>
@@ -1779,9 +1779,9 @@
             <w:proofErr w:type="gramStart"/>
             <w:r>
               <w:rPr>
-                <w:rFonts w:ascii="Times New Roman" w:hAnsi="Times New Roman"/>
-                <w:sz w:val="24"/>
-                <w:szCs w:val="24"/>
+                <w:rFonts w:ascii="Calibri" w:hAnsi="Calibri"/>
+                <w:sz w:val="22"/>
+                <w:szCs w:val="22"/>
                 <w:lang w:eastAsia="id-ID"/>
               </w:rPr>
               <w:t>} :</w:t>
@@ -1789,9 +1789,9 @@
             <w:proofErr w:type="gramEnd"/>
             <w:r>
               <w:rPr>
-                <w:rFonts w:ascii="Times New Roman" w:hAnsi="Times New Roman"/>
-                <w:sz w:val="24"/>
-                <w:szCs w:val="24"/>
+                <w:rFonts w:ascii="Calibri" w:hAnsi="Calibri"/>
+                <w:sz w:val="22"/>
+                <w:szCs w:val="22"/>
                 <w:lang w:eastAsia="id-ID"/>
               </w:rPr>
               <w:t xml:space="preserve"> {</w:t>
@@ -1799,9 +1799,9 @@
             <w:proofErr w:type="spellStart"/>
             <w:r>
               <w:rPr>
-                <w:rFonts w:ascii="Times New Roman" w:hAnsi="Times New Roman"/>
-                <w:sz w:val="24"/>
-                <w:szCs w:val="24"/>
+                <w:rFonts w:ascii="Calibri" w:hAnsi="Calibri"/>
+                <w:sz w:val="22"/>
+                <w:szCs w:val="22"/>
                 <w:lang w:eastAsia="id-ID"/>
               </w:rPr>
               <w:t>deskripsi</w:t>
@@ -1809,9 +1809,9 @@
             <w:proofErr w:type="spellEnd"/>
             <w:r>
               <w:rPr>
-                <w:rFonts w:ascii="Times New Roman" w:hAnsi="Times New Roman"/>
-                <w:sz w:val="24"/>
-                <w:szCs w:val="24"/>
+                <w:rFonts w:ascii="Calibri" w:hAnsi="Calibri"/>
+                <w:sz w:val="22"/>
+                <w:szCs w:val="22"/>
                 <w:lang w:eastAsia="id-ID"/>
               </w:rPr>
               <w:t>} {/</w:t>
@@ -1819,9 +1819,9 @@
             <w:proofErr w:type="spellStart"/>
             <w:r>
               <w:rPr>
-                <w:rFonts w:ascii="Times New Roman" w:hAnsi="Times New Roman"/>
-                <w:sz w:val="24"/>
-                <w:szCs w:val="24"/>
+                <w:rFonts w:ascii="Calibri" w:hAnsi="Calibri"/>
+                <w:sz w:val="22"/>
+                <w:szCs w:val="22"/>
                 <w:lang w:eastAsia="id-ID"/>
               </w:rPr>
               <w:t>cpmk</w:t>
@@ -1829,9 +1829,9 @@
             <w:proofErr w:type="spellEnd"/>
             <w:r>
               <w:rPr>
-                <w:rFonts w:ascii="Times New Roman" w:hAnsi="Times New Roman"/>
-                <w:sz w:val="24"/>
-                <w:szCs w:val="24"/>
+                <w:rFonts w:ascii="Calibri" w:hAnsi="Calibri"/>
+                <w:sz w:val="22"/>
+                <w:szCs w:val="22"/>
                 <w:lang w:eastAsia="id-ID"/>
               </w:rPr>
               <w:t>}</w:t>
@@ -1858,10 +1858,10 @@
           <w:p>
             <w:pPr>
               <w:rPr>
-                <w:rFonts w:ascii="Times New Roman" w:hAnsi="Times New Roman"/>
-                <w:b/>
-                <w:sz w:val="24"/>
-                <w:szCs w:val="24"/>
+                <w:rFonts w:ascii="Calibri" w:hAnsi="Calibri"/>
+                <w:b/>
+                <w:sz w:val="22"/>
+                <w:szCs w:val="22"/>
               </w:rPr>
             </w:pPr>
           </w:p>
@@ -1882,19 +1882,19 @@
             <w:pPr>
               <w:jc w:val="both"/>
               <w:rPr>
-                <w:rFonts w:ascii="Times New Roman" w:hAnsi="Times New Roman"/>
-                <w:b/>
-                <w:sz w:val="24"/>
-                <w:szCs w:val="24"/>
+                <w:rFonts w:ascii="Calibri" w:hAnsi="Calibri"/>
+                <w:b/>
+                <w:sz w:val="22"/>
+                <w:szCs w:val="22"/>
                 <w:lang w:eastAsia="id-ID"/>
               </w:rPr>
             </w:pPr>
             <w:r>
               <w:rPr>
-                <w:rFonts w:ascii="Times New Roman" w:hAnsi="Times New Roman"/>
-                <w:b/>
-                <w:sz w:val="24"/>
-                <w:szCs w:val="24"/>
+                <w:rFonts w:ascii="Calibri" w:hAnsi="Calibri"/>
+                <w:b/>
+                <w:sz w:val="22"/>
+                <w:szCs w:val="22"/>
                 <w:lang w:eastAsia="id-ID"/>
               </w:rPr>
               <w:t xml:space="preserve">CPMK </w:t>
@@ -1903,18 +1903,18 @@
               <w:rPr>
                 <w:rFonts w:ascii="Symbol" w:eastAsia="Symbol" w:hAnsi="Symbol" w:cs="Symbol"/>
                 <w:b/>
-                <w:sz w:val="24"/>
-                <w:szCs w:val="24"/>
+                <w:sz w:val="22"/>
+                <w:szCs w:val="22"/>
                 <w:lang w:eastAsia="id-ID"/>
               </w:rPr>
               <w:t>Þ</w:t>
             </w:r>
             <w:r>
               <w:rPr>
-                <w:rFonts w:ascii="Times New Roman" w:hAnsi="Times New Roman"/>
-                <w:b/>
-                <w:sz w:val="24"/>
-                <w:szCs w:val="24"/>
+                <w:rFonts w:ascii="Calibri" w:hAnsi="Calibri"/>
+                <w:b/>
+                <w:sz w:val="22"/>
+                <w:szCs w:val="22"/>
                 <w:lang w:eastAsia="id-ID"/>
               </w:rPr>
               <w:t xml:space="preserve"> Sub-CPMK</w:t>
@@ -1937,10 +1937,10 @@
             <w:pPr>
               <w:jc w:val="both"/>
               <w:rPr>
-                <w:rFonts w:ascii="Times New Roman" w:hAnsi="Times New Roman"/>
+                <w:rFonts w:ascii="Calibri" w:hAnsi="Calibri"/>
                 <w:bCs/>
-                <w:sz w:val="24"/>
-                <w:szCs w:val="24"/>
+                <w:sz w:val="22"/>
+                <w:szCs w:val="22"/>
                 <w:lang w:eastAsia="id-ID"/>
               </w:rPr>
             </w:pPr>
@@ -1963,10 +1963,10 @@
           <w:p>
             <w:pPr>
               <w:rPr>
-                <w:rFonts w:ascii="Times New Roman" w:hAnsi="Times New Roman"/>
-                <w:b/>
-                <w:sz w:val="24"/>
-                <w:szCs w:val="24"/>
+                <w:rFonts w:ascii="Calibri" w:hAnsi="Calibri"/>
+                <w:b/>
+                <w:sz w:val="22"/>
+                <w:szCs w:val="22"/>
               </w:rPr>
             </w:pPr>
           </w:p>
@@ -1985,19 +1985,19 @@
           <w:p>
             <w:pPr>
               <w:rPr>
-                <w:rFonts w:ascii="Times New Roman" w:hAnsi="Times New Roman"/>
+                <w:rFonts w:ascii="Calibri" w:hAnsi="Calibri"/>
                 <w:bCs/>
-                <w:sz w:val="24"/>
-                <w:szCs w:val="24"/>
+                <w:sz w:val="22"/>
+                <w:szCs w:val="22"/>
                 <w:lang w:eastAsia="id-ID"/>
               </w:rPr>
             </w:pPr>
             <w:r>
               <w:rPr>
-                <w:rFonts w:ascii="Times New Roman" w:hAnsi="Times New Roman"/>
+                <w:rFonts w:ascii="Calibri" w:hAnsi="Calibri"/>
                 <w:bCs/>
-                <w:sz w:val="24"/>
-                <w:szCs w:val="24"/>
+                <w:sz w:val="22"/>
+                <w:szCs w:val="22"/>
                 <w:lang w:eastAsia="id-ID"/>
               </w:rPr>
               <w:t>{#sub_</w:t>
@@ -2005,10 +2005,10 @@
             <w:proofErr w:type="gramStart"/>
             <w:r>
               <w:rPr>
-                <w:rFonts w:ascii="Times New Roman" w:hAnsi="Times New Roman"/>
+                <w:rFonts w:ascii="Calibri" w:hAnsi="Calibri"/>
                 <w:bCs/>
-                <w:sz w:val="24"/>
-                <w:szCs w:val="24"/>
+                <w:sz w:val="22"/>
+                <w:szCs w:val="22"/>
                 <w:lang w:eastAsia="id-ID"/>
               </w:rPr>
               <w:t>cpmk}{</w:t>
@@ -2016,10 +2016,10 @@
             <w:proofErr w:type="gramEnd"/>
             <w:r>
               <w:rPr>
-                <w:rFonts w:ascii="Times New Roman" w:hAnsi="Times New Roman"/>
+                <w:rFonts w:ascii="Calibri" w:hAnsi="Calibri"/>
                 <w:bCs/>
-                <w:sz w:val="24"/>
-                <w:szCs w:val="24"/>
+                <w:sz w:val="22"/>
+                <w:szCs w:val="22"/>
                 <w:lang w:eastAsia="id-ID"/>
               </w:rPr>
               <w:t>cpmkId}</w:t>
@@ -2041,27 +2041,27 @@
           <w:p>
             <w:pPr>
               <w:rPr>
-                <w:rFonts w:ascii="Times New Roman" w:hAnsi="Times New Roman"/>
-                <w:sz w:val="24"/>
-                <w:szCs w:val="24"/>
+                <w:rFonts w:ascii="Calibri" w:hAnsi="Calibri"/>
+                <w:sz w:val="22"/>
+                <w:szCs w:val="22"/>
               </w:rPr>
             </w:pPr>
             <w:r>
               <w:rPr>
-                <w:rFonts w:ascii="Times New Roman" w:hAnsi="Times New Roman"/>
+                <w:rFonts w:ascii="Calibri" w:hAnsi="Calibri"/>
                 <w:bCs/>
-                <w:sz w:val="24"/>
-                <w:szCs w:val="24"/>
+                <w:sz w:val="22"/>
+                <w:szCs w:val="22"/>
               </w:rPr>
               <w:t>Sub-</w:t>
             </w:r>
             <w:proofErr w:type="gramStart"/>
             <w:r>
               <w:rPr>
-                <w:rFonts w:ascii="Times New Roman" w:hAnsi="Times New Roman"/>
+                <w:rFonts w:ascii="Calibri" w:hAnsi="Calibri"/>
                 <w:bCs/>
-                <w:sz w:val="24"/>
-                <w:szCs w:val="24"/>
+                <w:sz w:val="22"/>
+                <w:szCs w:val="22"/>
               </w:rPr>
               <w:t>CPMK{</w:t>
             </w:r>
@@ -2069,10 +2069,10 @@
             <w:proofErr w:type="gramEnd"/>
             <w:r>
               <w:rPr>
-                <w:rFonts w:ascii="Times New Roman" w:hAnsi="Times New Roman"/>
+                <w:rFonts w:ascii="Calibri" w:hAnsi="Calibri"/>
                 <w:bCs/>
-                <w:sz w:val="24"/>
-                <w:szCs w:val="24"/>
+                <w:sz w:val="22"/>
+                <w:szCs w:val="22"/>
               </w:rPr>
               <w:t>subId</w:t>
             </w:r>
@@ -2080,49 +2080,49 @@
             <w:proofErr w:type="gramStart"/>
             <w:r>
               <w:rPr>
-                <w:rFonts w:ascii="Times New Roman" w:hAnsi="Times New Roman"/>
+                <w:rFonts w:ascii="Calibri" w:hAnsi="Calibri"/>
                 <w:bCs/>
-                <w:sz w:val="24"/>
-                <w:szCs w:val="24"/>
+                <w:sz w:val="22"/>
+                <w:szCs w:val="22"/>
               </w:rPr>
               <w:t>} :</w:t>
             </w:r>
             <w:proofErr w:type="gramEnd"/>
             <w:r>
               <w:rPr>
-                <w:rFonts w:ascii="Times New Roman" w:hAnsi="Times New Roman"/>
+                <w:rFonts w:ascii="Calibri" w:hAnsi="Calibri"/>
                 <w:bCs/>
-                <w:sz w:val="24"/>
-                <w:szCs w:val="24"/>
+                <w:sz w:val="22"/>
+                <w:szCs w:val="22"/>
               </w:rPr>
               <w:t xml:space="preserve"> {</w:t>
             </w:r>
             <w:proofErr w:type="spellStart"/>
             <w:r>
               <w:rPr>
-                <w:rFonts w:ascii="Times New Roman" w:hAnsi="Times New Roman"/>
+                <w:rFonts w:ascii="Calibri" w:hAnsi="Calibri"/>
                 <w:bCs/>
-                <w:sz w:val="24"/>
-                <w:szCs w:val="24"/>
+                <w:sz w:val="22"/>
+                <w:szCs w:val="22"/>
               </w:rPr>
               <w:t>deskripsi</w:t>
             </w:r>
             <w:proofErr w:type="spellEnd"/>
             <w:r>
               <w:rPr>
-                <w:rFonts w:ascii="Times New Roman" w:hAnsi="Times New Roman"/>
+                <w:rFonts w:ascii="Calibri" w:hAnsi="Calibri"/>
                 <w:bCs/>
-                <w:sz w:val="24"/>
-                <w:szCs w:val="24"/>
+                <w:sz w:val="22"/>
+                <w:szCs w:val="22"/>
               </w:rPr>
               <w:t>}</w:t>
             </w:r>
             <w:r>
               <w:rPr>
-                <w:rFonts w:ascii="Times New Roman" w:hAnsi="Times New Roman"/>
+                <w:rFonts w:ascii="Calibri" w:hAnsi="Calibri"/>
                 <w:bCs/>
-                <w:sz w:val="24"/>
-                <w:szCs w:val="24"/>
+                <w:sz w:val="22"/>
+                <w:szCs w:val="22"/>
                 <w:lang w:val="id-ID" w:bidi="id-ID"/>
               </w:rPr>
               <w:t>{/sub_cpmk}</w:t>
@@ -2146,10 +2146,10 @@
           <w:p>
             <w:pPr>
               <w:rPr>
-                <w:rFonts w:ascii="Times New Roman" w:hAnsi="Times New Roman"/>
-                <w:b/>
-                <w:sz w:val="24"/>
-                <w:szCs w:val="24"/>
+                <w:rFonts w:ascii="Calibri" w:hAnsi="Calibri"/>
+                <w:b/>
+                <w:sz w:val="22"/>
+                <w:szCs w:val="22"/>
               </w:rPr>
             </w:pPr>
           </w:p>
@@ -2170,20 +2170,20 @@
             <w:pPr>
               <w:jc w:val="both"/>
               <w:rPr>
-                <w:rFonts w:ascii="Times New Roman" w:hAnsi="Times New Roman"/>
-                <w:b/>
-                <w:sz w:val="24"/>
-                <w:szCs w:val="24"/>
+                <w:rFonts w:ascii="Calibri" w:hAnsi="Calibri"/>
+                <w:b/>
+                <w:sz w:val="22"/>
+                <w:szCs w:val="22"/>
                 <w:lang w:val="es-ES" w:eastAsia="id-ID"/>
               </w:rPr>
             </w:pPr>
             <w:proofErr w:type="spellStart"/>
             <w:r>
               <w:rPr>
-                <w:rFonts w:ascii="Times New Roman" w:hAnsi="Times New Roman"/>
-                <w:b/>
-                <w:sz w:val="24"/>
-                <w:szCs w:val="24"/>
+                <w:rFonts w:ascii="Calibri" w:hAnsi="Calibri"/>
+                <w:b/>
+                <w:sz w:val="22"/>
+                <w:szCs w:val="22"/>
                 <w:lang w:val="es-ES" w:eastAsia="id-ID"/>
               </w:rPr>
               <w:t>Korelasi</w:t>
@@ -2191,10 +2191,10 @@
             <w:proofErr w:type="spellEnd"/>
             <w:r>
               <w:rPr>
-                <w:rFonts w:ascii="Times New Roman" w:hAnsi="Times New Roman"/>
-                <w:b/>
-                <w:sz w:val="24"/>
-                <w:szCs w:val="24"/>
+                <w:rFonts w:ascii="Calibri" w:hAnsi="Calibri"/>
+                <w:b/>
+                <w:sz w:val="22"/>
+                <w:szCs w:val="22"/>
                 <w:lang w:val="es-ES" w:eastAsia="id-ID"/>
               </w:rPr>
               <w:t xml:space="preserve"> antara CP dan </w:t>
@@ -2202,10 +2202,10 @@
             <w:proofErr w:type="spellStart"/>
             <w:r>
               <w:rPr>
-                <w:rFonts w:ascii="Times New Roman" w:hAnsi="Times New Roman"/>
-                <w:b/>
-                <w:sz w:val="24"/>
-                <w:szCs w:val="24"/>
+                <w:rFonts w:ascii="Calibri" w:hAnsi="Calibri"/>
+                <w:b/>
+                <w:sz w:val="22"/>
+                <w:szCs w:val="22"/>
                 <w:lang w:val="es-ES" w:eastAsia="id-ID"/>
               </w:rPr>
               <w:t>asesmen</w:t>
@@ -2228,10 +2228,10 @@
             <w:pPr>
               <w:jc w:val="both"/>
               <w:rPr>
-                <w:rFonts w:ascii="Times New Roman" w:hAnsi="Times New Roman"/>
+                <w:rFonts w:ascii="Calibri" w:hAnsi="Calibri"/>
                 <w:bCs/>
-                <w:sz w:val="24"/>
-                <w:szCs w:val="24"/>
+                <w:sz w:val="22"/>
+                <w:szCs w:val="22"/>
                 <w:lang w:val="es-ES" w:eastAsia="id-ID"/>
               </w:rPr>
             </w:pPr>
@@ -2254,10 +2254,10 @@
           <w:p>
             <w:pPr>
               <w:rPr>
-                <w:rFonts w:ascii="Times New Roman" w:hAnsi="Times New Roman"/>
-                <w:b/>
-                <w:sz w:val="24"/>
-                <w:szCs w:val="24"/>
+                <w:rFonts w:ascii="Calibri" w:hAnsi="Calibri"/>
+                <w:b/>
+                <w:sz w:val="22"/>
+                <w:szCs w:val="22"/>
                 <w:lang w:val="es-ES"/>
               </w:rPr>
             </w:pPr>
@@ -2310,19 +2310,19 @@
                   <w:pPr>
                     <w:jc w:val="center"/>
                     <w:rPr>
-                      <w:rFonts w:ascii="Times New Roman" w:hAnsi="Times New Roman"/>
+                      <w:rFonts w:ascii="Calibri" w:hAnsi="Calibri"/>
                       <w:b/>
-                      <w:sz w:val="24"/>
-                      <w:szCs w:val="24"/>
+                      <w:sz w:val="22"/>
+                      <w:szCs w:val="22"/>
                       <w:lang w:val="fi-FI" w:eastAsia="id-ID"/>
                     </w:rPr>
                   </w:pPr>
                   <w:r>
                     <w:rPr>
-                      <w:rFonts w:ascii="Times New Roman" w:hAnsi="Times New Roman"/>
+                      <w:rFonts w:ascii="Calibri" w:hAnsi="Calibri"/>
                       <w:b/>
-                      <w:sz w:val="24"/>
-                      <w:szCs w:val="24"/>
+                      <w:sz w:val="22"/>
+                      <w:szCs w:val="22"/>
                       <w:lang w:val="fi-FI" w:eastAsia="id-ID"/>
                     </w:rPr>
                     <w:t>CPL</w:t>
@@ -2339,19 +2339,19 @@
                   <w:pPr>
                     <w:jc w:val="center"/>
                     <w:rPr>
-                      <w:rFonts w:ascii="Times New Roman" w:hAnsi="Times New Roman"/>
+                      <w:rFonts w:ascii="Calibri" w:hAnsi="Calibri"/>
                       <w:b/>
-                      <w:sz w:val="24"/>
-                      <w:szCs w:val="24"/>
+                      <w:sz w:val="22"/>
+                      <w:szCs w:val="22"/>
                       <w:lang w:eastAsia="id-ID"/>
                     </w:rPr>
                   </w:pPr>
                   <w:r>
                     <w:rPr>
-                      <w:rFonts w:ascii="Times New Roman" w:hAnsi="Times New Roman"/>
+                      <w:rFonts w:ascii="Calibri" w:hAnsi="Calibri"/>
                       <w:b/>
-                      <w:sz w:val="24"/>
-                      <w:szCs w:val="24"/>
+                      <w:sz w:val="22"/>
+                      <w:szCs w:val="22"/>
                       <w:lang w:eastAsia="id-ID"/>
                     </w:rPr>
                     <w:t>CPMK</w:t>
@@ -2368,19 +2368,19 @@
                   <w:pPr>
                     <w:jc w:val="center"/>
                     <w:rPr>
-                      <w:rFonts w:ascii="Times New Roman" w:hAnsi="Times New Roman"/>
+                      <w:rFonts w:ascii="Calibri" w:hAnsi="Calibri"/>
                       <w:b/>
-                      <w:sz w:val="24"/>
-                      <w:szCs w:val="24"/>
+                      <w:sz w:val="22"/>
+                      <w:szCs w:val="22"/>
                       <w:lang w:eastAsia="id-ID"/>
                     </w:rPr>
                   </w:pPr>
                   <w:r>
                     <w:rPr>
-                      <w:rFonts w:ascii="Times New Roman" w:hAnsi="Times New Roman"/>
+                      <w:rFonts w:ascii="Calibri" w:hAnsi="Calibri"/>
                       <w:b/>
-                      <w:sz w:val="24"/>
-                      <w:szCs w:val="24"/>
+                      <w:sz w:val="22"/>
+                      <w:szCs w:val="22"/>
                       <w:lang w:eastAsia="id-ID"/>
                     </w:rPr>
                     <w:t>Sub-CPMK</w:t>
@@ -2397,19 +2397,19 @@
                   <w:pPr>
                     <w:jc w:val="center"/>
                     <w:rPr>
-                      <w:rFonts w:ascii="Times New Roman" w:hAnsi="Times New Roman"/>
+                      <w:rFonts w:ascii="Calibri" w:hAnsi="Calibri"/>
                       <w:b/>
-                      <w:sz w:val="24"/>
-                      <w:szCs w:val="24"/>
+                      <w:sz w:val="22"/>
+                      <w:szCs w:val="22"/>
                       <w:lang w:eastAsia="id-ID"/>
                     </w:rPr>
                   </w:pPr>
                   <w:r>
                     <w:rPr>
-                      <w:rFonts w:ascii="Times New Roman" w:hAnsi="Times New Roman"/>
+                      <w:rFonts w:ascii="Calibri" w:hAnsi="Calibri"/>
                       <w:b/>
-                      <w:sz w:val="24"/>
-                      <w:szCs w:val="24"/>
+                      <w:sz w:val="22"/>
+                      <w:szCs w:val="22"/>
                       <w:lang w:eastAsia="id-ID"/>
                     </w:rPr>
                     <w:t xml:space="preserve">Metode </w:t>
@@ -2417,10 +2417,10 @@
                   <w:proofErr w:type="spellStart"/>
                   <w:r>
                     <w:rPr>
-                      <w:rFonts w:ascii="Times New Roman" w:hAnsi="Times New Roman"/>
+                      <w:rFonts w:ascii="Calibri" w:hAnsi="Calibri"/>
                       <w:b/>
-                      <w:sz w:val="24"/>
-                      <w:szCs w:val="24"/>
+                      <w:sz w:val="22"/>
+                      <w:szCs w:val="22"/>
                       <w:lang w:eastAsia="id-ID"/>
                     </w:rPr>
                     <w:t>Pembelajaran</w:t>
@@ -2438,19 +2438,19 @@
                   <w:pPr>
                     <w:jc w:val="center"/>
                     <w:rPr>
-                      <w:rFonts w:ascii="Times New Roman" w:hAnsi="Times New Roman"/>
+                      <w:rFonts w:ascii="Calibri" w:hAnsi="Calibri"/>
                       <w:b/>
-                      <w:sz w:val="24"/>
-                      <w:szCs w:val="24"/>
+                      <w:sz w:val="22"/>
+                      <w:szCs w:val="22"/>
                       <w:lang w:eastAsia="id-ID"/>
                     </w:rPr>
                   </w:pPr>
                   <w:r>
                     <w:rPr>
-                      <w:rFonts w:ascii="Times New Roman" w:hAnsi="Times New Roman"/>
+                      <w:rFonts w:ascii="Calibri" w:hAnsi="Calibri"/>
                       <w:b/>
-                      <w:sz w:val="24"/>
-                      <w:szCs w:val="24"/>
+                      <w:sz w:val="22"/>
+                      <w:szCs w:val="22"/>
                       <w:lang w:eastAsia="id-ID"/>
                     </w:rPr>
                     <w:t>BENTUK ASESMEN</w:t>
@@ -2467,20 +2467,20 @@
                   <w:pPr>
                     <w:jc w:val="center"/>
                     <w:rPr>
-                      <w:rFonts w:ascii="Times New Roman" w:hAnsi="Times New Roman"/>
+                      <w:rFonts w:ascii="Calibri" w:hAnsi="Calibri"/>
                       <w:b/>
-                      <w:sz w:val="24"/>
-                      <w:szCs w:val="24"/>
+                      <w:sz w:val="22"/>
+                      <w:szCs w:val="22"/>
                       <w:lang w:eastAsia="id-ID"/>
                     </w:rPr>
                   </w:pPr>
                   <w:proofErr w:type="spellStart"/>
                   <w:r>
                     <w:rPr>
-                      <w:rFonts w:ascii="Times New Roman" w:hAnsi="Times New Roman"/>
+                      <w:rFonts w:ascii="Calibri" w:hAnsi="Calibri"/>
                       <w:b/>
-                      <w:sz w:val="24"/>
-                      <w:szCs w:val="24"/>
+                      <w:sz w:val="22"/>
+                      <w:szCs w:val="22"/>
                       <w:lang w:eastAsia="id-ID"/>
                     </w:rPr>
                     <w:t>Bobot</w:t>
@@ -2488,10 +2488,10 @@
                   <w:proofErr w:type="spellEnd"/>
                   <w:r>
                     <w:rPr>
-                      <w:rFonts w:ascii="Times New Roman" w:hAnsi="Times New Roman"/>
+                      <w:rFonts w:ascii="Calibri" w:hAnsi="Calibri"/>
                       <w:b/>
-                      <w:sz w:val="24"/>
-                      <w:szCs w:val="24"/>
+                      <w:sz w:val="22"/>
+                      <w:szCs w:val="22"/>
                       <w:lang w:eastAsia="id-ID"/>
                     </w:rPr>
                     <w:t xml:space="preserve"> </w:t>
@@ -2499,10 +2499,10 @@
                   <w:proofErr w:type="spellStart"/>
                   <w:r>
                     <w:rPr>
-                      <w:rFonts w:ascii="Times New Roman" w:hAnsi="Times New Roman"/>
+                      <w:rFonts w:ascii="Calibri" w:hAnsi="Calibri"/>
                       <w:b/>
-                      <w:sz w:val="24"/>
-                      <w:szCs w:val="24"/>
+                      <w:sz w:val="22"/>
+                      <w:szCs w:val="22"/>
                       <w:lang w:eastAsia="id-ID"/>
                     </w:rPr>
                     <w:t>penilaian</w:t>
@@ -2510,10 +2510,10 @@
                   <w:proofErr w:type="spellEnd"/>
                   <w:r>
                     <w:rPr>
-                      <w:rFonts w:ascii="Times New Roman" w:hAnsi="Times New Roman"/>
+                      <w:rFonts w:ascii="Calibri" w:hAnsi="Calibri"/>
                       <w:b/>
-                      <w:sz w:val="24"/>
-                      <w:szCs w:val="24"/>
+                      <w:sz w:val="22"/>
+                      <w:szCs w:val="22"/>
                       <w:lang w:eastAsia="id-ID"/>
                     </w:rPr>
                     <w:t xml:space="preserve"> (%)</w:t>
@@ -2535,10 +2535,10 @@
                   <w:pPr>
                     <w:jc w:val="both"/>
                     <w:rPr>
-                      <w:rFonts w:ascii="Times New Roman" w:hAnsi="Times New Roman"/>
+                      <w:rFonts w:ascii="Calibri" w:hAnsi="Calibri"/>
                       <w:bCs/>
-                      <w:sz w:val="24"/>
-                      <w:szCs w:val="24"/>
+                      <w:sz w:val="22"/>
+                      <w:szCs w:val="22"/>
                       <w:lang w:val="fi-FI" w:eastAsia="id-ID"/>
                     </w:rPr>
                   </w:pPr>
@@ -2553,10 +2553,10 @@
                   <w:pPr>
                     <w:jc w:val="center"/>
                     <w:rPr>
-                      <w:rFonts w:ascii="Times New Roman" w:hAnsi="Times New Roman"/>
+                      <w:rFonts w:ascii="Calibri" w:hAnsi="Calibri"/>
                       <w:b/>
-                      <w:sz w:val="24"/>
-                      <w:szCs w:val="24"/>
+                      <w:sz w:val="22"/>
+                      <w:szCs w:val="22"/>
                       <w:lang w:eastAsia="id-ID"/>
                     </w:rPr>
                   </w:pPr>
@@ -2571,10 +2571,10 @@
                   <w:pPr>
                     <w:jc w:val="center"/>
                     <w:rPr>
-                      <w:rFonts w:ascii="Times New Roman" w:hAnsi="Times New Roman"/>
+                      <w:rFonts w:ascii="Calibri" w:hAnsi="Calibri"/>
                       <w:b/>
-                      <w:sz w:val="24"/>
-                      <w:szCs w:val="24"/>
+                      <w:sz w:val="22"/>
+                      <w:szCs w:val="22"/>
                       <w:lang w:eastAsia="id-ID"/>
                     </w:rPr>
                   </w:pPr>
@@ -2590,10 +2590,10 @@
                   <w:pPr>
                     <w:jc w:val="center"/>
                     <w:rPr>
-                      <w:rFonts w:ascii="Times New Roman" w:hAnsi="Times New Roman"/>
+                      <w:rFonts w:ascii="Calibri" w:hAnsi="Calibri"/>
                       <w:b/>
-                      <w:sz w:val="24"/>
-                      <w:szCs w:val="24"/>
+                      <w:sz w:val="22"/>
+                      <w:szCs w:val="22"/>
                       <w:lang w:eastAsia="id-ID"/>
                     </w:rPr>
                   </w:pPr>
@@ -2609,19 +2609,19 @@
                   <w:pPr>
                     <w:jc w:val="center"/>
                     <w:rPr>
-                      <w:rFonts w:ascii="Times New Roman" w:hAnsi="Times New Roman"/>
+                      <w:rFonts w:ascii="Calibri" w:hAnsi="Calibri"/>
                       <w:b/>
-                      <w:sz w:val="24"/>
-                      <w:szCs w:val="24"/>
+                      <w:sz w:val="22"/>
+                      <w:szCs w:val="22"/>
                       <w:lang w:eastAsia="id-ID"/>
                     </w:rPr>
                   </w:pPr>
                   <w:r>
                     <w:rPr>
-                      <w:rFonts w:ascii="Times New Roman" w:hAnsi="Times New Roman"/>
+                      <w:rFonts w:ascii="Calibri" w:hAnsi="Calibri"/>
                       <w:b/>
-                      <w:sz w:val="24"/>
-                      <w:szCs w:val="24"/>
+                      <w:sz w:val="22"/>
+                      <w:szCs w:val="22"/>
                       <w:lang w:eastAsia="id-ID"/>
                     </w:rPr>
                     <w:t>FORMATIF</w:t>
@@ -2637,19 +2637,19 @@
                   <w:pPr>
                     <w:jc w:val="center"/>
                     <w:rPr>
-                      <w:rFonts w:ascii="Times New Roman" w:hAnsi="Times New Roman"/>
+                      <w:rFonts w:ascii="Calibri" w:hAnsi="Calibri"/>
                       <w:b/>
-                      <w:sz w:val="24"/>
-                      <w:szCs w:val="24"/>
+                      <w:sz w:val="22"/>
+                      <w:szCs w:val="22"/>
                       <w:lang w:eastAsia="id-ID"/>
                     </w:rPr>
                   </w:pPr>
                   <w:r>
                     <w:rPr>
-                      <w:rFonts w:ascii="Times New Roman" w:hAnsi="Times New Roman"/>
+                      <w:rFonts w:ascii="Calibri" w:hAnsi="Calibri"/>
                       <w:b/>
-                      <w:sz w:val="24"/>
-                      <w:szCs w:val="24"/>
+                      <w:sz w:val="22"/>
+                      <w:szCs w:val="22"/>
                       <w:lang w:eastAsia="id-ID"/>
                     </w:rPr>
                     <w:t>SUMATIF</w:t>
@@ -2665,10 +2665,10 @@
                   <w:pPr>
                     <w:jc w:val="center"/>
                     <w:rPr>
-                      <w:rFonts w:ascii="Times New Roman" w:hAnsi="Times New Roman"/>
+                      <w:rFonts w:ascii="Calibri" w:hAnsi="Calibri"/>
                       <w:b/>
-                      <w:sz w:val="24"/>
-                      <w:szCs w:val="24"/>
+                      <w:sz w:val="22"/>
+                      <w:szCs w:val="22"/>
                       <w:lang w:eastAsia="id-ID"/>
                     </w:rPr>
                   </w:pPr>
@@ -2688,10 +2688,10 @@
                   <w:pPr>
                     <w:jc w:val="both"/>
                     <w:rPr>
-                      <w:rFonts w:ascii="Times New Roman" w:hAnsi="Times New Roman"/>
+                      <w:rFonts w:ascii="Calibri" w:hAnsi="Calibri"/>
                       <w:b/>
-                      <w:sz w:val="24"/>
-                      <w:szCs w:val="24"/>
+                      <w:sz w:val="22"/>
+                      <w:szCs w:val="22"/>
                       <w:lang w:eastAsia="id-ID"/>
                     </w:rPr>
                   </w:pPr>
@@ -2706,10 +2706,10 @@
                   <w:pPr>
                     <w:jc w:val="center"/>
                     <w:rPr>
-                      <w:rFonts w:ascii="Times New Roman" w:hAnsi="Times New Roman"/>
+                      <w:rFonts w:ascii="Calibri" w:hAnsi="Calibri"/>
                       <w:b/>
-                      <w:sz w:val="24"/>
-                      <w:szCs w:val="24"/>
+                      <w:sz w:val="22"/>
+                      <w:szCs w:val="22"/>
                       <w:lang w:eastAsia="id-ID"/>
                     </w:rPr>
                   </w:pPr>
@@ -2724,10 +2724,10 @@
                   <w:pPr>
                     <w:jc w:val="center"/>
                     <w:rPr>
-                      <w:rFonts w:ascii="Times New Roman" w:hAnsi="Times New Roman"/>
+                      <w:rFonts w:ascii="Calibri" w:hAnsi="Calibri"/>
                       <w:b/>
-                      <w:sz w:val="24"/>
-                      <w:szCs w:val="24"/>
+                      <w:sz w:val="22"/>
+                      <w:szCs w:val="22"/>
                       <w:lang w:eastAsia="id-ID"/>
                     </w:rPr>
                   </w:pPr>
@@ -2742,10 +2742,10 @@
                   <w:pPr>
                     <w:jc w:val="both"/>
                     <w:rPr>
-                      <w:rFonts w:ascii="Times New Roman" w:hAnsi="Times New Roman"/>
+                      <w:rFonts w:ascii="Calibri" w:hAnsi="Calibri"/>
                       <w:bCs/>
-                      <w:sz w:val="24"/>
-                      <w:szCs w:val="24"/>
+                      <w:sz w:val="22"/>
+                      <w:szCs w:val="22"/>
                       <w:lang w:eastAsia="id-ID"/>
                     </w:rPr>
                   </w:pPr>
@@ -2760,10 +2760,10 @@
                   <w:pPr>
                     <w:jc w:val="both"/>
                     <w:rPr>
-                      <w:rFonts w:ascii="Times New Roman" w:hAnsi="Times New Roman"/>
+                      <w:rFonts w:ascii="Calibri" w:hAnsi="Calibri"/>
                       <w:bCs/>
-                      <w:sz w:val="24"/>
-                      <w:szCs w:val="24"/>
+                      <w:sz w:val="22"/>
+                      <w:szCs w:val="22"/>
                       <w:lang w:eastAsia="id-ID"/>
                     </w:rPr>
                   </w:pPr>
@@ -2777,20 +2777,20 @@
                   <w:pPr>
                     <w:jc w:val="center"/>
                     <w:rPr>
-                      <w:rFonts w:ascii="Times New Roman" w:hAnsi="Times New Roman"/>
+                      <w:rFonts w:ascii="Calibri" w:hAnsi="Calibri"/>
                       <w:b/>
-                      <w:sz w:val="24"/>
-                      <w:szCs w:val="24"/>
+                      <w:sz w:val="22"/>
+                      <w:szCs w:val="22"/>
                       <w:lang w:eastAsia="id-ID"/>
                     </w:rPr>
                   </w:pPr>
                   <w:proofErr w:type="spellStart"/>
                   <w:r>
                     <w:rPr>
-                      <w:rFonts w:ascii="Times New Roman" w:hAnsi="Times New Roman"/>
+                      <w:rFonts w:ascii="Calibri" w:hAnsi="Calibri"/>
                       <w:b/>
-                      <w:sz w:val="24"/>
-                      <w:szCs w:val="24"/>
+                      <w:sz w:val="22"/>
+                      <w:szCs w:val="22"/>
                       <w:lang w:eastAsia="id-ID"/>
                     </w:rPr>
                     <w:t>Kuis</w:t>
@@ -2806,20 +2806,20 @@
                   <w:pPr>
                     <w:jc w:val="center"/>
                     <w:rPr>
-                      <w:rFonts w:ascii="Times New Roman" w:hAnsi="Times New Roman"/>
+                      <w:rFonts w:ascii="Calibri" w:hAnsi="Calibri"/>
                       <w:b/>
-                      <w:sz w:val="24"/>
-                      <w:szCs w:val="24"/>
+                      <w:sz w:val="22"/>
+                      <w:szCs w:val="22"/>
                       <w:lang w:eastAsia="id-ID"/>
                     </w:rPr>
                   </w:pPr>
                   <w:proofErr w:type="spellStart"/>
                   <w:r>
                     <w:rPr>
-                      <w:rFonts w:ascii="Times New Roman" w:hAnsi="Times New Roman"/>
+                      <w:rFonts w:ascii="Calibri" w:hAnsi="Calibri"/>
                       <w:b/>
-                      <w:sz w:val="24"/>
-                      <w:szCs w:val="24"/>
+                      <w:sz w:val="22"/>
+                      <w:szCs w:val="22"/>
                       <w:lang w:eastAsia="id-ID"/>
                     </w:rPr>
                     <w:t>Tugas</w:t>
@@ -2835,20 +2835,20 @@
                   <w:pPr>
                     <w:jc w:val="center"/>
                     <w:rPr>
-                      <w:rFonts w:ascii="Times New Roman" w:hAnsi="Times New Roman"/>
+                      <w:rFonts w:ascii="Calibri" w:hAnsi="Calibri"/>
                       <w:b/>
-                      <w:sz w:val="24"/>
-                      <w:szCs w:val="24"/>
+                      <w:sz w:val="22"/>
+                      <w:szCs w:val="22"/>
                       <w:lang w:eastAsia="id-ID"/>
                     </w:rPr>
                   </w:pPr>
                   <w:proofErr w:type="spellStart"/>
                   <w:r>
                     <w:rPr>
-                      <w:rFonts w:ascii="Times New Roman" w:hAnsi="Times New Roman"/>
+                      <w:rFonts w:ascii="Calibri" w:hAnsi="Calibri"/>
                       <w:b/>
-                      <w:sz w:val="24"/>
-                      <w:szCs w:val="24"/>
+                      <w:sz w:val="22"/>
+                      <w:szCs w:val="22"/>
                       <w:lang w:eastAsia="id-ID"/>
                     </w:rPr>
                     <w:t>Ujian</w:t>
@@ -2864,20 +2864,20 @@
                   <w:pPr>
                     <w:jc w:val="center"/>
                     <w:rPr>
-                      <w:rFonts w:ascii="Times New Roman" w:hAnsi="Times New Roman"/>
+                      <w:rFonts w:ascii="Calibri" w:hAnsi="Calibri"/>
                       <w:b/>
-                      <w:sz w:val="24"/>
-                      <w:szCs w:val="24"/>
+                      <w:sz w:val="22"/>
+                      <w:szCs w:val="22"/>
                       <w:lang w:eastAsia="id-ID"/>
                     </w:rPr>
                   </w:pPr>
                   <w:proofErr w:type="spellStart"/>
                   <w:r>
                     <w:rPr>
-                      <w:rFonts w:ascii="Times New Roman" w:hAnsi="Times New Roman"/>
+                      <w:rFonts w:ascii="Calibri" w:hAnsi="Calibri"/>
                       <w:b/>
-                      <w:sz w:val="24"/>
-                      <w:szCs w:val="24"/>
+                      <w:sz w:val="22"/>
+                      <w:szCs w:val="22"/>
                       <w:lang w:eastAsia="id-ID"/>
                     </w:rPr>
                     <w:t>PjBL</w:t>
@@ -2893,20 +2893,20 @@
                   <w:pPr>
                     <w:jc w:val="center"/>
                     <w:rPr>
-                      <w:rFonts w:ascii="Times New Roman" w:hAnsi="Times New Roman"/>
+                      <w:rFonts w:ascii="Calibri" w:hAnsi="Calibri"/>
                       <w:b/>
-                      <w:sz w:val="24"/>
-                      <w:szCs w:val="24"/>
+                      <w:sz w:val="22"/>
+                      <w:szCs w:val="22"/>
                       <w:lang w:eastAsia="id-ID"/>
                     </w:rPr>
                   </w:pPr>
                   <w:proofErr w:type="spellStart"/>
                   <w:r>
                     <w:rPr>
-                      <w:rFonts w:ascii="Times New Roman" w:hAnsi="Times New Roman"/>
+                      <w:rFonts w:ascii="Calibri" w:hAnsi="Calibri"/>
                       <w:b/>
-                      <w:sz w:val="24"/>
-                      <w:szCs w:val="24"/>
+                      <w:sz w:val="22"/>
+                      <w:szCs w:val="22"/>
                       <w:lang w:eastAsia="id-ID"/>
                     </w:rPr>
                     <w:t>Lainnya</w:t>
@@ -2923,10 +2923,10 @@
                   <w:pPr>
                     <w:jc w:val="both"/>
                     <w:rPr>
-                      <w:rFonts w:ascii="Times New Roman" w:hAnsi="Times New Roman"/>
+                      <w:rFonts w:ascii="Calibri" w:hAnsi="Calibri"/>
                       <w:bCs/>
-                      <w:sz w:val="24"/>
-                      <w:szCs w:val="24"/>
+                      <w:sz w:val="22"/>
+                      <w:szCs w:val="22"/>
                       <w:lang w:eastAsia="id-ID"/>
                     </w:rPr>
                   </w:pPr>
@@ -2946,18 +2946,18 @@
                   <w:pPr>
                     <w:jc w:val="center"/>
                     <w:rPr>
-                      <w:rFonts w:ascii="Times New Roman" w:hAnsi="Times New Roman"/>
+                      <w:rFonts w:ascii="Calibri" w:hAnsi="Calibri"/>
                       <w:b/>
-                      <w:sz w:val="24"/>
-                      <w:szCs w:val="24"/>
+                      <w:sz w:val="22"/>
+                      <w:szCs w:val="22"/>
                       <w:lang w:eastAsia="id-ID"/>
                     </w:rPr>
                   </w:pPr>
                   <w:r>
                     <w:rPr>
-                      <w:rFonts w:ascii="Times New Roman" w:hAnsi="Times New Roman"/>
-                      <w:sz w:val="24"/>
-                      <w:szCs w:val="24"/>
+                      <w:rFonts w:ascii="Calibri" w:hAnsi="Calibri"/>
+                      <w:sz w:val="22"/>
+                      <w:szCs w:val="22"/>
                       <w:lang w:eastAsia="id-ID"/>
                     </w:rPr>
                     <w:t>{#sub_</w:t>
@@ -2965,9 +2965,9 @@
                   <w:proofErr w:type="gramStart"/>
                   <w:r>
                     <w:rPr>
-                      <w:rFonts w:ascii="Times New Roman" w:hAnsi="Times New Roman"/>
-                      <w:sz w:val="24"/>
-                      <w:szCs w:val="24"/>
+                      <w:rFonts w:ascii="Calibri" w:hAnsi="Calibri"/>
+                      <w:sz w:val="22"/>
+                      <w:szCs w:val="22"/>
                       <w:lang w:eastAsia="id-ID"/>
                     </w:rPr>
                     <w:t>cpmk}{</w:t>
@@ -2975,9 +2975,9 @@
                   <w:proofErr w:type="gramEnd"/>
                   <w:r>
                     <w:rPr>
-                      <w:rFonts w:ascii="Times New Roman" w:hAnsi="Times New Roman"/>
-                      <w:sz w:val="24"/>
-                      <w:szCs w:val="24"/>
+                      <w:rFonts w:ascii="Calibri" w:hAnsi="Calibri"/>
+                      <w:sz w:val="22"/>
+                      <w:szCs w:val="22"/>
                       <w:lang w:eastAsia="id-ID"/>
                     </w:rPr>
                     <w:t>cpl}</w:t>
@@ -2993,18 +2993,18 @@
                   <w:pPr>
                     <w:jc w:val="center"/>
                     <w:rPr>
-                      <w:rFonts w:ascii="Times New Roman" w:hAnsi="Times New Roman"/>
+                      <w:rFonts w:ascii="Calibri" w:hAnsi="Calibri"/>
                       <w:b/>
-                      <w:sz w:val="24"/>
-                      <w:szCs w:val="24"/>
+                      <w:sz w:val="22"/>
+                      <w:szCs w:val="22"/>
                       <w:lang w:eastAsia="id-ID"/>
                     </w:rPr>
                   </w:pPr>
                   <w:r>
                     <w:rPr>
-                      <w:rFonts w:ascii="Times New Roman" w:hAnsi="Times New Roman"/>
-                      <w:sz w:val="24"/>
-                      <w:szCs w:val="24"/>
+                      <w:rFonts w:ascii="Calibri" w:hAnsi="Calibri"/>
+                      <w:sz w:val="22"/>
+                      <w:szCs w:val="22"/>
                       <w:lang w:eastAsia="id-ID"/>
                     </w:rPr>
                     <w:t>{</w:t>
@@ -3012,9 +3012,9 @@
                   <w:proofErr w:type="spellStart"/>
                   <w:r>
                     <w:rPr>
-                      <w:rFonts w:ascii="Times New Roman" w:hAnsi="Times New Roman"/>
-                      <w:sz w:val="24"/>
-                      <w:szCs w:val="24"/>
+                      <w:rFonts w:ascii="Calibri" w:hAnsi="Calibri"/>
+                      <w:sz w:val="22"/>
+                      <w:szCs w:val="22"/>
                       <w:lang w:eastAsia="id-ID"/>
                     </w:rPr>
                     <w:t>cpmkId</w:t>
@@ -3022,9 +3022,9 @@
                   <w:proofErr w:type="spellEnd"/>
                   <w:r>
                     <w:rPr>
-                      <w:rFonts w:ascii="Times New Roman" w:hAnsi="Times New Roman"/>
-                      <w:sz w:val="24"/>
-                      <w:szCs w:val="24"/>
+                      <w:rFonts w:ascii="Calibri" w:hAnsi="Calibri"/>
+                      <w:sz w:val="22"/>
+                      <w:szCs w:val="22"/>
                       <w:lang w:eastAsia="id-ID"/>
                     </w:rPr>
                     <w:t>}</w:t>
@@ -3040,18 +3040,18 @@
                   <w:pPr>
                     <w:jc w:val="center"/>
                     <w:rPr>
-                      <w:rFonts w:ascii="Times New Roman" w:hAnsi="Times New Roman"/>
+                      <w:rFonts w:ascii="Calibri" w:hAnsi="Calibri"/>
                       <w:b/>
-                      <w:sz w:val="24"/>
-                      <w:szCs w:val="24"/>
+                      <w:sz w:val="22"/>
+                      <w:szCs w:val="22"/>
                       <w:lang w:eastAsia="id-ID"/>
                     </w:rPr>
                   </w:pPr>
                   <w:r>
                     <w:rPr>
-                      <w:rFonts w:ascii="Times New Roman" w:hAnsi="Times New Roman"/>
-                      <w:sz w:val="24"/>
-                      <w:szCs w:val="24"/>
+                      <w:rFonts w:ascii="Calibri" w:hAnsi="Calibri"/>
+                      <w:sz w:val="22"/>
+                      <w:szCs w:val="22"/>
                       <w:lang w:eastAsia="id-ID"/>
                     </w:rPr>
                     <w:t>Sub-</w:t>
@@ -3059,9 +3059,9 @@
                   <w:proofErr w:type="gramStart"/>
                   <w:r>
                     <w:rPr>
-                      <w:rFonts w:ascii="Times New Roman" w:hAnsi="Times New Roman"/>
-                      <w:sz w:val="24"/>
-                      <w:szCs w:val="24"/>
+                      <w:rFonts w:ascii="Calibri" w:hAnsi="Calibri"/>
+                      <w:sz w:val="22"/>
+                      <w:szCs w:val="22"/>
                       <w:lang w:eastAsia="id-ID"/>
                     </w:rPr>
                     <w:t>CPMK{</w:t>
@@ -3070,9 +3070,9 @@
                   <w:proofErr w:type="gramEnd"/>
                   <w:r>
                     <w:rPr>
-                      <w:rFonts w:ascii="Times New Roman" w:hAnsi="Times New Roman"/>
-                      <w:sz w:val="24"/>
-                      <w:szCs w:val="24"/>
+                      <w:rFonts w:ascii="Calibri" w:hAnsi="Calibri"/>
+                      <w:sz w:val="22"/>
+                      <w:szCs w:val="22"/>
                       <w:lang w:eastAsia="id-ID"/>
                     </w:rPr>
                     <w:t>subId</w:t>
@@ -3080,9 +3080,9 @@
                   <w:proofErr w:type="spellEnd"/>
                   <w:r>
                     <w:rPr>
-                      <w:rFonts w:ascii="Times New Roman" w:hAnsi="Times New Roman"/>
-                      <w:sz w:val="24"/>
-                      <w:szCs w:val="24"/>
+                      <w:rFonts w:ascii="Calibri" w:hAnsi="Calibri"/>
+                      <w:sz w:val="22"/>
+                      <w:szCs w:val="22"/>
                       <w:lang w:eastAsia="id-ID"/>
                     </w:rPr>
                     <w:t>}</w:t>
@@ -3097,18 +3097,18 @@
                 <w:p>
                   <w:pPr>
                     <w:rPr>
-                      <w:rFonts w:ascii="Times New Roman" w:hAnsi="Times New Roman"/>
+                      <w:rFonts w:ascii="Calibri" w:hAnsi="Calibri"/>
                       <w:bCs/>
-                      <w:sz w:val="24"/>
-                      <w:szCs w:val="24"/>
+                      <w:sz w:val="22"/>
+                      <w:szCs w:val="22"/>
                       <w:lang w:eastAsia="id-ID"/>
                     </w:rPr>
                   </w:pPr>
                   <w:r>
                     <w:rPr>
-                      <w:rFonts w:ascii="Times New Roman" w:hAnsi="Times New Roman"/>
-                      <w:sz w:val="24"/>
-                      <w:szCs w:val="24"/>
+                      <w:rFonts w:ascii="Calibri" w:hAnsi="Calibri"/>
+                      <w:sz w:val="22"/>
+                      <w:szCs w:val="22"/>
                       <w:lang w:eastAsia="id-ID"/>
                     </w:rPr>
                     <w:t>{bentuk_pembelajaran}</w:t>
@@ -3124,18 +3124,18 @@
                   <w:pPr>
                     <w:jc w:val="center"/>
                     <w:rPr>
-                      <w:rFonts w:ascii="Times New Roman" w:hAnsi="Times New Roman"/>
+                      <w:rFonts w:ascii="Calibri" w:hAnsi="Calibri"/>
                       <w:bCs/>
-                      <w:sz w:val="24"/>
-                      <w:szCs w:val="24"/>
+                      <w:sz w:val="22"/>
+                      <w:szCs w:val="22"/>
                       <w:lang w:eastAsia="id-ID"/>
                     </w:rPr>
                   </w:pPr>
                   <w:r>
                     <w:rPr>
-                      <w:rFonts w:ascii="Times New Roman" w:hAnsi="Times New Roman"/>
-                      <w:sz w:val="24"/>
-                      <w:szCs w:val="24"/>
+                      <w:rFonts w:ascii="Calibri" w:hAnsi="Calibri"/>
+                      <w:sz w:val="22"/>
+                      <w:szCs w:val="22"/>
                       <w:lang w:eastAsia="id-ID"/>
                     </w:rPr>
                     <w:t>{</w:t>
@@ -3143,9 +3143,9 @@
                   <w:proofErr w:type="spellStart"/>
                   <w:r>
                     <w:rPr>
-                      <w:rFonts w:ascii="Times New Roman" w:hAnsi="Times New Roman"/>
-                      <w:sz w:val="24"/>
-                      <w:szCs w:val="24"/>
+                      <w:rFonts w:ascii="Calibri" w:hAnsi="Calibri"/>
+                      <w:sz w:val="22"/>
+                      <w:szCs w:val="22"/>
                       <w:lang w:eastAsia="id-ID"/>
                     </w:rPr>
                     <w:t>formatif_nama</w:t>
@@ -3153,9 +3153,9 @@
                   <w:proofErr w:type="spellEnd"/>
                   <w:r>
                     <w:rPr>
-                      <w:rFonts w:ascii="Times New Roman" w:hAnsi="Times New Roman"/>
-                      <w:sz w:val="24"/>
-                      <w:szCs w:val="24"/>
+                      <w:rFonts w:ascii="Calibri" w:hAnsi="Calibri"/>
+                      <w:sz w:val="22"/>
+                      <w:szCs w:val="22"/>
                       <w:lang w:eastAsia="id-ID"/>
                     </w:rPr>
                     <w:t>}</w:t>
@@ -3171,18 +3171,18 @@
                   <w:pPr>
                     <w:jc w:val="center"/>
                     <w:rPr>
-                      <w:rFonts w:ascii="Times New Roman" w:hAnsi="Times New Roman"/>
+                      <w:rFonts w:ascii="Calibri" w:hAnsi="Calibri"/>
                       <w:bCs/>
-                      <w:sz w:val="24"/>
-                      <w:szCs w:val="24"/>
+                      <w:sz w:val="22"/>
+                      <w:szCs w:val="22"/>
                       <w:lang w:eastAsia="id-ID"/>
                     </w:rPr>
                   </w:pPr>
                   <w:r>
                     <w:rPr>
-                      <w:rFonts w:ascii="Times New Roman" w:hAnsi="Times New Roman"/>
-                      <w:sz w:val="24"/>
-                      <w:szCs w:val="24"/>
+                      <w:rFonts w:ascii="Calibri" w:hAnsi="Calibri"/>
+                      <w:sz w:val="22"/>
+                      <w:szCs w:val="22"/>
                       <w:lang w:eastAsia="id-ID"/>
                     </w:rPr>
                     <w:t>{</w:t>
@@ -3190,9 +3190,9 @@
                   <w:proofErr w:type="spellStart"/>
                   <w:r>
                     <w:rPr>
-                      <w:rFonts w:ascii="Times New Roman" w:hAnsi="Times New Roman"/>
-                      <w:sz w:val="24"/>
-                      <w:szCs w:val="24"/>
+                      <w:rFonts w:ascii="Calibri" w:hAnsi="Calibri"/>
+                      <w:sz w:val="22"/>
+                      <w:szCs w:val="22"/>
                       <w:lang w:eastAsia="id-ID"/>
                     </w:rPr>
                     <w:t>kuis_display</w:t>
@@ -3200,9 +3200,9 @@
                   <w:proofErr w:type="spellEnd"/>
                   <w:r>
                     <w:rPr>
-                      <w:rFonts w:ascii="Times New Roman" w:hAnsi="Times New Roman"/>
-                      <w:sz w:val="24"/>
-                      <w:szCs w:val="24"/>
+                      <w:rFonts w:ascii="Calibri" w:hAnsi="Calibri"/>
+                      <w:sz w:val="22"/>
+                      <w:szCs w:val="22"/>
                       <w:lang w:eastAsia="id-ID"/>
                     </w:rPr>
                     <w:t>}</w:t>
@@ -3218,18 +3218,18 @@
                   <w:pPr>
                     <w:jc w:val="center"/>
                     <w:rPr>
-                      <w:rFonts w:ascii="Times New Roman" w:hAnsi="Times New Roman"/>
+                      <w:rFonts w:ascii="Calibri" w:hAnsi="Calibri"/>
                       <w:bCs/>
-                      <w:sz w:val="24"/>
-                      <w:szCs w:val="24"/>
+                      <w:sz w:val="22"/>
+                      <w:szCs w:val="22"/>
                       <w:lang w:eastAsia="id-ID"/>
                     </w:rPr>
                   </w:pPr>
                   <w:r>
                     <w:rPr>
-                      <w:rFonts w:ascii="Times New Roman" w:hAnsi="Times New Roman"/>
-                      <w:sz w:val="24"/>
-                      <w:szCs w:val="24"/>
+                      <w:rFonts w:ascii="Calibri" w:hAnsi="Calibri"/>
+                      <w:sz w:val="22"/>
+                      <w:szCs w:val="22"/>
                       <w:lang w:eastAsia="id-ID"/>
                     </w:rPr>
                     <w:t>{</w:t>
@@ -3237,9 +3237,9 @@
                   <w:proofErr w:type="spellStart"/>
                   <w:r>
                     <w:rPr>
-                      <w:rFonts w:ascii="Times New Roman" w:hAnsi="Times New Roman"/>
-                      <w:sz w:val="24"/>
-                      <w:szCs w:val="24"/>
+                      <w:rFonts w:ascii="Calibri" w:hAnsi="Calibri"/>
+                      <w:sz w:val="22"/>
+                      <w:szCs w:val="22"/>
                       <w:lang w:eastAsia="id-ID"/>
                     </w:rPr>
                     <w:t>tugas_display</w:t>
@@ -3247,9 +3247,9 @@
                   <w:proofErr w:type="spellEnd"/>
                   <w:r>
                     <w:rPr>
-                      <w:rFonts w:ascii="Times New Roman" w:hAnsi="Times New Roman"/>
-                      <w:sz w:val="24"/>
-                      <w:szCs w:val="24"/>
+                      <w:rFonts w:ascii="Calibri" w:hAnsi="Calibri"/>
+                      <w:sz w:val="22"/>
+                      <w:szCs w:val="22"/>
                       <w:lang w:eastAsia="id-ID"/>
                     </w:rPr>
                     <w:t>}</w:t>
@@ -3265,18 +3265,18 @@
                   <w:pPr>
                     <w:jc w:val="center"/>
                     <w:rPr>
-                      <w:rFonts w:ascii="Times New Roman" w:hAnsi="Times New Roman"/>
+                      <w:rFonts w:ascii="Calibri" w:hAnsi="Calibri"/>
                       <w:bCs/>
-                      <w:sz w:val="24"/>
-                      <w:szCs w:val="24"/>
+                      <w:sz w:val="22"/>
+                      <w:szCs w:val="22"/>
                       <w:lang w:eastAsia="id-ID"/>
                     </w:rPr>
                   </w:pPr>
                   <w:r>
                     <w:rPr>
-                      <w:rFonts w:ascii="Times New Roman" w:hAnsi="Times New Roman"/>
-                      <w:sz w:val="24"/>
-                      <w:szCs w:val="24"/>
+                      <w:rFonts w:ascii="Calibri" w:hAnsi="Calibri"/>
+                      <w:sz w:val="22"/>
+                      <w:szCs w:val="22"/>
                       <w:lang w:eastAsia="id-ID"/>
                     </w:rPr>
                     <w:t>{</w:t>
@@ -3284,9 +3284,9 @@
                   <w:proofErr w:type="spellStart"/>
                   <w:r>
                     <w:rPr>
-                      <w:rFonts w:ascii="Times New Roman" w:hAnsi="Times New Roman"/>
-                      <w:sz w:val="24"/>
-                      <w:szCs w:val="24"/>
+                      <w:rFonts w:ascii="Calibri" w:hAnsi="Calibri"/>
+                      <w:sz w:val="22"/>
+                      <w:szCs w:val="22"/>
                       <w:lang w:eastAsia="id-ID"/>
                     </w:rPr>
                     <w:t>ujian_display</w:t>
@@ -3294,9 +3294,9 @@
                   <w:proofErr w:type="spellEnd"/>
                   <w:r>
                     <w:rPr>
-                      <w:rFonts w:ascii="Times New Roman" w:hAnsi="Times New Roman"/>
-                      <w:sz w:val="24"/>
-                      <w:szCs w:val="24"/>
+                      <w:rFonts w:ascii="Calibri" w:hAnsi="Calibri"/>
+                      <w:sz w:val="22"/>
+                      <w:szCs w:val="22"/>
                       <w:lang w:eastAsia="id-ID"/>
                     </w:rPr>
                     <w:t>}</w:t>
@@ -3312,18 +3312,18 @@
                   <w:pPr>
                     <w:jc w:val="center"/>
                     <w:rPr>
-                      <w:rFonts w:ascii="Times New Roman" w:hAnsi="Times New Roman"/>
+                      <w:rFonts w:ascii="Calibri" w:hAnsi="Calibri"/>
                       <w:bCs/>
-                      <w:sz w:val="24"/>
-                      <w:szCs w:val="24"/>
+                      <w:sz w:val="22"/>
+                      <w:szCs w:val="22"/>
                       <w:lang w:eastAsia="id-ID"/>
                     </w:rPr>
                   </w:pPr>
                   <w:r>
                     <w:rPr>
-                      <w:rFonts w:ascii="Times New Roman" w:hAnsi="Times New Roman"/>
-                      <w:sz w:val="24"/>
-                      <w:szCs w:val="24"/>
+                      <w:rFonts w:ascii="Calibri" w:hAnsi="Calibri"/>
+                      <w:sz w:val="22"/>
+                      <w:szCs w:val="22"/>
                       <w:lang w:eastAsia="id-ID"/>
                     </w:rPr>
                     <w:t>{pjbl_display}</w:t>
@@ -3339,18 +3339,18 @@
                   <w:pPr>
                     <w:jc w:val="center"/>
                     <w:rPr>
-                      <w:rFonts w:ascii="Times New Roman" w:hAnsi="Times New Roman"/>
+                      <w:rFonts w:ascii="Calibri" w:hAnsi="Calibri"/>
                       <w:bCs/>
-                      <w:sz w:val="24"/>
-                      <w:szCs w:val="24"/>
+                      <w:sz w:val="22"/>
+                      <w:szCs w:val="22"/>
                       <w:lang w:eastAsia="id-ID"/>
                     </w:rPr>
                   </w:pPr>
                   <w:r>
                     <w:rPr>
-                      <w:rFonts w:ascii="Times New Roman" w:hAnsi="Times New Roman"/>
-                      <w:sz w:val="24"/>
-                      <w:szCs w:val="24"/>
+                      <w:rFonts w:ascii="Calibri" w:hAnsi="Calibri"/>
+                      <w:sz w:val="22"/>
+                      <w:szCs w:val="22"/>
                       <w:lang w:eastAsia="id-ID"/>
                     </w:rPr>
                     <w:t>{lainnya_display}</w:t>
@@ -3366,18 +3366,18 @@
                   <w:pPr>
                     <w:jc w:val="center"/>
                     <w:rPr>
-                      <w:rFonts w:ascii="Times New Roman" w:hAnsi="Times New Roman"/>
+                      <w:rFonts w:ascii="Calibri" w:hAnsi="Calibri"/>
                       <w:bCs/>
-                      <w:sz w:val="24"/>
-                      <w:szCs w:val="24"/>
+                      <w:sz w:val="22"/>
+                      <w:szCs w:val="22"/>
                       <w:lang w:eastAsia="id-ID"/>
                     </w:rPr>
                   </w:pPr>
                   <w:r>
                     <w:rPr>
-                      <w:rFonts w:ascii="Times New Roman" w:hAnsi="Times New Roman"/>
-                      <w:sz w:val="24"/>
-                      <w:szCs w:val="24"/>
+                      <w:rFonts w:ascii="Calibri" w:hAnsi="Calibri"/>
+                      <w:sz w:val="22"/>
+                      <w:szCs w:val="22"/>
                       <w:lang w:eastAsia="id-ID"/>
                     </w:rPr>
                     <w:t>{</w:t>
@@ -3385,9 +3385,9 @@
                   <w:proofErr w:type="spellStart"/>
                   <w:r>
                     <w:rPr>
-                      <w:rFonts w:ascii="Times New Roman" w:hAnsi="Times New Roman"/>
-                      <w:sz w:val="24"/>
-                      <w:szCs w:val="24"/>
+                      <w:rFonts w:ascii="Calibri" w:hAnsi="Calibri"/>
+                      <w:sz w:val="22"/>
+                      <w:szCs w:val="22"/>
                       <w:lang w:eastAsia="id-ID"/>
                     </w:rPr>
                     <w:t>bobot</w:t>
@@ -3395,9 +3395,9 @@
                   <w:proofErr w:type="spellEnd"/>
                   <w:r>
                     <w:rPr>
-                      <w:rFonts w:ascii="Times New Roman" w:hAnsi="Times New Roman"/>
-                      <w:sz w:val="24"/>
-                      <w:szCs w:val="24"/>
+                      <w:rFonts w:ascii="Calibri" w:hAnsi="Calibri"/>
+                      <w:sz w:val="22"/>
+                      <w:szCs w:val="22"/>
                       <w:lang w:eastAsia="id-ID"/>
                     </w:rPr>
                     <w:t>}{/</w:t>
@@ -3405,9 +3405,9 @@
                   <w:proofErr w:type="spellStart"/>
                   <w:r>
                     <w:rPr>
-                      <w:rFonts w:ascii="Times New Roman" w:hAnsi="Times New Roman"/>
-                      <w:sz w:val="24"/>
-                      <w:szCs w:val="24"/>
+                      <w:rFonts w:ascii="Calibri" w:hAnsi="Calibri"/>
+                      <w:sz w:val="22"/>
+                      <w:szCs w:val="22"/>
                       <w:lang w:eastAsia="id-ID"/>
                     </w:rPr>
                     <w:t>sub_cpmk</w:t>
@@ -3415,9 +3415,9 @@
                   <w:proofErr w:type="spellEnd"/>
                   <w:r>
                     <w:rPr>
-                      <w:rFonts w:ascii="Times New Roman" w:hAnsi="Times New Roman"/>
-                      <w:sz w:val="24"/>
-                      <w:szCs w:val="24"/>
+                      <w:rFonts w:ascii="Calibri" w:hAnsi="Calibri"/>
+                      <w:sz w:val="22"/>
+                      <w:szCs w:val="22"/>
                       <w:lang w:eastAsia="id-ID"/>
                     </w:rPr>
                     <w:t>}</w:t>
@@ -3438,10 +3438,10 @@
                   <w:pPr>
                     <w:jc w:val="center"/>
                     <w:rPr>
-                      <w:rFonts w:ascii="Times New Roman" w:hAnsi="Times New Roman"/>
+                      <w:rFonts w:ascii="Calibri" w:hAnsi="Calibri"/>
                       <w:b/>
-                      <w:sz w:val="24"/>
-                      <w:szCs w:val="24"/>
+                      <w:sz w:val="22"/>
+                      <w:szCs w:val="22"/>
                       <w:lang w:eastAsia="id-ID"/>
                     </w:rPr>
                   </w:pPr>
@@ -3456,10 +3456,10 @@
                   <w:pPr>
                     <w:jc w:val="center"/>
                     <w:rPr>
-                      <w:rFonts w:ascii="Times New Roman" w:hAnsi="Times New Roman"/>
+                      <w:rFonts w:ascii="Calibri" w:hAnsi="Calibri"/>
                       <w:b/>
-                      <w:sz w:val="24"/>
-                      <w:szCs w:val="24"/>
+                      <w:sz w:val="22"/>
+                      <w:szCs w:val="22"/>
                       <w:lang w:eastAsia="id-ID"/>
                     </w:rPr>
                   </w:pPr>
@@ -3474,10 +3474,10 @@
                   <w:pPr>
                     <w:jc w:val="center"/>
                     <w:rPr>
-                      <w:rFonts w:ascii="Times New Roman" w:hAnsi="Times New Roman"/>
+                      <w:rFonts w:ascii="Calibri" w:hAnsi="Calibri"/>
                       <w:b/>
-                      <w:sz w:val="24"/>
-                      <w:szCs w:val="24"/>
+                      <w:sz w:val="22"/>
+                      <w:szCs w:val="22"/>
                       <w:lang w:eastAsia="id-ID"/>
                     </w:rPr>
                   </w:pPr>
@@ -3491,10 +3491,10 @@
                 <w:p>
                   <w:pPr>
                     <w:rPr>
-                      <w:rFonts w:ascii="Times New Roman" w:hAnsi="Times New Roman"/>
+                      <w:rFonts w:ascii="Calibri" w:hAnsi="Calibri"/>
                       <w:bCs/>
-                      <w:sz w:val="24"/>
-                      <w:szCs w:val="24"/>
+                      <w:sz w:val="22"/>
+                      <w:szCs w:val="22"/>
                       <w:lang w:eastAsia="id-ID"/>
                     </w:rPr>
                   </w:pPr>
@@ -3509,10 +3509,10 @@
                   <w:pPr>
                     <w:jc w:val="center"/>
                     <w:rPr>
-                      <w:rFonts w:ascii="Times New Roman" w:hAnsi="Times New Roman"/>
+                      <w:rFonts w:ascii="Calibri" w:hAnsi="Calibri"/>
                       <w:bCs/>
-                      <w:sz w:val="24"/>
-                      <w:szCs w:val="24"/>
+                      <w:sz w:val="22"/>
+                      <w:szCs w:val="22"/>
                       <w:lang w:eastAsia="id-ID"/>
                     </w:rPr>
                   </w:pPr>
@@ -3527,10 +3527,10 @@
                   <w:pPr>
                     <w:jc w:val="center"/>
                     <w:rPr>
-                      <w:rFonts w:ascii="Times New Roman" w:hAnsi="Times New Roman"/>
+                      <w:rFonts w:ascii="Calibri" w:hAnsi="Calibri"/>
                       <w:bCs/>
-                      <w:sz w:val="24"/>
-                      <w:szCs w:val="24"/>
+                      <w:sz w:val="22"/>
+                      <w:szCs w:val="22"/>
                       <w:lang w:eastAsia="id-ID"/>
                     </w:rPr>
                   </w:pPr>
@@ -3545,10 +3545,10 @@
                   <w:pPr>
                     <w:jc w:val="center"/>
                     <w:rPr>
-                      <w:rFonts w:ascii="Times New Roman" w:hAnsi="Times New Roman"/>
+                      <w:rFonts w:ascii="Calibri" w:hAnsi="Calibri"/>
                       <w:bCs/>
-                      <w:sz w:val="24"/>
-                      <w:szCs w:val="24"/>
+                      <w:sz w:val="22"/>
+                      <w:szCs w:val="22"/>
                       <w:lang w:eastAsia="id-ID"/>
                     </w:rPr>
                   </w:pPr>
@@ -3563,10 +3563,10 @@
                   <w:pPr>
                     <w:jc w:val="center"/>
                     <w:rPr>
-                      <w:rFonts w:ascii="Times New Roman" w:hAnsi="Times New Roman"/>
+                      <w:rFonts w:ascii="Calibri" w:hAnsi="Calibri"/>
                       <w:bCs/>
-                      <w:sz w:val="24"/>
-                      <w:szCs w:val="24"/>
+                      <w:sz w:val="22"/>
+                      <w:szCs w:val="22"/>
                       <w:lang w:eastAsia="id-ID"/>
                     </w:rPr>
                   </w:pPr>
@@ -3581,10 +3581,10 @@
                   <w:pPr>
                     <w:jc w:val="center"/>
                     <w:rPr>
-                      <w:rFonts w:ascii="Times New Roman" w:hAnsi="Times New Roman"/>
+                      <w:rFonts w:ascii="Calibri" w:hAnsi="Calibri"/>
                       <w:bCs/>
-                      <w:sz w:val="24"/>
-                      <w:szCs w:val="24"/>
+                      <w:sz w:val="22"/>
+                      <w:szCs w:val="22"/>
                       <w:lang w:eastAsia="id-ID"/>
                     </w:rPr>
                   </w:pPr>
@@ -3599,10 +3599,10 @@
                   <w:pPr>
                     <w:jc w:val="center"/>
                     <w:rPr>
-                      <w:rFonts w:ascii="Times New Roman" w:hAnsi="Times New Roman"/>
+                      <w:rFonts w:ascii="Calibri" w:hAnsi="Calibri"/>
                       <w:bCs/>
-                      <w:sz w:val="24"/>
-                      <w:szCs w:val="24"/>
+                      <w:sz w:val="22"/>
+                      <w:szCs w:val="22"/>
                       <w:lang w:eastAsia="id-ID"/>
                     </w:rPr>
                   </w:pPr>
@@ -3617,19 +3617,19 @@
                   <w:pPr>
                     <w:jc w:val="center"/>
                     <w:rPr>
-                      <w:rFonts w:ascii="Times New Roman" w:hAnsi="Times New Roman"/>
+                      <w:rFonts w:ascii="Calibri" w:hAnsi="Calibri"/>
                       <w:b/>
-                      <w:sz w:val="24"/>
-                      <w:szCs w:val="24"/>
+                      <w:sz w:val="22"/>
+                      <w:szCs w:val="22"/>
                       <w:lang w:eastAsia="id-ID"/>
                     </w:rPr>
                   </w:pPr>
                   <w:r>
                     <w:rPr>
-                      <w:rFonts w:ascii="Times New Roman" w:hAnsi="Times New Roman"/>
+                      <w:rFonts w:ascii="Calibri" w:hAnsi="Calibri"/>
                       <w:b/>
-                      <w:sz w:val="24"/>
-                      <w:szCs w:val="24"/>
+                      <w:sz w:val="22"/>
+                      <w:szCs w:val="22"/>
                       <w:lang w:eastAsia="id-ID"/>
                     </w:rPr>
                     <w:t>100</w:t>
@@ -3642,10 +3642,10 @@
             <w:pPr>
               <w:jc w:val="both"/>
               <w:rPr>
-                <w:rFonts w:ascii="Times New Roman" w:hAnsi="Times New Roman"/>
+                <w:rFonts w:ascii="Calibri" w:hAnsi="Calibri"/>
                 <w:bCs/>
-                <w:sz w:val="24"/>
-                <w:szCs w:val="24"/>
+                <w:sz w:val="22"/>
+                <w:szCs w:val="22"/>
                 <w:lang w:eastAsia="id-ID"/>
               </w:rPr>
             </w:pPr>
@@ -3670,18 +3670,18 @@
           <w:p>
             <w:pPr>
               <w:rPr>
-                <w:rFonts w:ascii="Times New Roman" w:hAnsi="Times New Roman"/>
-                <w:b/>
-                <w:sz w:val="24"/>
-                <w:szCs w:val="24"/>
+                <w:rFonts w:ascii="Calibri" w:hAnsi="Calibri"/>
+                <w:b/>
+                <w:sz w:val="22"/>
+                <w:szCs w:val="22"/>
               </w:rPr>
             </w:pPr>
             <w:r>
               <w:rPr>
-                <w:rFonts w:ascii="Times New Roman" w:hAnsi="Times New Roman"/>
-                <w:b/>
-                <w:sz w:val="24"/>
-                <w:szCs w:val="24"/>
+                <w:rFonts w:ascii="Calibri" w:hAnsi="Calibri"/>
+                <w:b/>
+                <w:sz w:val="22"/>
+                <w:szCs w:val="22"/>
                 <w:lang w:val="id-ID"/>
               </w:rPr>
               <w:lastRenderedPageBreak/>
@@ -3689,10 +3689,10 @@
             </w:r>
             <w:r>
               <w:rPr>
-                <w:rFonts w:ascii="Times New Roman" w:hAnsi="Times New Roman"/>
-                <w:b/>
-                <w:sz w:val="24"/>
-                <w:szCs w:val="24"/>
+                <w:rFonts w:ascii="Calibri" w:hAnsi="Calibri"/>
+                <w:b/>
+                <w:sz w:val="22"/>
+                <w:szCs w:val="22"/>
               </w:rPr>
               <w:t xml:space="preserve"> MK</w:t>
             </w:r>
@@ -3712,34 +3712,34 @@
           <w:p>
             <w:pPr>
               <w:rPr>
-                <w:rFonts w:ascii="Times New Roman" w:hAnsi="Times New Roman"/>
-                <w:sz w:val="24"/>
-                <w:szCs w:val="24"/>
+                <w:rFonts w:ascii="Calibri" w:hAnsi="Calibri"/>
+                <w:sz w:val="22"/>
+                <w:szCs w:val="22"/>
               </w:rPr>
             </w:pPr>
             <w:r>
               <w:rPr>
-                <w:rFonts w:ascii="Times New Roman" w:hAnsi="Times New Roman"/>
-                <w:sz w:val="24"/>
-                <w:szCs w:val="24"/>
+                <w:rFonts w:ascii="Calibri" w:hAnsi="Calibri"/>
+                <w:sz w:val="22"/>
+                <w:szCs w:val="22"/>
               </w:rPr>
               <w:t>{</w:t>
             </w:r>
             <w:proofErr w:type="spellStart"/>
             <w:r>
               <w:rPr>
-                <w:rFonts w:ascii="Times New Roman" w:hAnsi="Times New Roman"/>
-                <w:sz w:val="24"/>
-                <w:szCs w:val="24"/>
+                <w:rFonts w:ascii="Calibri" w:hAnsi="Calibri"/>
+                <w:sz w:val="22"/>
+                <w:szCs w:val="22"/>
               </w:rPr>
               <w:t>deskripsi_singkat_mk</w:t>
             </w:r>
             <w:proofErr w:type="spellEnd"/>
             <w:r>
               <w:rPr>
-                <w:rFonts w:ascii="Times New Roman" w:hAnsi="Times New Roman"/>
-                <w:sz w:val="24"/>
-                <w:szCs w:val="24"/>
+                <w:rFonts w:ascii="Calibri" w:hAnsi="Calibri"/>
+                <w:sz w:val="22"/>
+                <w:szCs w:val="22"/>
               </w:rPr>
               <w:t>}</w:t>
             </w:r>
@@ -3764,28 +3764,28 @@
           <w:p>
             <w:pPr>
               <w:rPr>
-                <w:rFonts w:ascii="Times New Roman" w:hAnsi="Times New Roman"/>
-                <w:b/>
-                <w:sz w:val="24"/>
-                <w:szCs w:val="24"/>
+                <w:rFonts w:ascii="Calibri" w:hAnsi="Calibri"/>
+                <w:b/>
+                <w:sz w:val="22"/>
+                <w:szCs w:val="22"/>
               </w:rPr>
             </w:pPr>
             <w:r>
               <w:rPr>
-                <w:rFonts w:ascii="Times New Roman" w:hAnsi="Times New Roman"/>
-                <w:b/>
-                <w:sz w:val="24"/>
-                <w:szCs w:val="24"/>
+                <w:rFonts w:ascii="Calibri" w:hAnsi="Calibri"/>
+                <w:b/>
+                <w:sz w:val="22"/>
+                <w:szCs w:val="22"/>
               </w:rPr>
               <w:t xml:space="preserve">Materi Kajian / Materi </w:t>
             </w:r>
             <w:proofErr w:type="spellStart"/>
             <w:r>
               <w:rPr>
-                <w:rFonts w:ascii="Times New Roman" w:hAnsi="Times New Roman"/>
-                <w:b/>
-                <w:sz w:val="24"/>
-                <w:szCs w:val="24"/>
+                <w:rFonts w:ascii="Calibri" w:hAnsi="Calibri"/>
+                <w:b/>
+                <w:sz w:val="22"/>
+                <w:szCs w:val="22"/>
               </w:rPr>
               <w:t>Pembelajaran</w:t>
             </w:r>
@@ -3806,34 +3806,34 @@
           <w:p>
             <w:pPr>
               <w:rPr>
-                <w:rFonts w:ascii="Times New Roman" w:hAnsi="Times New Roman"/>
-                <w:sz w:val="24"/>
-                <w:szCs w:val="24"/>
+                <w:rFonts w:ascii="Calibri" w:hAnsi="Calibri"/>
+                <w:sz w:val="22"/>
+                <w:szCs w:val="22"/>
               </w:rPr>
             </w:pPr>
             <w:r>
               <w:rPr>
-                <w:rFonts w:ascii="Times New Roman" w:hAnsi="Times New Roman"/>
-                <w:sz w:val="24"/>
-                <w:szCs w:val="24"/>
+                <w:rFonts w:ascii="Calibri" w:hAnsi="Calibri"/>
+                <w:sz w:val="22"/>
+                <w:szCs w:val="22"/>
               </w:rPr>
               <w:t>{</w:t>
             </w:r>
             <w:proofErr w:type="spellStart"/>
             <w:r>
               <w:rPr>
-                <w:rFonts w:ascii="Times New Roman" w:hAnsi="Times New Roman"/>
-                <w:sz w:val="24"/>
-                <w:szCs w:val="24"/>
+                <w:rFonts w:ascii="Calibri" w:hAnsi="Calibri"/>
+                <w:sz w:val="22"/>
+                <w:szCs w:val="22"/>
               </w:rPr>
               <w:t>materi_kajian</w:t>
             </w:r>
             <w:proofErr w:type="spellEnd"/>
             <w:r>
               <w:rPr>
-                <w:rFonts w:ascii="Times New Roman" w:hAnsi="Times New Roman"/>
-                <w:sz w:val="24"/>
-                <w:szCs w:val="24"/>
+                <w:rFonts w:ascii="Calibri" w:hAnsi="Calibri"/>
+                <w:sz w:val="22"/>
+                <w:szCs w:val="22"/>
               </w:rPr>
               <w:t>}</w:t>
             </w:r>
@@ -3856,19 +3856,19 @@
           <w:p>
             <w:pPr>
               <w:rPr>
-                <w:rFonts w:ascii="Times New Roman" w:hAnsi="Times New Roman"/>
-                <w:b/>
-                <w:sz w:val="24"/>
-                <w:szCs w:val="24"/>
+                <w:rFonts w:ascii="Calibri" w:hAnsi="Calibri"/>
+                <w:b/>
+                <w:sz w:val="22"/>
+                <w:szCs w:val="22"/>
                 <w:lang w:val="id-ID"/>
               </w:rPr>
             </w:pPr>
             <w:r>
               <w:rPr>
-                <w:rFonts w:ascii="Times New Roman" w:hAnsi="Times New Roman"/>
-                <w:b/>
-                <w:sz w:val="24"/>
-                <w:szCs w:val="24"/>
+                <w:rFonts w:ascii="Calibri" w:hAnsi="Calibri"/>
+                <w:b/>
+                <w:sz w:val="22"/>
+                <w:szCs w:val="22"/>
                 <w:lang w:val="id-ID"/>
               </w:rPr>
               <w:t>Pustaka</w:t>
@@ -3891,18 +3891,18 @@
             <w:pPr>
               <w:ind w:left="26"/>
               <w:rPr>
-                <w:rFonts w:ascii="Times New Roman" w:hAnsi="Times New Roman" w:cs="Arial"/>
-                <w:b/>
-                <w:sz w:val="24"/>
-                <w:szCs w:val="24"/>
+                <w:rFonts w:ascii="Calibri" w:hAnsi="Calibri" w:cs="Arial"/>
+                <w:b/>
+                <w:sz w:val="22"/>
+                <w:szCs w:val="22"/>
               </w:rPr>
             </w:pPr>
             <w:r>
               <w:rPr>
-                <w:rFonts w:ascii="Times New Roman" w:hAnsi="Times New Roman" w:cs="Arial"/>
-                <w:b/>
-                <w:sz w:val="24"/>
-                <w:szCs w:val="24"/>
+                <w:rFonts w:ascii="Calibri" w:hAnsi="Calibri" w:cs="Arial"/>
+                <w:b/>
+                <w:sz w:val="22"/>
+                <w:szCs w:val="22"/>
               </w:rPr>
               <w:t>Utama:</w:t>
             </w:r>
@@ -3923,10 +3923,10 @@
             <w:pPr>
               <w:ind w:left="26"/>
               <w:rPr>
-                <w:rFonts w:ascii="Times New Roman" w:hAnsi="Times New Roman" w:cs="Arial"/>
-                <w:b/>
-                <w:sz w:val="24"/>
-                <w:szCs w:val="24"/>
+                <w:rFonts w:ascii="Calibri" w:hAnsi="Calibri" w:cs="Arial"/>
+                <w:b/>
+                <w:sz w:val="22"/>
+                <w:szCs w:val="22"/>
               </w:rPr>
             </w:pPr>
           </w:p>
@@ -3948,10 +3948,10 @@
           <w:p>
             <w:pPr>
               <w:rPr>
-                <w:rFonts w:ascii="Times New Roman" w:hAnsi="Times New Roman"/>
-                <w:b/>
-                <w:sz w:val="24"/>
-                <w:szCs w:val="24"/>
+                <w:rFonts w:ascii="Calibri" w:hAnsi="Calibri"/>
+                <w:b/>
+                <w:sz w:val="22"/>
+                <w:szCs w:val="22"/>
                 <w:lang w:val="id-ID"/>
               </w:rPr>
             </w:pPr>
@@ -4020,10 +4020,10 @@
           <w:p>
             <w:pPr>
               <w:rPr>
-                <w:rFonts w:ascii="Times New Roman" w:hAnsi="Times New Roman"/>
-                <w:b/>
-                <w:sz w:val="24"/>
-                <w:szCs w:val="24"/>
+                <w:rFonts w:ascii="Calibri" w:hAnsi="Calibri"/>
+                <w:b/>
+                <w:sz w:val="22"/>
+                <w:szCs w:val="22"/>
                 <w:lang w:val="id-ID"/>
               </w:rPr>
             </w:pPr>
@@ -4044,31 +4044,31 @@
           <w:p>
             <w:pPr>
               <w:rPr>
-                <w:rFonts w:ascii="Times New Roman" w:hAnsi="Times New Roman"/>
-                <w:sz w:val="24"/>
-                <w:szCs w:val="24"/>
+                <w:rFonts w:ascii="Calibri" w:hAnsi="Calibri"/>
+                <w:sz w:val="22"/>
+                <w:szCs w:val="22"/>
               </w:rPr>
             </w:pPr>
             <w:r>
               <w:rPr>
-                <w:rFonts w:ascii="Times New Roman" w:hAnsi="Times New Roman" w:cs="TimesNewRoman,Italic"/>
+                <w:rFonts w:ascii="Calibri" w:hAnsi="Calibri" w:cs="TimesNewRoman,Italic"/>
                 <w:b/>
                 <w:iCs/>
                 <w:color w:val="000000"/>
-                <w:sz w:val="24"/>
-                <w:szCs w:val="24"/>
+                <w:sz w:val="22"/>
+                <w:szCs w:val="22"/>
                 <w:lang w:val="id-ID"/>
               </w:rPr>
               <w:t>Pendukung</w:t>
             </w:r>
             <w:r>
               <w:rPr>
-                <w:rFonts w:ascii="Times New Roman" w:hAnsi="Times New Roman" w:cs="TimesNewRoman,Italic"/>
+                <w:rFonts w:ascii="Calibri" w:hAnsi="Calibri" w:cs="TimesNewRoman,Italic"/>
                 <w:b/>
                 <w:iCs/>
                 <w:color w:val="000000"/>
-                <w:sz w:val="24"/>
-                <w:szCs w:val="24"/>
+                <w:sz w:val="22"/>
+                <w:szCs w:val="22"/>
               </w:rPr>
               <w:t>:</w:t>
             </w:r>
@@ -4088,9 +4088,9 @@
           <w:p>
             <w:pPr>
               <w:rPr>
-                <w:rFonts w:ascii="Times New Roman" w:hAnsi="Times New Roman"/>
-                <w:sz w:val="24"/>
-                <w:szCs w:val="24"/>
+                <w:rFonts w:ascii="Calibri" w:hAnsi="Calibri"/>
+                <w:sz w:val="22"/>
+                <w:szCs w:val="22"/>
               </w:rPr>
             </w:pPr>
           </w:p>
@@ -4112,10 +4112,10 @@
           <w:p>
             <w:pPr>
               <w:rPr>
-                <w:rFonts w:ascii="Times New Roman" w:hAnsi="Times New Roman"/>
-                <w:b/>
-                <w:sz w:val="24"/>
-                <w:szCs w:val="24"/>
+                <w:rFonts w:ascii="Calibri" w:hAnsi="Calibri"/>
+                <w:b/>
+                <w:sz w:val="22"/>
+                <w:szCs w:val="22"/>
                 <w:lang w:val="id-ID"/>
               </w:rPr>
             </w:pPr>
@@ -4183,28 +4183,28 @@
           <w:p>
             <w:pPr>
               <w:rPr>
-                <w:rFonts w:ascii="Times New Roman" w:hAnsi="Times New Roman"/>
-                <w:b/>
-                <w:sz w:val="24"/>
-                <w:szCs w:val="24"/>
+                <w:rFonts w:ascii="Calibri" w:hAnsi="Calibri"/>
+                <w:b/>
+                <w:sz w:val="22"/>
+                <w:szCs w:val="22"/>
               </w:rPr>
             </w:pPr>
             <w:r>
               <w:rPr>
-                <w:rFonts w:ascii="Times New Roman" w:hAnsi="Times New Roman"/>
-                <w:b/>
-                <w:sz w:val="24"/>
-                <w:szCs w:val="24"/>
+                <w:rFonts w:ascii="Calibri" w:hAnsi="Calibri"/>
+                <w:b/>
+                <w:sz w:val="22"/>
+                <w:szCs w:val="22"/>
               </w:rPr>
               <w:t xml:space="preserve">Dosen </w:t>
             </w:r>
             <w:proofErr w:type="spellStart"/>
             <w:r>
               <w:rPr>
-                <w:rFonts w:ascii="Times New Roman" w:hAnsi="Times New Roman"/>
-                <w:b/>
-                <w:sz w:val="24"/>
-                <w:szCs w:val="24"/>
+                <w:rFonts w:ascii="Calibri" w:hAnsi="Calibri"/>
+                <w:b/>
+                <w:sz w:val="22"/>
+                <w:szCs w:val="22"/>
               </w:rPr>
               <w:t>Pengampu</w:t>
             </w:r>
@@ -4225,42 +4225,42 @@
           <w:p>
             <w:pPr>
               <w:rPr>
-                <w:rFonts w:ascii="Times New Roman" w:hAnsi="Times New Roman"/>
-                <w:sz w:val="24"/>
-                <w:szCs w:val="24"/>
+                <w:rFonts w:ascii="Calibri" w:hAnsi="Calibri"/>
+                <w:sz w:val="22"/>
+                <w:szCs w:val="22"/>
               </w:rPr>
             </w:pPr>
             <w:r>
               <w:rPr>
-                <w:rFonts w:ascii="Times New Roman" w:hAnsi="Times New Roman"/>
-                <w:sz w:val="24"/>
-                <w:szCs w:val="24"/>
+                <w:rFonts w:ascii="Calibri" w:hAnsi="Calibri"/>
+                <w:sz w:val="22"/>
+                <w:szCs w:val="22"/>
                 <w:lang w:val="fi-FI"/>
               </w:rPr>
               <w:t>{</w:t>
             </w:r>
             <w:r>
               <w:rPr>
-                <w:rFonts w:ascii="Times New Roman" w:hAnsi="Times New Roman"/>
-                <w:sz w:val="24"/>
-                <w:szCs w:val="24"/>
+                <w:rFonts w:ascii="Calibri" w:hAnsi="Calibri"/>
+                <w:sz w:val="22"/>
+                <w:szCs w:val="22"/>
               </w:rPr>
               <w:t>#</w:t>
             </w:r>
             <w:r>
               <w:rPr>
-                <w:rFonts w:ascii="Times New Roman" w:hAnsi="Times New Roman"/>
-                <w:sz w:val="24"/>
-                <w:szCs w:val="24"/>
+                <w:rFonts w:ascii="Calibri" w:hAnsi="Calibri"/>
+                <w:sz w:val="22"/>
+                <w:szCs w:val="22"/>
                 <w:lang w:val="fi-FI"/>
               </w:rPr>
               <w:t>dosen_pengampu[]}</w:t>
             </w:r>
             <w:r>
               <w:rPr>
-                <w:rFonts w:ascii="Times New Roman" w:hAnsi="Times New Roman"/>
-                <w:sz w:val="24"/>
-                <w:szCs w:val="24"/>
+                <w:rFonts w:ascii="Calibri" w:hAnsi="Calibri"/>
+                <w:sz w:val="22"/>
+                <w:szCs w:val="22"/>
               </w:rPr>
               <w:t>- {.}</w:t>
             </w:r>
@@ -4268,53 +4268,53 @@
           <w:p>
             <w:pPr>
               <w:rPr>
-                <w:rFonts w:ascii="Times New Roman" w:hAnsi="Times New Roman"/>
-                <w:sz w:val="24"/>
-                <w:szCs w:val="24"/>
+                <w:rFonts w:ascii="Calibri" w:hAnsi="Calibri"/>
+                <w:sz w:val="22"/>
+                <w:szCs w:val="22"/>
                 <w:lang w:val="id-ID"/>
               </w:rPr>
             </w:pPr>
             <w:r>
               <w:rPr>
-                <w:rFonts w:ascii="Times New Roman" w:hAnsi="Times New Roman"/>
-                <w:sz w:val="24"/>
-                <w:szCs w:val="24"/>
+                <w:rFonts w:ascii="Calibri" w:hAnsi="Calibri"/>
+                <w:sz w:val="22"/>
+                <w:szCs w:val="22"/>
               </w:rPr>
               <w:t>{/</w:t>
             </w:r>
             <w:proofErr w:type="spellStart"/>
             <w:r>
               <w:rPr>
-                <w:rFonts w:ascii="Times New Roman" w:hAnsi="Times New Roman"/>
-                <w:sz w:val="24"/>
-                <w:szCs w:val="24"/>
+                <w:rFonts w:ascii="Calibri" w:hAnsi="Calibri"/>
+                <w:sz w:val="22"/>
+                <w:szCs w:val="22"/>
               </w:rPr>
               <w:t>dosen_</w:t>
             </w:r>
             <w:proofErr w:type="gramStart"/>
             <w:r>
               <w:rPr>
-                <w:rFonts w:ascii="Times New Roman" w:hAnsi="Times New Roman"/>
-                <w:sz w:val="24"/>
-                <w:szCs w:val="24"/>
+                <w:rFonts w:ascii="Calibri" w:hAnsi="Calibri"/>
+                <w:sz w:val="22"/>
+                <w:szCs w:val="22"/>
               </w:rPr>
               <w:t>pengampu</w:t>
             </w:r>
             <w:proofErr w:type="spellEnd"/>
             <w:r>
               <w:rPr>
-                <w:rFonts w:ascii="Times New Roman" w:hAnsi="Times New Roman"/>
-                <w:sz w:val="24"/>
-                <w:szCs w:val="24"/>
+                <w:rFonts w:ascii="Calibri" w:hAnsi="Calibri"/>
+                <w:sz w:val="22"/>
+                <w:szCs w:val="22"/>
               </w:rPr>
               <w:t>[</w:t>
             </w:r>
             <w:proofErr w:type="gramEnd"/>
             <w:r>
               <w:rPr>
-                <w:rFonts w:ascii="Times New Roman" w:hAnsi="Times New Roman"/>
-                <w:sz w:val="24"/>
-                <w:szCs w:val="24"/>
+                <w:rFonts w:ascii="Calibri" w:hAnsi="Calibri"/>
+                <w:sz w:val="22"/>
+                <w:szCs w:val="22"/>
               </w:rPr>
               <w:t>]}</w:t>
             </w:r>
@@ -4336,37 +4336,37 @@
           <w:p>
             <w:pPr>
               <w:rPr>
-                <w:rFonts w:ascii="Times New Roman" w:hAnsi="Times New Roman"/>
-                <w:b/>
-                <w:sz w:val="24"/>
-                <w:szCs w:val="24"/>
+                <w:rFonts w:ascii="Calibri" w:hAnsi="Calibri"/>
+                <w:b/>
+                <w:sz w:val="22"/>
+                <w:szCs w:val="22"/>
               </w:rPr>
             </w:pPr>
             <w:r>
               <w:rPr>
-                <w:rFonts w:ascii="Times New Roman" w:hAnsi="Times New Roman"/>
-                <w:b/>
-                <w:sz w:val="24"/>
-                <w:szCs w:val="24"/>
+                <w:rFonts w:ascii="Calibri" w:hAnsi="Calibri"/>
+                <w:b/>
+                <w:sz w:val="22"/>
+                <w:szCs w:val="22"/>
                 <w:lang w:val="id-ID"/>
               </w:rPr>
               <w:t xml:space="preserve">Matakuliah </w:t>
             </w:r>
             <w:r>
               <w:rPr>
-                <w:rFonts w:ascii="Times New Roman" w:hAnsi="Times New Roman"/>
-                <w:b/>
-                <w:sz w:val="24"/>
-                <w:szCs w:val="24"/>
+                <w:rFonts w:ascii="Calibri" w:hAnsi="Calibri"/>
+                <w:b/>
+                <w:sz w:val="22"/>
+                <w:szCs w:val="22"/>
               </w:rPr>
               <w:t>s</w:t>
             </w:r>
             <w:r>
               <w:rPr>
-                <w:rFonts w:ascii="Times New Roman" w:hAnsi="Times New Roman"/>
-                <w:b/>
-                <w:sz w:val="24"/>
-                <w:szCs w:val="24"/>
+                <w:rFonts w:ascii="Calibri" w:hAnsi="Calibri"/>
+                <w:b/>
+                <w:sz w:val="22"/>
+                <w:szCs w:val="22"/>
                 <w:lang w:val="id-ID"/>
               </w:rPr>
               <w:t>yarat</w:t>
@@ -4387,17 +4387,17 @@
           <w:p>
             <w:pPr>
               <w:rPr>
-                <w:rFonts w:ascii="Times New Roman" w:hAnsi="Times New Roman"/>
-                <w:sz w:val="24"/>
-                <w:szCs w:val="24"/>
+                <w:rFonts w:ascii="Calibri" w:hAnsi="Calibri"/>
+                <w:sz w:val="22"/>
+                <w:szCs w:val="22"/>
                 <w:lang w:val="fi-FI"/>
               </w:rPr>
             </w:pPr>
             <w:r>
               <w:rPr>
-                <w:rFonts w:ascii="Times New Roman" w:hAnsi="Times New Roman"/>
-                <w:sz w:val="24"/>
-                <w:szCs w:val="24"/>
+                <w:rFonts w:ascii="Calibri" w:hAnsi="Calibri"/>
+                <w:sz w:val="22"/>
+                <w:szCs w:val="22"/>
                 <w:lang w:val="fi-FI"/>
               </w:rPr>
               <w:t>{mk_syarat}</w:t>
@@ -4427,42 +4427,42 @@
               <w:ind w:left="-90" w:right="-108"/>
               <w:jc w:val="center"/>
               <w:rPr>
-                <w:rFonts w:ascii="Times New Roman" w:hAnsi="Times New Roman"/>
+                <w:rFonts w:ascii="Calibri" w:hAnsi="Calibri"/>
                 <w:b/>
                 <w:bCs/>
-                <w:sz w:val="24"/>
-                <w:szCs w:val="24"/>
+                <w:sz w:val="22"/>
+                <w:szCs w:val="22"/>
                 <w:lang w:val="id-ID"/>
               </w:rPr>
             </w:pPr>
             <w:r>
               <w:rPr>
-                <w:rFonts w:ascii="Times New Roman" w:hAnsi="Times New Roman"/>
+                <w:rFonts w:ascii="Calibri" w:hAnsi="Calibri"/>
                 <w:b/>
                 <w:bCs/>
-                <w:sz w:val="24"/>
-                <w:szCs w:val="24"/>
+                <w:sz w:val="22"/>
+                <w:szCs w:val="22"/>
                 <w:lang w:val="en-GB"/>
               </w:rPr>
               <w:t>Pekan</w:t>
             </w:r>
             <w:r>
               <w:rPr>
-                <w:rFonts w:ascii="Times New Roman" w:hAnsi="Times New Roman"/>
+                <w:rFonts w:ascii="Calibri" w:hAnsi="Calibri"/>
                 <w:b/>
                 <w:bCs/>
-                <w:sz w:val="24"/>
-                <w:szCs w:val="24"/>
+                <w:sz w:val="22"/>
+                <w:szCs w:val="22"/>
               </w:rPr>
               <w:t xml:space="preserve"> </w:t>
             </w:r>
             <w:r>
               <w:rPr>
-                <w:rFonts w:ascii="Times New Roman" w:hAnsi="Times New Roman"/>
+                <w:rFonts w:ascii="Calibri" w:hAnsi="Calibri"/>
                 <w:b/>
                 <w:bCs/>
-                <w:sz w:val="24"/>
-                <w:szCs w:val="24"/>
+                <w:sz w:val="22"/>
+                <w:szCs w:val="22"/>
                 <w:lang w:val="id-ID"/>
               </w:rPr>
               <w:t>Ke-</w:t>
@@ -4487,21 +4487,21 @@
             <w:pPr>
               <w:jc w:val="center"/>
               <w:rPr>
-                <w:rFonts w:ascii="Times New Roman" w:hAnsi="Times New Roman"/>
+                <w:rFonts w:ascii="Calibri" w:hAnsi="Calibri"/>
                 <w:b/>
                 <w:bCs/>
-                <w:sz w:val="24"/>
-                <w:szCs w:val="24"/>
+                <w:sz w:val="22"/>
+                <w:szCs w:val="22"/>
                 <w:lang w:eastAsia="id-ID"/>
               </w:rPr>
             </w:pPr>
             <w:r>
               <w:rPr>
-                <w:rFonts w:ascii="Times New Roman" w:hAnsi="Times New Roman"/>
+                <w:rFonts w:ascii="Calibri" w:hAnsi="Calibri"/>
                 <w:b/>
                 <w:bCs/>
-                <w:sz w:val="24"/>
-                <w:szCs w:val="24"/>
+                <w:sz w:val="22"/>
+                <w:szCs w:val="22"/>
                 <w:lang w:eastAsia="id-ID"/>
               </w:rPr>
               <w:t>CPL</w:t>
@@ -4511,21 +4511,21 @@
             <w:pPr>
               <w:jc w:val="center"/>
               <w:rPr>
-                <w:rFonts w:ascii="Times New Roman" w:hAnsi="Times New Roman"/>
+                <w:rFonts w:ascii="Calibri" w:hAnsi="Calibri"/>
                 <w:b/>
                 <w:bCs/>
-                <w:sz w:val="24"/>
-                <w:szCs w:val="24"/>
+                <w:sz w:val="22"/>
+                <w:szCs w:val="22"/>
                 <w:lang w:eastAsia="id-ID"/>
               </w:rPr>
             </w:pPr>
             <w:r>
               <w:rPr>
-                <w:rFonts w:ascii="Times New Roman" w:hAnsi="Times New Roman"/>
+                <w:rFonts w:ascii="Calibri" w:hAnsi="Calibri"/>
                 <w:b/>
                 <w:bCs/>
-                <w:sz w:val="24"/>
-                <w:szCs w:val="24"/>
+                <w:sz w:val="22"/>
+                <w:szCs w:val="22"/>
                 <w:lang w:eastAsia="id-ID"/>
               </w:rPr>
               <w:t>CPMK</w:t>
@@ -4535,21 +4535,21 @@
             <w:pPr>
               <w:jc w:val="center"/>
               <w:rPr>
-                <w:rFonts w:ascii="Times New Roman" w:hAnsi="Times New Roman"/>
+                <w:rFonts w:ascii="Calibri" w:hAnsi="Calibri"/>
                 <w:b/>
                 <w:bCs/>
-                <w:sz w:val="24"/>
-                <w:szCs w:val="24"/>
+                <w:sz w:val="22"/>
+                <w:szCs w:val="22"/>
                 <w:lang w:eastAsia="id-ID"/>
               </w:rPr>
             </w:pPr>
             <w:r>
               <w:rPr>
-                <w:rFonts w:ascii="Times New Roman" w:hAnsi="Times New Roman"/>
+                <w:rFonts w:ascii="Calibri" w:hAnsi="Calibri"/>
                 <w:b/>
                 <w:bCs/>
-                <w:sz w:val="24"/>
-                <w:szCs w:val="24"/>
+                <w:sz w:val="22"/>
+                <w:szCs w:val="22"/>
                 <w:lang w:eastAsia="id-ID"/>
               </w:rPr>
               <w:t>Sub-CPMK</w:t>
@@ -4573,22 +4573,22 @@
             <w:pPr>
               <w:jc w:val="center"/>
               <w:rPr>
-                <w:rFonts w:ascii="Times New Roman" w:hAnsi="Times New Roman"/>
+                <w:rFonts w:ascii="Calibri" w:hAnsi="Calibri"/>
                 <w:b/>
                 <w:bCs/>
-                <w:sz w:val="24"/>
-                <w:szCs w:val="24"/>
+                <w:sz w:val="22"/>
+                <w:szCs w:val="22"/>
                 <w:lang w:eastAsia="id-ID"/>
               </w:rPr>
             </w:pPr>
             <w:proofErr w:type="spellStart"/>
             <w:r>
               <w:rPr>
-                <w:rFonts w:ascii="Times New Roman" w:hAnsi="Times New Roman"/>
+                <w:rFonts w:ascii="Calibri" w:hAnsi="Calibri"/>
                 <w:b/>
                 <w:bCs/>
-                <w:sz w:val="24"/>
-                <w:szCs w:val="24"/>
+                <w:sz w:val="22"/>
+                <w:szCs w:val="22"/>
                 <w:lang w:eastAsia="id-ID"/>
               </w:rPr>
               <w:t>Penilaian</w:t>
@@ -4613,22 +4613,22 @@
             <w:pPr>
               <w:jc w:val="center"/>
               <w:rPr>
-                <w:rFonts w:ascii="Times New Roman" w:hAnsi="Times New Roman"/>
+                <w:rFonts w:ascii="Calibri" w:hAnsi="Calibri"/>
                 <w:b/>
                 <w:bCs/>
-                <w:sz w:val="24"/>
-                <w:szCs w:val="24"/>
+                <w:sz w:val="22"/>
+                <w:szCs w:val="22"/>
                 <w:lang w:eastAsia="id-ID"/>
               </w:rPr>
             </w:pPr>
             <w:proofErr w:type="spellStart"/>
             <w:r>
               <w:rPr>
-                <w:rFonts w:ascii="Times New Roman" w:hAnsi="Times New Roman"/>
+                <w:rFonts w:ascii="Calibri" w:hAnsi="Calibri"/>
                 <w:b/>
                 <w:bCs/>
-                <w:sz w:val="24"/>
-                <w:szCs w:val="24"/>
+                <w:sz w:val="22"/>
+                <w:szCs w:val="22"/>
                 <w:lang w:eastAsia="id-ID"/>
               </w:rPr>
               <w:t>Bentuk</w:t>
@@ -4636,11 +4636,11 @@
             <w:proofErr w:type="spellEnd"/>
             <w:r>
               <w:rPr>
-                <w:rFonts w:ascii="Times New Roman" w:hAnsi="Times New Roman"/>
+                <w:rFonts w:ascii="Calibri" w:hAnsi="Calibri"/>
                 <w:b/>
                 <w:bCs/>
-                <w:sz w:val="24"/>
-                <w:szCs w:val="24"/>
+                <w:sz w:val="22"/>
+                <w:szCs w:val="22"/>
                 <w:lang w:eastAsia="id-ID"/>
               </w:rPr>
               <w:t xml:space="preserve"> </w:t>
@@ -4648,11 +4648,11 @@
             <w:proofErr w:type="spellStart"/>
             <w:r>
               <w:rPr>
-                <w:rFonts w:ascii="Times New Roman" w:hAnsi="Times New Roman"/>
+                <w:rFonts w:ascii="Calibri" w:hAnsi="Calibri"/>
                 <w:b/>
                 <w:bCs/>
-                <w:sz w:val="24"/>
-                <w:szCs w:val="24"/>
+                <w:sz w:val="22"/>
+                <w:szCs w:val="22"/>
                 <w:lang w:eastAsia="id-ID"/>
               </w:rPr>
               <w:t>Pembelajaran</w:t>
@@ -4660,11 +4660,11 @@
             <w:proofErr w:type="spellEnd"/>
             <w:r>
               <w:rPr>
-                <w:rFonts w:ascii="Times New Roman" w:hAnsi="Times New Roman"/>
+                <w:rFonts w:ascii="Calibri" w:hAnsi="Calibri"/>
                 <w:b/>
                 <w:bCs/>
-                <w:sz w:val="24"/>
-                <w:szCs w:val="24"/>
+                <w:sz w:val="22"/>
+                <w:szCs w:val="22"/>
                 <w:lang w:eastAsia="id-ID"/>
               </w:rPr>
               <w:t xml:space="preserve"> (BP),</w:t>
@@ -4674,32 +4674,32 @@
             <w:pPr>
               <w:jc w:val="center"/>
               <w:rPr>
-                <w:rFonts w:ascii="Times New Roman" w:hAnsi="Times New Roman"/>
+                <w:rFonts w:ascii="Calibri" w:hAnsi="Calibri"/>
                 <w:b/>
                 <w:bCs/>
-                <w:sz w:val="24"/>
-                <w:szCs w:val="24"/>
+                <w:sz w:val="22"/>
+                <w:szCs w:val="22"/>
                 <w:lang w:eastAsia="id-ID"/>
               </w:rPr>
             </w:pPr>
             <w:r>
               <w:rPr>
-                <w:rFonts w:ascii="Times New Roman" w:hAnsi="Times New Roman"/>
+                <w:rFonts w:ascii="Calibri" w:hAnsi="Calibri"/>
                 <w:b/>
                 <w:bCs/>
-                <w:sz w:val="24"/>
-                <w:szCs w:val="24"/>
+                <w:sz w:val="22"/>
+                <w:szCs w:val="22"/>
                 <w:lang w:val="id-ID" w:eastAsia="id-ID"/>
               </w:rPr>
               <w:t>Metode Pembelajaran</w:t>
             </w:r>
             <w:r>
               <w:rPr>
-                <w:rFonts w:ascii="Times New Roman" w:hAnsi="Times New Roman"/>
+                <w:rFonts w:ascii="Calibri" w:hAnsi="Calibri"/>
                 <w:b/>
                 <w:bCs/>
-                <w:sz w:val="24"/>
-                <w:szCs w:val="24"/>
+                <w:sz w:val="22"/>
+                <w:szCs w:val="22"/>
                 <w:lang w:eastAsia="id-ID"/>
               </w:rPr>
               <w:t xml:space="preserve"> (MP),</w:t>
@@ -4724,21 +4724,21 @@
             <w:pPr>
               <w:jc w:val="center"/>
               <w:rPr>
-                <w:rFonts w:ascii="Times New Roman" w:hAnsi="Times New Roman"/>
+                <w:rFonts w:ascii="Calibri" w:hAnsi="Calibri"/>
                 <w:b/>
                 <w:bCs/>
-                <w:sz w:val="24"/>
-                <w:szCs w:val="24"/>
+                <w:sz w:val="22"/>
+                <w:szCs w:val="22"/>
                 <w:lang w:val="id-ID" w:eastAsia="id-ID"/>
               </w:rPr>
             </w:pPr>
             <w:r>
               <w:rPr>
-                <w:rFonts w:ascii="Times New Roman" w:hAnsi="Times New Roman"/>
+                <w:rFonts w:ascii="Calibri" w:hAnsi="Calibri"/>
                 <w:b/>
                 <w:bCs/>
-                <w:sz w:val="24"/>
-                <w:szCs w:val="24"/>
+                <w:sz w:val="22"/>
+                <w:szCs w:val="22"/>
                 <w:lang w:val="id-ID" w:eastAsia="id-ID"/>
               </w:rPr>
               <w:t>Materi Pembelajaran</w:t>
@@ -4748,22 +4748,22 @@
             <w:pPr>
               <w:jc w:val="center"/>
               <w:rPr>
-                <w:rFonts w:ascii="Times New Roman" w:hAnsi="Times New Roman"/>
+                <w:rFonts w:ascii="Calibri" w:hAnsi="Calibri"/>
                 <w:b/>
                 <w:bCs/>
-                <w:sz w:val="24"/>
-                <w:szCs w:val="24"/>
+                <w:sz w:val="22"/>
+                <w:szCs w:val="22"/>
                 <w:lang w:val="id-ID" w:eastAsia="id-ID"/>
               </w:rPr>
             </w:pPr>
             <w:r>
               <w:rPr>
-                <w:rFonts w:ascii="Times New Roman" w:hAnsi="Times New Roman"/>
+                <w:rFonts w:ascii="Calibri" w:hAnsi="Calibri"/>
                 <w:b/>
                 <w:bCs/>
                 <w:color w:val="0000FF"/>
-                <w:sz w:val="24"/>
-                <w:szCs w:val="24"/>
+                <w:sz w:val="22"/>
+                <w:szCs w:val="22"/>
                 <w:lang w:val="id-ID" w:eastAsia="id-ID"/>
               </w:rPr>
               <w:t>[Pustaka]</w:t>
@@ -4787,32 +4787,32 @@
             <w:pPr>
               <w:jc w:val="center"/>
               <w:rPr>
-                <w:rFonts w:ascii="Times New Roman" w:hAnsi="Times New Roman"/>
+                <w:rFonts w:ascii="Calibri" w:hAnsi="Calibri"/>
                 <w:b/>
                 <w:bCs/>
-                <w:sz w:val="24"/>
-                <w:szCs w:val="24"/>
+                <w:sz w:val="22"/>
+                <w:szCs w:val="22"/>
                 <w:lang w:val="id-ID" w:eastAsia="id-ID"/>
               </w:rPr>
             </w:pPr>
             <w:r>
               <w:rPr>
-                <w:rFonts w:ascii="Times New Roman" w:hAnsi="Times New Roman"/>
+                <w:rFonts w:ascii="Calibri" w:hAnsi="Calibri"/>
                 <w:b/>
                 <w:bCs/>
-                <w:sz w:val="24"/>
-                <w:szCs w:val="24"/>
+                <w:sz w:val="22"/>
+                <w:szCs w:val="22"/>
                 <w:lang w:val="id-ID" w:eastAsia="id-ID"/>
               </w:rPr>
               <w:t>Bobot</w:t>
             </w:r>
             <w:r>
               <w:rPr>
-                <w:rFonts w:ascii="Times New Roman" w:hAnsi="Times New Roman"/>
+                <w:rFonts w:ascii="Calibri" w:hAnsi="Calibri"/>
                 <w:b/>
                 <w:bCs/>
-                <w:sz w:val="24"/>
-                <w:szCs w:val="24"/>
+                <w:sz w:val="22"/>
+                <w:szCs w:val="22"/>
                 <w:lang w:eastAsia="id-ID"/>
               </w:rPr>
               <w:t xml:space="preserve"> </w:t>
@@ -4820,11 +4820,11 @@
             <w:proofErr w:type="spellStart"/>
             <w:r>
               <w:rPr>
-                <w:rFonts w:ascii="Times New Roman" w:hAnsi="Times New Roman"/>
+                <w:rFonts w:ascii="Calibri" w:hAnsi="Calibri"/>
                 <w:b/>
                 <w:bCs/>
-                <w:sz w:val="24"/>
-                <w:szCs w:val="24"/>
+                <w:sz w:val="22"/>
+                <w:szCs w:val="22"/>
                 <w:lang w:eastAsia="id-ID"/>
               </w:rPr>
               <w:t>Penilaian</w:t>
@@ -4832,11 +4832,11 @@
             <w:proofErr w:type="spellEnd"/>
             <w:r>
               <w:rPr>
-                <w:rFonts w:ascii="Times New Roman" w:hAnsi="Times New Roman"/>
+                <w:rFonts w:ascii="Calibri" w:hAnsi="Calibri"/>
                 <w:b/>
                 <w:bCs/>
-                <w:sz w:val="24"/>
-                <w:szCs w:val="24"/>
+                <w:sz w:val="22"/>
+                <w:szCs w:val="22"/>
                 <w:lang w:eastAsia="id-ID"/>
               </w:rPr>
               <w:t xml:space="preserve"> (%)</w:t>
@@ -4864,11 +4864,11 @@
             <w:pPr>
               <w:ind w:right="-108"/>
               <w:rPr>
-                <w:rFonts w:ascii="Times New Roman" w:hAnsi="Times New Roman"/>
+                <w:rFonts w:ascii="Calibri" w:hAnsi="Calibri"/>
                 <w:b/>
                 <w:bCs/>
-                <w:sz w:val="24"/>
-                <w:szCs w:val="24"/>
+                <w:sz w:val="22"/>
+                <w:szCs w:val="22"/>
                 <w:lang w:eastAsia="id-ID"/>
               </w:rPr>
             </w:pPr>
@@ -4890,11 +4890,11 @@
           <w:p>
             <w:pPr>
               <w:rPr>
-                <w:rFonts w:ascii="Times New Roman" w:hAnsi="Times New Roman"/>
+                <w:rFonts w:ascii="Calibri" w:hAnsi="Calibri"/>
                 <w:b/>
                 <w:bCs/>
-                <w:sz w:val="24"/>
-                <w:szCs w:val="24"/>
+                <w:sz w:val="22"/>
+                <w:szCs w:val="22"/>
                 <w:lang w:eastAsia="id-ID"/>
               </w:rPr>
             </w:pPr>
@@ -4917,22 +4917,22 @@
             <w:pPr>
               <w:jc w:val="center"/>
               <w:rPr>
-                <w:rFonts w:ascii="Times New Roman" w:hAnsi="Times New Roman"/>
+                <w:rFonts w:ascii="Calibri" w:hAnsi="Calibri"/>
                 <w:b/>
                 <w:bCs/>
-                <w:sz w:val="24"/>
-                <w:szCs w:val="24"/>
+                <w:sz w:val="22"/>
+                <w:szCs w:val="22"/>
                 <w:lang w:eastAsia="id-ID"/>
               </w:rPr>
             </w:pPr>
             <w:proofErr w:type="spellStart"/>
             <w:r>
               <w:rPr>
-                <w:rFonts w:ascii="Times New Roman" w:hAnsi="Times New Roman"/>
+                <w:rFonts w:ascii="Calibri" w:hAnsi="Calibri"/>
                 <w:b/>
                 <w:bCs/>
-                <w:sz w:val="24"/>
-                <w:szCs w:val="24"/>
+                <w:sz w:val="22"/>
+                <w:szCs w:val="22"/>
                 <w:lang w:eastAsia="id-ID"/>
               </w:rPr>
               <w:t>Indikator</w:t>
@@ -4957,21 +4957,21 @@
             <w:pPr>
               <w:jc w:val="center"/>
               <w:rPr>
-                <w:rFonts w:ascii="Times New Roman" w:hAnsi="Times New Roman"/>
+                <w:rFonts w:ascii="Calibri" w:hAnsi="Calibri"/>
                 <w:b/>
                 <w:bCs/>
-                <w:sz w:val="24"/>
-                <w:szCs w:val="24"/>
+                <w:sz w:val="22"/>
+                <w:szCs w:val="22"/>
                 <w:lang w:eastAsia="id-ID"/>
               </w:rPr>
             </w:pPr>
             <w:r>
               <w:rPr>
-                <w:rFonts w:ascii="Times New Roman" w:hAnsi="Times New Roman"/>
+                <w:rFonts w:ascii="Calibri" w:hAnsi="Calibri"/>
                 <w:b/>
                 <w:bCs/>
-                <w:sz w:val="24"/>
-                <w:szCs w:val="24"/>
+                <w:sz w:val="22"/>
+                <w:szCs w:val="22"/>
                 <w:lang w:eastAsia="id-ID"/>
               </w:rPr>
               <w:t xml:space="preserve">Teknik &amp; </w:t>
@@ -4979,11 +4979,11 @@
             <w:proofErr w:type="spellStart"/>
             <w:r>
               <w:rPr>
-                <w:rFonts w:ascii="Times New Roman" w:hAnsi="Times New Roman"/>
+                <w:rFonts w:ascii="Calibri" w:hAnsi="Calibri"/>
                 <w:b/>
                 <w:bCs/>
-                <w:sz w:val="24"/>
-                <w:szCs w:val="24"/>
+                <w:sz w:val="22"/>
+                <w:szCs w:val="22"/>
                 <w:lang w:eastAsia="id-ID"/>
               </w:rPr>
               <w:t>Kriteria</w:t>
@@ -4991,11 +4991,11 @@
             <w:proofErr w:type="spellEnd"/>
             <w:r>
               <w:rPr>
-                <w:rFonts w:ascii="Times New Roman" w:hAnsi="Times New Roman"/>
+                <w:rFonts w:ascii="Calibri" w:hAnsi="Calibri"/>
                 <w:b/>
                 <w:bCs/>
-                <w:sz w:val="24"/>
-                <w:szCs w:val="24"/>
+                <w:sz w:val="22"/>
+                <w:szCs w:val="22"/>
                 <w:lang w:eastAsia="id-ID"/>
               </w:rPr>
               <w:t xml:space="preserve"> </w:t>
@@ -5019,45 +5019,45 @@
             <w:pPr>
               <w:jc w:val="center"/>
               <w:rPr>
-                <w:rFonts w:ascii="Times New Roman" w:hAnsi="Times New Roman"/>
+                <w:rFonts w:ascii="Calibri" w:hAnsi="Calibri"/>
                 <w:b/>
                 <w:bCs/>
-                <w:sz w:val="24"/>
-                <w:szCs w:val="24"/>
+                <w:sz w:val="22"/>
+                <w:szCs w:val="22"/>
                 <w:lang w:eastAsia="id-ID"/>
               </w:rPr>
             </w:pPr>
             <w:r>
               <w:rPr>
-                <w:rFonts w:ascii="Times New Roman" w:hAnsi="Times New Roman"/>
+                <w:rFonts w:ascii="Calibri" w:hAnsi="Calibri"/>
                 <w:b/>
                 <w:bCs/>
-                <w:sz w:val="24"/>
-                <w:szCs w:val="24"/>
+                <w:sz w:val="22"/>
+                <w:szCs w:val="22"/>
                 <w:lang w:eastAsia="id-ID"/>
               </w:rPr>
               <w:t>Luring (</w:t>
             </w:r>
             <w:r>
               <w:rPr>
-                <w:rFonts w:ascii="Times New Roman" w:hAnsi="Times New Roman"/>
+                <w:rFonts w:ascii="Calibri" w:hAnsi="Calibri"/>
                 <w:b/>
                 <w:bCs/>
                 <w:i/>
                 <w:iCs/>
-                <w:sz w:val="24"/>
-                <w:szCs w:val="24"/>
+                <w:sz w:val="22"/>
+                <w:szCs w:val="22"/>
                 <w:lang w:eastAsia="id-ID"/>
               </w:rPr>
               <w:t>offline</w:t>
             </w:r>
             <w:r>
               <w:rPr>
-                <w:rFonts w:ascii="Times New Roman" w:hAnsi="Times New Roman"/>
+                <w:rFonts w:ascii="Calibri" w:hAnsi="Calibri"/>
                 <w:b/>
                 <w:bCs/>
-                <w:sz w:val="24"/>
-                <w:szCs w:val="24"/>
+                <w:sz w:val="22"/>
+                <w:szCs w:val="22"/>
                 <w:lang w:eastAsia="id-ID"/>
               </w:rPr>
               <w:t>)</w:t>
@@ -5081,45 +5081,45 @@
             <w:pPr>
               <w:jc w:val="center"/>
               <w:rPr>
-                <w:rFonts w:ascii="Times New Roman" w:hAnsi="Times New Roman"/>
+                <w:rFonts w:ascii="Calibri" w:hAnsi="Calibri"/>
                 <w:b/>
                 <w:bCs/>
-                <w:sz w:val="24"/>
-                <w:szCs w:val="24"/>
+                <w:sz w:val="22"/>
+                <w:szCs w:val="22"/>
                 <w:lang w:eastAsia="id-ID"/>
               </w:rPr>
             </w:pPr>
             <w:r>
               <w:rPr>
-                <w:rFonts w:ascii="Times New Roman" w:hAnsi="Times New Roman"/>
+                <w:rFonts w:ascii="Calibri" w:hAnsi="Calibri"/>
                 <w:b/>
                 <w:bCs/>
-                <w:sz w:val="24"/>
-                <w:szCs w:val="24"/>
+                <w:sz w:val="22"/>
+                <w:szCs w:val="22"/>
                 <w:lang w:eastAsia="id-ID"/>
               </w:rPr>
               <w:t>Daring (</w:t>
             </w:r>
             <w:r>
               <w:rPr>
-                <w:rFonts w:ascii="Times New Roman" w:hAnsi="Times New Roman"/>
+                <w:rFonts w:ascii="Calibri" w:hAnsi="Calibri"/>
                 <w:b/>
                 <w:bCs/>
                 <w:i/>
                 <w:iCs/>
-                <w:sz w:val="24"/>
-                <w:szCs w:val="24"/>
+                <w:sz w:val="22"/>
+                <w:szCs w:val="22"/>
                 <w:lang w:eastAsia="id-ID"/>
               </w:rPr>
               <w:t>online</w:t>
             </w:r>
             <w:r>
               <w:rPr>
-                <w:rFonts w:ascii="Times New Roman" w:hAnsi="Times New Roman"/>
+                <w:rFonts w:ascii="Calibri" w:hAnsi="Calibri"/>
                 <w:b/>
                 <w:bCs/>
-                <w:sz w:val="24"/>
-                <w:szCs w:val="24"/>
+                <w:sz w:val="22"/>
+                <w:szCs w:val="22"/>
                 <w:lang w:eastAsia="id-ID"/>
               </w:rPr>
               <w:t xml:space="preserve">) </w:t>
@@ -5143,12 +5143,12 @@
             <w:pPr>
               <w:jc w:val="center"/>
               <w:rPr>
-                <w:rFonts w:ascii="Times New Roman" w:hAnsi="Times New Roman"/>
+                <w:rFonts w:ascii="Calibri" w:hAnsi="Calibri"/>
                 <w:b/>
                 <w:bCs/>
                 <w:color w:val="0000FF"/>
-                <w:sz w:val="24"/>
-                <w:szCs w:val="24"/>
+                <w:sz w:val="22"/>
+                <w:szCs w:val="22"/>
                 <w:lang w:val="id-ID" w:eastAsia="id-ID"/>
               </w:rPr>
             </w:pPr>
@@ -5170,11 +5170,11 @@
             <w:pPr>
               <w:jc w:val="center"/>
               <w:rPr>
-                <w:rFonts w:ascii="Times New Roman" w:hAnsi="Times New Roman"/>
+                <w:rFonts w:ascii="Calibri" w:hAnsi="Calibri"/>
                 <w:b/>
                 <w:bCs/>
-                <w:sz w:val="24"/>
-                <w:szCs w:val="24"/>
+                <w:sz w:val="22"/>
+                <w:szCs w:val="22"/>
                 <w:lang w:eastAsia="id-ID"/>
               </w:rPr>
             </w:pPr>
@@ -5201,20 +5201,20 @@
               <w:ind w:left="-90" w:right="-108"/>
               <w:jc w:val="center"/>
               <w:rPr>
-                <w:rFonts w:ascii="Times New Roman" w:hAnsi="Times New Roman"/>
+                <w:rFonts w:ascii="Calibri" w:hAnsi="Calibri"/>
                 <w:b/>
                 <w:bCs/>
-                <w:sz w:val="24"/>
-                <w:szCs w:val="24"/>
+                <w:sz w:val="22"/>
+                <w:szCs w:val="22"/>
               </w:rPr>
             </w:pPr>
             <w:r>
               <w:rPr>
-                <w:rFonts w:ascii="Times New Roman" w:hAnsi="Times New Roman"/>
+                <w:rFonts w:ascii="Calibri" w:hAnsi="Calibri"/>
                 <w:b/>
                 <w:bCs/>
-                <w:sz w:val="24"/>
-                <w:szCs w:val="24"/>
+                <w:sz w:val="22"/>
+                <w:szCs w:val="22"/>
               </w:rPr>
               <w:t>(1)</w:t>
             </w:r>
@@ -5236,21 +5236,21 @@
             <w:pPr>
               <w:jc w:val="center"/>
               <w:rPr>
-                <w:rFonts w:ascii="Times New Roman" w:hAnsi="Times New Roman"/>
+                <w:rFonts w:ascii="Calibri" w:hAnsi="Calibri"/>
                 <w:b/>
                 <w:bCs/>
-                <w:sz w:val="24"/>
-                <w:szCs w:val="24"/>
+                <w:sz w:val="22"/>
+                <w:szCs w:val="22"/>
                 <w:lang w:eastAsia="id-ID"/>
               </w:rPr>
             </w:pPr>
             <w:r>
               <w:rPr>
-                <w:rFonts w:ascii="Times New Roman" w:hAnsi="Times New Roman"/>
+                <w:rFonts w:ascii="Calibri" w:hAnsi="Calibri"/>
                 <w:b/>
                 <w:bCs/>
-                <w:sz w:val="24"/>
-                <w:szCs w:val="24"/>
+                <w:sz w:val="22"/>
+                <w:szCs w:val="22"/>
                 <w:lang w:eastAsia="id-ID"/>
               </w:rPr>
               <w:t>(2)</w:t>
@@ -5273,21 +5273,21 @@
             <w:pPr>
               <w:jc w:val="center"/>
               <w:rPr>
-                <w:rFonts w:ascii="Times New Roman" w:hAnsi="Times New Roman"/>
+                <w:rFonts w:ascii="Calibri" w:hAnsi="Calibri"/>
                 <w:b/>
                 <w:bCs/>
-                <w:sz w:val="24"/>
-                <w:szCs w:val="24"/>
+                <w:sz w:val="22"/>
+                <w:szCs w:val="22"/>
                 <w:lang w:eastAsia="id-ID"/>
               </w:rPr>
             </w:pPr>
             <w:r>
               <w:rPr>
-                <w:rFonts w:ascii="Times New Roman" w:hAnsi="Times New Roman"/>
+                <w:rFonts w:ascii="Calibri" w:hAnsi="Calibri"/>
                 <w:b/>
                 <w:bCs/>
-                <w:sz w:val="24"/>
-                <w:szCs w:val="24"/>
+                <w:sz w:val="22"/>
+                <w:szCs w:val="22"/>
                 <w:lang w:eastAsia="id-ID"/>
               </w:rPr>
               <w:t>(3)</w:t>
@@ -5310,21 +5310,21 @@
             <w:pPr>
               <w:jc w:val="center"/>
               <w:rPr>
-                <w:rFonts w:ascii="Times New Roman" w:hAnsi="Times New Roman"/>
+                <w:rFonts w:ascii="Calibri" w:hAnsi="Calibri"/>
                 <w:b/>
                 <w:bCs/>
-                <w:sz w:val="24"/>
-                <w:szCs w:val="24"/>
+                <w:sz w:val="22"/>
+                <w:szCs w:val="22"/>
                 <w:lang w:eastAsia="id-ID"/>
               </w:rPr>
             </w:pPr>
             <w:r>
               <w:rPr>
-                <w:rFonts w:ascii="Times New Roman" w:hAnsi="Times New Roman"/>
+                <w:rFonts w:ascii="Calibri" w:hAnsi="Calibri"/>
                 <w:b/>
                 <w:bCs/>
-                <w:sz w:val="24"/>
-                <w:szCs w:val="24"/>
+                <w:sz w:val="22"/>
+                <w:szCs w:val="22"/>
                 <w:lang w:eastAsia="id-ID"/>
               </w:rPr>
               <w:t>(4)</w:t>
@@ -5347,21 +5347,21 @@
             <w:pPr>
               <w:jc w:val="center"/>
               <w:rPr>
-                <w:rFonts w:ascii="Times New Roman" w:hAnsi="Times New Roman"/>
+                <w:rFonts w:ascii="Calibri" w:hAnsi="Calibri"/>
                 <w:b/>
                 <w:bCs/>
-                <w:sz w:val="24"/>
-                <w:szCs w:val="24"/>
+                <w:sz w:val="22"/>
+                <w:szCs w:val="22"/>
                 <w:lang w:eastAsia="id-ID"/>
               </w:rPr>
             </w:pPr>
             <w:r>
               <w:rPr>
-                <w:rFonts w:ascii="Times New Roman" w:hAnsi="Times New Roman"/>
+                <w:rFonts w:ascii="Calibri" w:hAnsi="Calibri"/>
                 <w:b/>
                 <w:bCs/>
-                <w:sz w:val="24"/>
-                <w:szCs w:val="24"/>
+                <w:sz w:val="22"/>
+                <w:szCs w:val="22"/>
                 <w:lang w:eastAsia="id-ID"/>
               </w:rPr>
               <w:t>(5)</w:t>
@@ -5384,21 +5384,21 @@
             <w:pPr>
               <w:jc w:val="center"/>
               <w:rPr>
-                <w:rFonts w:ascii="Times New Roman" w:hAnsi="Times New Roman"/>
+                <w:rFonts w:ascii="Calibri" w:hAnsi="Calibri"/>
                 <w:b/>
                 <w:bCs/>
-                <w:sz w:val="24"/>
-                <w:szCs w:val="24"/>
+                <w:sz w:val="22"/>
+                <w:szCs w:val="22"/>
                 <w:lang w:eastAsia="id-ID"/>
               </w:rPr>
             </w:pPr>
             <w:r>
               <w:rPr>
-                <w:rFonts w:ascii="Times New Roman" w:hAnsi="Times New Roman"/>
+                <w:rFonts w:ascii="Calibri" w:hAnsi="Calibri"/>
                 <w:b/>
                 <w:bCs/>
-                <w:sz w:val="24"/>
-                <w:szCs w:val="24"/>
+                <w:sz w:val="22"/>
+                <w:szCs w:val="22"/>
                 <w:lang w:eastAsia="id-ID"/>
               </w:rPr>
               <w:t>(6)</w:t>
@@ -5421,21 +5421,21 @@
             <w:pPr>
               <w:jc w:val="center"/>
               <w:rPr>
-                <w:rFonts w:ascii="Times New Roman" w:hAnsi="Times New Roman"/>
+                <w:rFonts w:ascii="Calibri" w:hAnsi="Calibri"/>
                 <w:b/>
                 <w:bCs/>
-                <w:sz w:val="24"/>
-                <w:szCs w:val="24"/>
+                <w:sz w:val="22"/>
+                <w:szCs w:val="22"/>
                 <w:lang w:eastAsia="id-ID"/>
               </w:rPr>
             </w:pPr>
             <w:r>
               <w:rPr>
-                <w:rFonts w:ascii="Times New Roman" w:hAnsi="Times New Roman"/>
+                <w:rFonts w:ascii="Calibri" w:hAnsi="Calibri"/>
                 <w:b/>
                 <w:bCs/>
-                <w:sz w:val="24"/>
-                <w:szCs w:val="24"/>
+                <w:sz w:val="22"/>
+                <w:szCs w:val="22"/>
                 <w:lang w:eastAsia="id-ID"/>
               </w:rPr>
               <w:t>(7)</w:t>
@@ -5457,21 +5457,21 @@
             <w:pPr>
               <w:jc w:val="center"/>
               <w:rPr>
-                <w:rFonts w:ascii="Times New Roman" w:hAnsi="Times New Roman"/>
+                <w:rFonts w:ascii="Calibri" w:hAnsi="Calibri"/>
                 <w:b/>
                 <w:bCs/>
-                <w:sz w:val="24"/>
-                <w:szCs w:val="24"/>
+                <w:sz w:val="22"/>
+                <w:szCs w:val="22"/>
                 <w:lang w:eastAsia="id-ID"/>
               </w:rPr>
             </w:pPr>
             <w:r>
               <w:rPr>
-                <w:rFonts w:ascii="Times New Roman" w:hAnsi="Times New Roman"/>
+                <w:rFonts w:ascii="Calibri" w:hAnsi="Calibri"/>
                 <w:b/>
                 <w:bCs/>
-                <w:sz w:val="24"/>
-                <w:szCs w:val="24"/>
+                <w:sz w:val="22"/>
+                <w:szCs w:val="22"/>
                 <w:lang w:eastAsia="id-ID"/>
               </w:rPr>
               <w:t>(8)</w:t>
@@ -6826,9 +6826,9 @@
   <w:docDefaults>
     <w:rPrDefault>
       <w:rPr>
-        <w:rFonts w:ascii="Times New Roman" w:eastAsia="Times New Roman" w:hAnsi="Times New Roman" w:cs="Times New Roman"/>
-        <w:sz w:val="24"/>
-        <w:szCs w:val="24"/>
+        <w:rFonts w:asciiTheme="minorHAnsi" w:eastAsiaTheme="minorHAnsi" w:hAnsiTheme="minorHAnsi" w:cstheme="minorBidi"/>
+        <w:sz w:val="22"/>
+        <w:szCs w:val="22"/>
         <w:lang w:val="en-ID" w:eastAsia="en-US" w:bidi="ar-SA"/>
         <w14:ligatures w14:val="standardContextual"/>
       </w:rPr>
@@ -7218,8 +7218,8 @@
     <w:qFormat/>
     <w:rPr>
       <w:rFonts w:ascii="Times New Roman" w:eastAsia="Times New Roman" w:hAnsi="Times New Roman" w:cs="Times New Roman"/>
-      <w:sz w:val="24"/>
-      <w:szCs w:val="24"/>
+      <w:sz w:val="20"/>
+      <w:szCs w:val="20"/>
       <w:lang w:val="en-US"/>
       <w14:ligatures w14:val="none"/>
     </w:rPr>

</xml_diff>